<commit_message>
Revise XR-C evidence, state-conditioned generation agenda, and paper assessments
</commit_message>
<xml_diff>
--- a/topics/downloads/aigc-directions.docx
+++ b/topics/downloads/aigc-directions.docx
@@ -79,7 +79,7 @@
         <ns0:pStyle ns0:val="Normal"/>
       </ns0:pPr>
       <ns0:r>
-        <ns0:t xml:space="preserve">Overview：研究事件或机制改变后的后果传播与无关内容保持。已有工作覆盖对象删除、几何编辑、物理仿真条件和数字孪生推理，因此“编辑后果传播”本身已有直接先例。可研究的增量必须落到明确的任务限制、影响范围识别、未见组合或生成执行机制，不能只把删除改称事件编辑。</ns0:t>
+        <ns0:t xml:space="preserve">Overview：事件干预后的选择性生成已有 VOID／GIVE、物理条件生成和 VANS 式对齐等技术先例。状态变化监督、可执行条件和生成反馈可共同改善内部能力；可研究状态接口、训练信号、保持约束或组合泛化的具体增量，并区分已知后果执行与自主后果推断。</ns0:t>
       </ns0:r>
     </ns0:p>
     <ns0:p>
@@ -159,7 +159,7 @@
         <ns0:pStyle ns0:val="Normal"/>
       </ns0:pPr>
       <ns0:r>
-        <ns0:t xml:space="preserve">竞争与可行性边界：最大风险是与 VOID、VideoPhysEdit、CWMDT 的任务重叠，或全部推理由仿真器完成。要分别报告推断端与渲染端收益；不要用“相同 seed”替代环境真值。</ns0:t>
+        <ns0:t xml:space="preserve">竞争与可行性边界：需与 VOID、GIVE、VideoPhysEdit 和 CWMDT 比较适用任务。若后果由仿真器给出，应报告条件执行贡献；自主机制推断另测。相同 seed 不能替代反事实真值，模块组合本身也不自动建立新意。</ns0:t>
       </ns0:r>
     </ns0:p>
     <ns0:p>
@@ -487,23 +487,23 @@
         <ns0:pStyle ns0:val="Normal"/>
       </ns0:pPr>
       <ns0:r>
-        <ns0:t xml:space="preserve">论文已有证据：GIVE 以编辑前后几何条件控制对象变换及次生视觉变化。</ns0:t>
-      </ns0:r>
-    </ns0:p>
-    <ns0:p>
-      <ns0:pPr>
-        <ns0:pStyle ns0:val="Normal"/>
-      </ns0:pPr>
-      <ns0:r>
-        <ns0:t xml:space="preserve">对该方向的支撑：把状态差异映射到可执行的几何条件，检验不同控制接口。</ns0:t>
-      </ns0:r>
-    </ns0:p>
-    <ns0:p>
-      <ns0:pPr>
-        <ns0:pStyle ns0:val="Normal"/>
-      </ns0:pPr>
-      <ns0:r>
-        <ns0:t xml:space="preserve">尚未建立的证据：给定几何变化不等于预测未知事件后果。</ns0:t>
+        <ns0:t xml:space="preserve">论文已有证据：GIVE 用前／后几何条件与配对训练，实现对象变换及未逐像素指定的阴影、反射等效果。</ns0:t>
+      </ns0:r>
+    </ns0:p>
+    <ns0:p>
+      <ns0:pPr>
+        <ns0:pStyle ns0:val="Normal"/>
+      </ns0:pPr>
+      <ns0:r>
+        <ns0:t xml:space="preserve">对该方向的支撑：借用状态变化到视频执行的接口；外部条件和内部学到的次生效果应同时评价。</ns0:t>
+      </ns0:r>
+    </ns0:p>
+    <ns0:p>
+      <ns0:pPr>
+        <ns0:pStyle ns0:val="Normal"/>
+      </ns0:pPr>
+      <ns0:r>
+        <ns0:t xml:space="preserve">尚未建立的证据：给定几何的执行已有贡献；未知机制推断和长链动力学属于尚待验证的扩展。</ns0:t>
       </ns0:r>
     </ns0:p>
     <ns0:p>
@@ -557,23 +557,23 @@
         <ns0:pStyle ns0:val="Normal"/>
       </ns0:pPr>
       <ns0:r>
-        <ns0:t xml:space="preserve">论文已有证据：VANS 预测下一事件并以 Joint-GRPO 对齐事件描述与视频生成。</ns0:t>
-      </ns0:r>
-    </ns0:p>
-    <ns0:p>
-      <ns0:pPr>
-        <ns0:pStyle ns0:val="Normal"/>
-      </ns0:pPr>
-      <ns0:r>
-        <ns0:t xml:space="preserve">对该方向的支撑：提供事件判断与视频执行的分离评测及联合优化参照。</ns0:t>
-      </ns0:r>
-    </ns0:p>
-    <ns0:p>
-      <ns0:pPr>
-        <ns0:pStyle ns0:val="Normal"/>
-      </ns0:pPr>
-      <ns0:r>
-        <ns0:t xml:space="preserve">尚未建立的证据：事实下一事件预测不建立同前缀成对干预的正确性。</ns0:t>
+        <ns0:t xml:space="preserve">论文已有证据：VANS 先固定 VDM 用生成反馈优化 VLM，再固定 VLM 优化 VDM；消融支持分阶段对齐。</ns0:t>
+      </ns0:r>
+    </ns0:p>
+    <ns0:p>
+      <ns0:pPr>
+        <ns0:pStyle ns0:val="Normal"/>
+      </ns0:pPr>
+      <ns0:r>
+        <ns0:t xml:space="preserve">对该方向的支撑：借鉴可训练的推理—生成接口；先稳定状态控制，再用独立状态反馈优化执行。</ns0:t>
+      </ns0:r>
+    </ns0:p>
+    <ns0:p>
+      <ns0:pPr>
+        <ns0:pStyle ns0:val="Normal"/>
+      </ns0:pPr>
+      <ns0:r>
+        <ns0:t xml:space="preserve">尚未建立的证据：任务含假设性问句，但现有指标未独立建立同历史干预下的多步后果与 Keep。</ns0:t>
       </ns0:r>
     </ns0:p>
     <ns0:p>
@@ -627,23 +627,23 @@
         <ns0:pStyle ns0:val="Normal"/>
       </ns0:pPr>
       <ns0:r>
-        <ns0:t xml:space="preserve">论文已有证据：程序性状态反事实覆盖遗漏、乱序和动作前后状态。</ns0:t>
-      </ns0:r>
-    </ns0:p>
-    <ns0:p>
-      <ns0:pPr>
-        <ns0:pStyle ns0:val="Normal"/>
-      </ns0:pPr>
-      <ns0:r>
-        <ns0:t xml:space="preserve">对该方向的支撑：为事件级错误与状态变化标注提供方法参照。</ns0:t>
-      </ns0:r>
-    </ns0:p>
-    <ns0:p>
-      <ns0:pPr>
-        <ns0:pStyle ns0:val="Normal"/>
-      </ns0:pPr>
-      <ns0:r>
-        <ns0:t xml:space="preserve">尚未建立的证据：原工作训练视频表征，未验证该监督能训练因果生成。</ns0:t>
+        <ns0:t xml:space="preserve">论文已有证据：LLM 构造动作前后状态及错误结果等反事实文本，经帧／片段／视频层次训练程序表征。</ns0:t>
+      </ns0:r>
+    </ns0:p>
+    <ns0:p>
+      <ns0:pPr>
+        <ns0:pStyle ns0:val="Normal"/>
+      </ns0:pPr>
+      <ns0:r>
+        <ns0:t xml:space="preserve">对该方向的支撑：状态监督可迁移为结果验证器或生成器关系对齐；需对状态监督与蒸馏分别做消融。</ns0:t>
+      </ns0:r>
+    </ns0:p>
+    <ns0:p>
+      <ns0:pPr>
+        <ns0:pStyle ns0:val="Normal"/>
+      </ns0:pPr>
+      <ns0:r>
+        <ns0:t xml:space="preserve">尚未建立的证据：原工作验证理解表征；反事实文本并非成对生成视频，生成迁移与因果可识别性仍需验证。</ns0:t>
       </ns0:r>
     </ns0:p>
     <ns0:p>
@@ -2865,23 +2865,23 @@
         <ns0:pStyle ns0:val="Normal"/>
       </ns0:pPr>
       <ns0:r>
-        <ns0:t xml:space="preserve">论文已有证据：VANS 用下一事件推断及联合优化连接推理和视频答案。</ns0:t>
-      </ns0:r>
-    </ns0:p>
-    <ns0:p>
-      <ns0:pPr>
-        <ns0:pStyle ns0:val="Normal"/>
-      </ns0:pPr>
-      <ns0:r>
-        <ns0:t xml:space="preserve">对该方向的支撑：分别检查补充 context 是否改变判断，以及判断是否被视频实现。</ns0:t>
-      </ns0:r>
-    </ns0:p>
-    <ns0:p>
-      <ns0:pPr>
-        <ns0:pStyle ns0:val="Normal"/>
-      </ns0:pPr>
-      <ns0:r>
-        <ns0:t xml:space="preserve">尚未建立的证据：不提供最小获取策略；判断正确也不保证视频可靠执行。</ns0:t>
+        <ns0:t xml:space="preserve">论文已有证据：VANS 先固定 VDM 用生成反馈优化 VLM，再固定 VLM 优化 VDM；消融支持分阶段对齐。</ns0:t>
+      </ns0:r>
+    </ns0:p>
+    <ns0:p>
+      <ns0:pPr>
+        <ns0:pStyle ns0:val="Normal"/>
+      </ns0:pPr>
+      <ns0:r>
+        <ns0:t xml:space="preserve">对该方向的支撑：借鉴可训练的推理—生成接口；先稳定状态控制，再用独立状态反馈优化执行。</ns0:t>
+      </ns0:r>
+    </ns0:p>
+    <ns0:p>
+      <ns0:pPr>
+        <ns0:pStyle ns0:val="Normal"/>
+      </ns0:pPr>
+      <ns0:r>
+        <ns0:t xml:space="preserve">尚未建立的证据：任务含假设性问句，但现有指标未独立建立同历史干预下的多步后果与 Keep。</ns0:t>
       </ns0:r>
     </ns0:p>
     <ns0:p>

</xml_diff>

<commit_message>
Deploying to gh-pages from @ SoniaSuns/soniasuns.github.io@7b9ef8d42d54c27cb857eed2a0d93f78065730a7 🚀
</commit_message>
<xml_diff>
--- a/topics/downloads/aigc-directions.docx
+++ b/topics/downloads/aigc-directions.docx
@@ -79,7 +79,7 @@
         <ns0:pStyle ns0:val="Normal"/>
       </ns0:pPr>
       <ns0:r>
-        <ns0:t xml:space="preserve">Overview：研究事件或机制改变后的后果传播与无关内容保持。已有工作覆盖对象删除、几何编辑、物理仿真条件和数字孪生推理，因此“编辑后果传播”本身已有直接先例。可研究的增量必须落到明确的任务限制、影响范围识别、未见组合或生成执行机制，不能只把删除改称事件编辑。</ns0:t>
+        <ns0:t xml:space="preserve">Overview：事件干预后的选择性生成已有 VOID／GIVE、物理条件生成和 VANS 式对齐等技术先例。状态变化监督、可执行条件和生成反馈可共同改善内部能力；可研究状态接口、训练信号、保持约束或组合泛化的具体增量，并区分已知后果执行与自主后果推断。</ns0:t>
       </ns0:r>
     </ns0:p>
     <ns0:p>
@@ -159,7 +159,7 @@
         <ns0:pStyle ns0:val="Normal"/>
       </ns0:pPr>
       <ns0:r>
-        <ns0:t xml:space="preserve">竞争与可行性边界：最大风险是与 VOID、VideoPhysEdit、CWMDT 的任务重叠，或全部推理由仿真器完成。要分别报告推断端与渲染端收益；不要用“相同 seed”替代环境真值。</ns0:t>
+        <ns0:t xml:space="preserve">竞争与可行性边界：需与 VOID、GIVE、VideoPhysEdit 和 CWMDT 比较适用任务。若后果由仿真器给出，应报告条件执行贡献；自主机制推断另测。相同 seed 不能替代反事实真值，模块组合本身也不自动建立新意。</ns0:t>
       </ns0:r>
     </ns0:p>
     <ns0:p>
@@ -487,23 +487,23 @@
         <ns0:pStyle ns0:val="Normal"/>
       </ns0:pPr>
       <ns0:r>
-        <ns0:t xml:space="preserve">论文已有证据：GIVE 以编辑前后几何条件控制对象变换及次生视觉变化。</ns0:t>
-      </ns0:r>
-    </ns0:p>
-    <ns0:p>
-      <ns0:pPr>
-        <ns0:pStyle ns0:val="Normal"/>
-      </ns0:pPr>
-      <ns0:r>
-        <ns0:t xml:space="preserve">对该方向的支撑：把状态差异映射到可执行的几何条件，检验不同控制接口。</ns0:t>
-      </ns0:r>
-    </ns0:p>
-    <ns0:p>
-      <ns0:pPr>
-        <ns0:pStyle ns0:val="Normal"/>
-      </ns0:pPr>
-      <ns0:r>
-        <ns0:t xml:space="preserve">尚未建立的证据：给定几何变化不等于预测未知事件后果。</ns0:t>
+        <ns0:t xml:space="preserve">论文已有证据：GIVE 用前／后几何条件与配对训练，实现对象变换及未逐像素指定的阴影、反射等效果。</ns0:t>
+      </ns0:r>
+    </ns0:p>
+    <ns0:p>
+      <ns0:pPr>
+        <ns0:pStyle ns0:val="Normal"/>
+      </ns0:pPr>
+      <ns0:r>
+        <ns0:t xml:space="preserve">对该方向的支撑：借用状态变化到视频执行的接口；外部条件和内部学到的次生效果应同时评价。</ns0:t>
+      </ns0:r>
+    </ns0:p>
+    <ns0:p>
+      <ns0:pPr>
+        <ns0:pStyle ns0:val="Normal"/>
+      </ns0:pPr>
+      <ns0:r>
+        <ns0:t xml:space="preserve">尚未建立的证据：给定几何的执行已有贡献；未知机制推断和长链动力学属于尚待验证的扩展。</ns0:t>
       </ns0:r>
     </ns0:p>
     <ns0:p>
@@ -557,23 +557,23 @@
         <ns0:pStyle ns0:val="Normal"/>
       </ns0:pPr>
       <ns0:r>
-        <ns0:t xml:space="preserve">论文已有证据：VANS 预测下一事件并以 Joint-GRPO 对齐事件描述与视频生成。</ns0:t>
-      </ns0:r>
-    </ns0:p>
-    <ns0:p>
-      <ns0:pPr>
-        <ns0:pStyle ns0:val="Normal"/>
-      </ns0:pPr>
-      <ns0:r>
-        <ns0:t xml:space="preserve">对该方向的支撑：提供事件判断与视频执行的分离评测及联合优化参照。</ns0:t>
-      </ns0:r>
-    </ns0:p>
-    <ns0:p>
-      <ns0:pPr>
-        <ns0:pStyle ns0:val="Normal"/>
-      </ns0:pPr>
-      <ns0:r>
-        <ns0:t xml:space="preserve">尚未建立的证据：事实下一事件预测不建立同前缀成对干预的正确性。</ns0:t>
+        <ns0:t xml:space="preserve">论文已有证据：VANS 先固定 VDM 用生成反馈优化 VLM，再固定 VLM 优化 VDM；消融支持分阶段对齐。</ns0:t>
+      </ns0:r>
+    </ns0:p>
+    <ns0:p>
+      <ns0:pPr>
+        <ns0:pStyle ns0:val="Normal"/>
+      </ns0:pPr>
+      <ns0:r>
+        <ns0:t xml:space="preserve">对该方向的支撑：借鉴可训练的推理—生成接口；先稳定状态控制，再用独立状态反馈优化执行。</ns0:t>
+      </ns0:r>
+    </ns0:p>
+    <ns0:p>
+      <ns0:pPr>
+        <ns0:pStyle ns0:val="Normal"/>
+      </ns0:pPr>
+      <ns0:r>
+        <ns0:t xml:space="preserve">尚未建立的证据：任务含假设性问句，但现有指标未独立建立同历史干预下的多步后果与 Keep。</ns0:t>
       </ns0:r>
     </ns0:p>
     <ns0:p>
@@ -627,23 +627,23 @@
         <ns0:pStyle ns0:val="Normal"/>
       </ns0:pPr>
       <ns0:r>
-        <ns0:t xml:space="preserve">论文已有证据：程序性状态反事实覆盖遗漏、乱序和动作前后状态。</ns0:t>
-      </ns0:r>
-    </ns0:p>
-    <ns0:p>
-      <ns0:pPr>
-        <ns0:pStyle ns0:val="Normal"/>
-      </ns0:pPr>
-      <ns0:r>
-        <ns0:t xml:space="preserve">对该方向的支撑：为事件级错误与状态变化标注提供方法参照。</ns0:t>
-      </ns0:r>
-    </ns0:p>
-    <ns0:p>
-      <ns0:pPr>
-        <ns0:pStyle ns0:val="Normal"/>
-      </ns0:pPr>
-      <ns0:r>
-        <ns0:t xml:space="preserve">尚未建立的证据：原工作训练视频表征，未验证该监督能训练因果生成。</ns0:t>
+        <ns0:t xml:space="preserve">论文已有证据：LLM 构造动作前后状态及错误结果等反事实文本，经帧／片段／视频层次训练程序表征。</ns0:t>
+      </ns0:r>
+    </ns0:p>
+    <ns0:p>
+      <ns0:pPr>
+        <ns0:pStyle ns0:val="Normal"/>
+      </ns0:pPr>
+      <ns0:r>
+        <ns0:t xml:space="preserve">对该方向的支撑：状态监督可迁移为结果验证器或生成器关系对齐；需对状态监督与蒸馏分别做消融。</ns0:t>
+      </ns0:r>
+    </ns0:p>
+    <ns0:p>
+      <ns0:pPr>
+        <ns0:pStyle ns0:val="Normal"/>
+      </ns0:pPr>
+      <ns0:r>
+        <ns0:t xml:space="preserve">尚未建立的证据：原工作验证理解表征；反事实文本并非成对生成视频，生成迁移与因果可识别性仍需验证。</ns0:t>
       </ns0:r>
     </ns0:p>
     <ns0:p>
@@ -2865,23 +2865,23 @@
         <ns0:pStyle ns0:val="Normal"/>
       </ns0:pPr>
       <ns0:r>
-        <ns0:t xml:space="preserve">论文已有证据：VANS 用下一事件推断及联合优化连接推理和视频答案。</ns0:t>
-      </ns0:r>
-    </ns0:p>
-    <ns0:p>
-      <ns0:pPr>
-        <ns0:pStyle ns0:val="Normal"/>
-      </ns0:pPr>
-      <ns0:r>
-        <ns0:t xml:space="preserve">对该方向的支撑：分别检查补充 context 是否改变判断，以及判断是否被视频实现。</ns0:t>
-      </ns0:r>
-    </ns0:p>
-    <ns0:p>
-      <ns0:pPr>
-        <ns0:pStyle ns0:val="Normal"/>
-      </ns0:pPr>
-      <ns0:r>
-        <ns0:t xml:space="preserve">尚未建立的证据：不提供最小获取策略；判断正确也不保证视频可靠执行。</ns0:t>
+        <ns0:t xml:space="preserve">论文已有证据：VANS 先固定 VDM 用生成反馈优化 VLM，再固定 VLM 优化 VDM；消融支持分阶段对齐。</ns0:t>
+      </ns0:r>
+    </ns0:p>
+    <ns0:p>
+      <ns0:pPr>
+        <ns0:pStyle ns0:val="Normal"/>
+      </ns0:pPr>
+      <ns0:r>
+        <ns0:t xml:space="preserve">对该方向的支撑：借鉴可训练的推理—生成接口；先稳定状态控制，再用独立状态反馈优化执行。</ns0:t>
+      </ns0:r>
+    </ns0:p>
+    <ns0:p>
+      <ns0:pPr>
+        <ns0:pStyle ns0:val="Normal"/>
+      </ns0:pPr>
+      <ns0:r>
+        <ns0:t xml:space="preserve">尚未建立的证据：任务含假设性问句，但现有指标未独立建立同历史干预下的多步后果与 Keep。</ns0:t>
       </ns0:r>
     </ns0:p>
     <ns0:p>

</xml_diff>

<commit_message>
Clarify AIGC paper assumptions and map long-term application research
</commit_message>
<xml_diff>
--- a/topics/downloads/aigc-directions.docx
+++ b/topics/downloads/aigc-directions.docx
@@ -23,7 +23,7 @@
         <ns0:pStyle ns0:val="Normal"/>
       </ns0:pPr>
       <ns0:r>
-        <ns0:t xml:space="preserve">文献核对：2026-10-13</ns0:t>
+        <ns0:t xml:space="preserve">文献核对：AIGC-A 与应用图谱更新至 2026-10-14；其它方向保留逐条原核对日期。</ns0:t>
       </ns0:r>
     </ns0:p>
     <ns0:p>
@@ -207,39 +207,39 @@
         <ns0:pStyle ns0:val="Normal"/>
       </ns0:pPr>
       <ns0:r>
-        <ns0:t xml:space="preserve">论文已有证据：VOID 用成对仿真数据和 quadmask 实现对象及交互删除，另有 VLM 影响范围推理流程。</ns0:t>
-      </ns0:r>
-    </ns0:p>
-    <ns0:p>
-      <ns0:pPr>
-        <ns0:pStyle ns0:val="Normal"/>
-      </ns0:pPr>
-      <ns0:r>
-        <ns0:t xml:space="preserve">对该方向的支撑：比较影响范围自动推断与已知范围下的执行；四类区域提供具体控制接口。</ns0:t>
-      </ns0:r>
-    </ns0:p>
-    <ns0:p>
-      <ns0:pPr>
-        <ns0:pStyle ns0:val="Normal"/>
-      </ns0:pPr>
-      <ns0:r>
-        <ns0:t xml:space="preserve">尚未建立的证据：原操作以删除为主；“我们自动推断 mask”不能单独区分已有流程。</ns0:t>
-      </ns0:r>
-    </ns0:p>
-    <ns0:p>
-      <ns0:pPr>
-        <ns0:pStyle ns0:val="Normal"/>
-      </ns0:pPr>
-      <ns0:r>
-        <ns0:t xml:space="preserve">证据定位：PDF p.1 已有因果编辑 / downstream physical interactions；PDF p.10 原文局限 / unusual angle</ns0:t>
-      </ns0:r>
-    </ns0:p>
-    <ns0:p>
-      <ns0:pPr>
-        <ns0:pStyle ns0:val="Normal"/>
-      </ns0:pPr>
-      <ns0:r>
-        <ns0:t xml:space="preserve">核对状态：沿用原速览已有逐页证据；本轮重组支撑关系，未重新全文核验全部结论</ns0:t>
+        <ns0:t xml:space="preserve">论文已有证据：对象删除及下游交互重生成已有实验证据；成对数据、quadmask 与生成器共同承担任务，不能把效果全部归因于 VLM 解出了精确动力学。</ns0:t>
+      </ns0:r>
+    </ns0:p>
+    <ns0:p>
+      <ns0:pPr>
+        <ns0:pStyle ns0:val="Normal"/>
+      </ns0:pPr>
+      <ns0:r>
+        <ns0:t xml:space="preserve">对该方向的支撑：同骨干比较真值／预测范围与真值状态条件，分别测范围漏检、直接／延迟后果、Keep 误改和机制组合留出；完整源片与仅前缀输入分开报告。</ns0:t>
+      </ns0:r>
+    </ns0:p>
+    <ns0:p>
+      <ns0:pPr>
+        <ns0:pStyle ns0:val="Normal"/>
+      </ns0:pPr>
+      <ns0:r>
+        <ns0:t xml:space="preserve">尚未建立的证据：【原文局限】短时长、特殊视角和模拟到真实的域差仍有失败。【证据范围】主要验证删除，尚未覆盖任意动作替换、未知机制和长链组合；这不否定删除任务贡献。</ns0:t>
+      </ns0:r>
+    </ns0:p>
+    <ns0:p>
+      <ns0:pPr>
+        <ns0:pStyle ns0:val="Normal"/>
+      </ns0:pPr>
+      <ns0:r>
+        <ns0:t xml:space="preserve">证据定位：§3 方法与配对数据；§4 实验；局限与真实视频失败案例</ns0:t>
+      </ns0:r>
+    </ns0:p>
+    <ns0:p>
+      <ns0:pPr>
+        <ns0:pStyle ns0:val="Normal"/>
+      </ns0:pPr>
+      <ns0:r>
+        <ns0:t xml:space="preserve">核对状态：公开原文方法、实验与边界复核；未独立复现。分析前提与未来建议不冒充原文定理。 核对：2026-10-14</ns0:t>
       </ns0:r>
     </ns0:p>
     <ns0:p>
@@ -277,39 +277,39 @@
         <ns0:pStyle ns0:val="Normal"/>
       </ns0:pPr>
       <ns0:r>
-        <ns0:t xml:space="preserve">论文已有证据：VideoPhysEdit 重建刚体场景，施加物理编辑，再用模拟轨迹引导生成，并提出成对物理 benchmark。</ns0:t>
-      </ns0:r>
-    </ns0:p>
-    <ns0:p>
-      <ns0:pPr>
-        <ns0:pStyle ns0:val="Normal"/>
-      </ns0:pPr>
-      <ns0:r>
-        <ns0:t xml:space="preserve">对该方向的支撑：用源片、编辑与执行帧的协议和物理轨迹指标作为强基线。</ns0:t>
-      </ns0:r>
-    </ns0:p>
-    <ns0:p>
-      <ns0:pPr>
-        <ns0:pStyle ns0:val="Normal"/>
-      </ns0:pPr>
-      <ns0:r>
-        <ns0:t xml:space="preserve">尚未建立的证据：刚体范围和场景重建条件有限；不能据此视为任意社会／剧情干预已解决。</ns0:t>
-      </ns0:r>
-    </ns0:p>
-    <ns0:p>
-      <ns0:pPr>
-        <ns0:pStyle ns0:val="Normal"/>
-      </ns0:pPr>
-      <ns0:r>
-        <ns0:t xml:space="preserve">证据定位：Abstract；官方 PCVE-RigidBench</ns0:t>
-      </ns0:r>
-    </ns0:p>
-    <ns0:p>
-      <ns0:pPr>
-        <ns0:pStyle ns0:val="Normal"/>
-      </ns0:pPr>
-      <ns0:r>
-        <ns0:t xml:space="preserve">核对状态：2026-09-28 预印本；本次核对摘要与官方 benchmark，未独立复现实验；核对 2026-10-13</ns0:t>
+        <ns0:t xml:space="preserve">论文已有证据：20 个合成刚体场景的 129 个编辑任务有配对仿真真值；另有真实视频定性展示。训练自由的反演—模拟—生成流程建立了可执行物理编辑证据。</ns0:t>
+      </ns0:r>
+    </ns0:p>
+    <ns0:p>
+      <ns0:pPr>
+        <ns0:pStyle ns0:val="Normal"/>
+      </ns0:pPr>
+      <ns0:r>
+        <ns0:t xml:space="preserve">对该方向的支撑：交叉比较真值与估计状态、同一生成器的真值与估计轨迹；构造原运动近似相同而干预后果不同的参数组，检查不确定性而非只看源片拟合。</ns0:t>
+      </ns0:r>
+    </ns0:p>
+    <ns0:p>
+      <ns0:pPr>
+        <ns0:pStyle ns0:val="Normal"/>
+      </ns0:pPr>
+      <ns0:r>
+        <ns0:t xml:space="preserve">尚未建立的证据：【原文局限】移动相机、复杂几何、关节体与受控的人／机器人不在当前建模范围；固定阈值可能随尺度／观测变化。【证据范围】真实视频展示不等于配对物理真值验证。</ns0:t>
+      </ns0:r>
+    </ns0:p>
+    <ns0:p>
+      <ns0:pPr>
+        <ns0:pStyle ns0:val="Normal"/>
+      </ns0:pPr>
+      <ns0:r>
+        <ns0:t xml:space="preserve">证据定位：§3.1–3.4；§4–5；Appendix C.2、D</ns0:t>
+      </ns0:r>
+    </ns0:p>
+    <ns0:p>
+      <ns0:pPr>
+        <ns0:pStyle ns0:val="Normal"/>
+      </ns0:pPr>
+      <ns0:r>
+        <ns0:t xml:space="preserve">核对状态：公开原文方法、实验与边界复核；未独立复现。分析前提与未来建议不冒充原文定理。 核对：2026-10-14</ns0:t>
       </ns0:r>
     </ns0:p>
     <ns0:p>
@@ -347,39 +347,39 @@
         <ns0:pStyle ns0:val="Normal"/>
       </ns0:pPr>
       <ns0:r>
-        <ns0:t xml:space="preserve">论文已有证据：CWMDT 用对象关系描述和 LLM 推理干预后的演化，再条件化视频扩散。</ns0:t>
-      </ns0:r>
-    </ns0:p>
-    <ns0:p>
-      <ns0:pPr>
-        <ns0:pStyle ns0:val="Normal"/>
-      </ns0:pPr>
-      <ns0:r>
-        <ns0:t xml:space="preserve">对该方向的支撑：比较结构化状态条件与直接提示，定位推理与执行各自的误差。</ns0:t>
-      </ns0:r>
-    </ns0:p>
-    <ns0:p>
-      <ns0:pPr>
-        <ns0:pStyle ns0:val="Normal"/>
-      </ns0:pPr>
-      <ns0:r>
-        <ns0:t xml:space="preserve">尚未建立的证据：数字孪生描述不等于已验证的物理仿真；图加 LLM 不是足够的新贡献。</ns0:t>
-      </ns0:r>
-    </ns0:p>
-    <ns0:p>
-      <ns0:pPr>
-        <ns0:pStyle ns0:val="Normal"/>
-      </ns0:pPr>
-      <ns0:r>
-        <ns0:t xml:space="preserve">证据定位：PDF §3–4 pp.3–8；附录A表4 p.10。</ns0:t>
-      </ns0:r>
-    </ns0:p>
-    <ns0:p>
-      <ns0:pPr>
-        <ns0:pStyle ns0:val="Normal"/>
-      </ns0:pPr>
-      <ns0:r>
-        <ns0:t xml:space="preserve">核对状态：本轮重新分类；摘要、方法及边界沿用既有笔记，附本地原文供复核</ns0:t>
+        <ns0:t xml:space="preserve">论文已有证据：在视频编辑／反事实基准上报告视觉和语义收益，展示显式表示—LLM 干预推理—扩散生成的可编辑接口。</ns0:t>
+      </ns0:r>
+    </ns0:p>
+    <ns0:p>
+      <ns0:pPr>
+        <ns0:pStyle ns0:val="Normal"/>
+      </ns0:pPr>
+      <ns0:r>
+        <ns0:t xml:space="preserve">对该方向的支撑：真值对象状态／预测状态、真值后果／LLM 后果分层替换；同时评价状态误差、生成遵循、可接受未来覆盖及 Keep，避免只测文本相似度。</ns0:t>
+      </ns0:r>
+    </ns0:p>
+    <ns0:p>
+      <ns0:pPr>
+        <ns0:pStyle ns0:val="Normal"/>
+      </ns0:pPr>
+      <ns0:r>
+        <ns0:t xml:space="preserve">尚未建立的证据：【证据范围】结构化“数字孪生”不是经物理识别验证的模拟器；CLIP、检测器和 VLM 评价及小型 CausalVQA debug 结果，不能独立证明真实因果效应识别。</ns0:t>
+      </ns0:r>
+    </ns0:p>
+    <ns0:p>
+      <ns0:pPr>
+        <ns0:pStyle ns0:val="Normal"/>
+      </ns0:pPr>
+      <ns0:r>
+        <ns0:t xml:space="preserve">证据定位：§3 三阶段框架；§4 编辑实验；Appendix A CausalVQA debug</ns0:t>
+      </ns0:r>
+    </ns0:p>
+    <ns0:p>
+      <ns0:pPr>
+        <ns0:pStyle ns0:val="Normal"/>
+      </ns0:pPr>
+      <ns0:r>
+        <ns0:t xml:space="preserve">核对状态：公开原文方法、实验与边界复核；未独立复现。分析前提与未来建议不冒充原文定理。 核对：2026-10-14</ns0:t>
       </ns0:r>
     </ns0:p>
     <ns0:p>
@@ -409,47 +409,47 @@
         <ns0:pStyle ns0:val="Normal"/>
       </ns0:pPr>
       <ns0:r>
-        <ns0:t xml:space="preserve">公开补充文献 · 直接概念近邻／尚无实验</ns0:t>
-      </ns0:r>
-    </ns0:p>
-    <ns0:p>
-      <ns0:pPr>
-        <ns0:pStyle ns0:val="Normal"/>
-      </ns0:pPr>
-      <ns0:r>
-        <ns0:t xml:space="preserve">论文已有证据：Twin Rollouts 提出同前缀、共享未来噪声的反事实分支，以及依赖模拟器真值的局部性和结果奖励。</ns0:t>
-      </ns0:r>
-    </ns0:p>
-    <ns0:p>
-      <ns0:pPr>
-        <ns0:pStyle ns0:val="Normal"/>
-      </ns0:pPr>
-      <ns0:r>
-        <ns0:t xml:space="preserve">对该方向的支撑：借用控制随机差异的成对协议；把奖励假设与实际算法验证分开。</ns0:t>
-      </ns0:r>
-    </ns0:p>
-    <ns0:p>
-      <ns0:pPr>
-        <ns0:pStyle ns0:val="Normal"/>
-      </ns0:pPr>
-      <ns0:r>
-        <ns0:t xml:space="preserve">尚未建立的证据：v1 明示实验尚待完成；模型内噪声已知不保证世界后果正确，也未实证解决时空 credit assignment。</ns0:t>
-      </ns0:r>
-    </ns0:p>
-    <ns0:p>
-      <ns0:pPr>
-        <ns0:pStyle ns0:val="Normal"/>
-      </ns0:pPr>
-      <ns0:r>
-        <ns0:t xml:space="preserve">证据定位：Abstract; §2 formal framework; §5 limitations</ns0:t>
-      </ns0:r>
-    </ns0:p>
-    <ns0:p>
-      <ns0:pPr>
-        <ns0:pStyle ns0:val="Normal"/>
-      </ns0:pPr>
-      <ns0:r>
-        <ns0:t xml:space="preserve">核对状态：2026-08-10 v1；框架提案，原文明示实验尚待完成；核对 2026-10-13</ns0:t>
+        <ns0:t xml:space="preserve">公开补充文献 · 形式化框架／小环境示意，规模实验待完成</ns0:t>
+      </ns0:r>
+    </ns0:p>
+    <ns0:p>
+      <ns0:pPr>
+        <ns0:pStyle ns0:val="Normal"/>
+      </ns0:pPr>
+      <ns0:r>
+        <ns0:t xml:space="preserve">论文已有证据：当前 v1 提出形式化协议和确定性小网格环境示意，明确规模实验尚待完成；应视为概念／评价设计先例，而非已验证性能领先的方法。</ns0:t>
+      </ns0:r>
+    </ns0:p>
+    <ns0:p>
+      <ns0:pPr>
+        <ns0:pStyle ns0:val="Normal"/>
+      </ns0:pPr>
+      <ns0:r>
+        <ns0:t xml:space="preserve">对该方向的支撑：同训练量比较共享／独立噪声、全局／局部奖励、真值／估计 D；单列相机变化和空 Keep，检查结果正确性与局部性是否独立改善。</ns0:t>
+      </ns0:r>
+    </ns0:p>
+    <ns0:p>
+      <ns0:pPr>
+        <ns0:pStyle ns0:val="Normal"/>
+      </ns0:pPr>
+      <ns0:r>
+        <ns0:t xml:space="preserve">尚未建立的证据：【证据状态】缺少规模训练和真实视频实验；依赖可分叉模拟器及 D 的可操作定义。像素差也可能混有渲染变化，不自动等价于语义因果影响。</ns0:t>
+      </ns0:r>
+    </ns0:p>
+    <ns0:p>
+      <ns0:pPr>
+        <ns0:pStyle ns0:val="Normal"/>
+      </ns0:pPr>
+      <ns0:r>
+        <ns0:t xml:space="preserve">证据定位：§2 形式化；奖励与示意环境；局限／实验计划</ns0:t>
+      </ns0:r>
+    </ns0:p>
+    <ns0:p>
+      <ns0:pPr>
+        <ns0:pStyle ns0:val="Normal"/>
+      </ns0:pPr>
+      <ns0:r>
+        <ns0:t xml:space="preserve">核对状态：公开原文方法、实验与边界复核；未独立复现。分析前提与未来建议不冒充原文定理。 核对：2026-10-14</ns0:t>
       </ns0:r>
     </ns0:p>
     <ns0:p>
@@ -487,39 +487,39 @@
         <ns0:pStyle ns0:val="Normal"/>
       </ns0:pPr>
       <ns0:r>
-        <ns0:t xml:space="preserve">论文已有证据：GIVE 用前／后几何条件与配对训练，实现对象变换及未逐像素指定的阴影、反射等效果。</ns0:t>
-      </ns0:r>
-    </ns0:p>
-    <ns0:p>
-      <ns0:pPr>
-        <ns0:pStyle ns0:val="Normal"/>
-      </ns0:pPr>
-      <ns0:r>
-        <ns0:t xml:space="preserve">对该方向的支撑：借用状态变化到视频执行的接口；外部条件和内部学到的次生效果应同时评价。</ns0:t>
-      </ns0:r>
-    </ns0:p>
-    <ns0:p>
-      <ns0:pPr>
-        <ns0:pStyle ns0:val="Normal"/>
-      </ns0:pPr>
-      <ns0:r>
-        <ns0:t xml:space="preserve">尚未建立的证据：给定几何的执行已有贡献；未知机制推断和长链动力学属于尚待验证的扩展。</ns0:t>
-      </ns0:r>
-    </ns0:p>
-    <ns0:p>
-      <ns0:pPr>
-        <ns0:pStyle ns0:val="Normal"/>
-      </ns0:pPr>
-      <ns0:r>
-        <ns0:t xml:space="preserve">证据定位：PDF p.1 方法 / pre/post geometric specification；PDF p.19 原文局限 / newly exposed moving hand</ns0:t>
-      </ns0:r>
-    </ns0:p>
-    <ns0:p>
-      <ns0:pPr>
-        <ns0:pStyle ns0:val="Normal"/>
-      </ns0:pPr>
-      <ns0:r>
-        <ns0:t xml:space="preserve">核对状态：沿用原速览已有逐页证据；本轮重组支撑关系，未重新全文核验全部结论</ns0:t>
+        <ns0:t xml:space="preserve">论文已有证据：配对训练实现几何可控编辑，并生成未逐像素给定的阴影、反射等次生效果；外部控制与内部学习能力在此同时存在。</ns0:t>
+      </ns0:r>
+    </ns0:p>
+    <ns0:p>
+      <ns0:pPr>
+        <ns0:pStyle ns0:val="Normal"/>
+      </ns0:pPr>
+      <ns0:r>
+        <ns0:t xml:space="preserve">对该方向的支撑：同骨干比较真值／估计几何、完整／稀疏条件；分别测目标变换、阴影等次生效果、未编辑对象及新暴露区域。</ns0:t>
+      </ns0:r>
+    </ns0:p>
+    <ns0:p>
+      <ns0:pPr>
+        <ns0:pStyle ns0:val="Normal"/>
+      </ns0:pPr>
+      <ns0:r>
+        <ns0:t xml:space="preserve">尚未建立的证据：【原文局限】新暴露的运动手部等细节可能失败，多条件流增加计算。【证据范围】给定目标几何的执行不等于从一个动作自主推断所有未知动力学后果。</ns0:t>
+      </ns0:r>
+    </ns0:p>
+    <ns0:p>
+      <ns0:pPr>
+        <ns0:pStyle ns0:val="Normal"/>
+      </ns0:pPr>
+      <ns0:r>
+        <ns0:t xml:space="preserve">证据定位：方法：四路几何条件与配对数据；实验／消融；局限</ns0:t>
+      </ns0:r>
+    </ns0:p>
+    <ns0:p>
+      <ns0:pPr>
+        <ns0:pStyle ns0:val="Normal"/>
+      </ns0:pPr>
+      <ns0:r>
+        <ns0:t xml:space="preserve">核对状态：公开原文方法、实验与边界复核；未独立复现。分析前提与未来建议不冒充原文定理。 核对：2026-10-14</ns0:t>
       </ns0:r>
     </ns0:p>
     <ns0:p>
@@ -557,39 +557,39 @@
         <ns0:pStyle ns0:val="Normal"/>
       </ns0:pPr>
       <ns0:r>
-        <ns0:t xml:space="preserve">论文已有证据：VANS 先固定 VDM 用生成反馈优化 VLM，再固定 VLM 优化 VDM；消融支持分阶段对齐。</ns0:t>
-      </ns0:r>
-    </ns0:p>
-    <ns0:p>
-      <ns0:pPr>
-        <ns0:pStyle ns0:val="Normal"/>
-      </ns0:pPr>
-      <ns0:r>
-        <ns0:t xml:space="preserve">对该方向的支撑：借鉴可训练的推理—生成接口；先稳定状态控制，再用独立状态反馈优化执行。</ns0:t>
-      </ns0:r>
-    </ns0:p>
-    <ns0:p>
-      <ns0:pPr>
-        <ns0:pStyle ns0:val="Normal"/>
-      </ns0:pPr>
-      <ns0:r>
-        <ns0:t xml:space="preserve">尚未建立的证据：任务含假设性问句，但现有指标未独立建立同历史干预下的多步后果与 Keep。</ns0:t>
-      </ns0:r>
-    </ns0:p>
-    <ns0:p>
-      <ns0:pPr>
-        <ns0:pStyle ns0:val="Normal"/>
-      </ns0:pPr>
-      <ns0:r>
-        <ns0:t xml:space="preserve">证据定位：PDF p.1 任务 / Video-NextEvent Prediction；PDF p.5 两阶段机制 / Stage 2: Context-Faithful；PDF p.5 奖励 / CLIPScore</ns0:t>
-      </ns0:r>
-    </ns0:p>
-    <ns0:p>
-      <ns0:pPr>
-        <ns0:pStyle ns0:val="Normal"/>
-      </ns0:pPr>
-      <ns0:r>
-        <ns0:t xml:space="preserve">核对状态：沿用原速览已有逐页证据；本轮重组支撑关系，未重新全文核验全部结论</ns0:t>
+        <ns0:t xml:space="preserve">论文已有证据：阶段式推理—生成对齐及消融支持在其视频问答生成任务上的提升；生成反馈能够用于训练内部能力，不能描述为只有外部 prompt 控制。</ns0:t>
+      </ns0:r>
+    </ns0:p>
+    <ns0:p>
+      <ns0:pPr>
+        <ns0:pStyle ns0:val="Normal"/>
+      </ns0:pPr>
+      <ns0:r>
+        <ns0:t xml:space="preserve">对该方向的支撑：固定数据和预算，比较参考锚点与预测锚点，加入相同历史的不同合法分支及无关干预；用独立状态检查器测奖励投机、事件完成与 Keep。</ns0:t>
+      </ns0:r>
+    </ns0:p>
+    <ns0:p>
+      <ns0:pPr>
+        <ns0:pStyle ns0:val="Normal"/>
+      </ns0:pPr>
+      <ns0:r>
+        <ns0:t xml:space="preserve">尚未建立的证据：【原文消融】奖励组合会影响动态与语义表现。【证据范围】不是对任意同历史干预、长链后果和 Keep 的保证；Joint 不应被误读成两模型始终同时更新。</ns0:t>
+      </ns0:r>
+    </ns0:p>
+    <ns0:p>
+      <ns0:pPr>
+        <ns0:pStyle ns0:val="Normal"/>
+      </ns0:pPr>
+      <ns0:r>
+        <ns0:t xml:space="preserve">证据定位：v2 方法 Joint-GRPO 两阶段与算法；实验／奖励消融</ns0:t>
+      </ns0:r>
+    </ns0:p>
+    <ns0:p>
+      <ns0:pPr>
+        <ns0:pStyle ns0:val="Normal"/>
+      </ns0:pPr>
+      <ns0:r>
+        <ns0:t xml:space="preserve">核对状态：公开原文方法、实验与边界复核；未独立复现。分析前提与未来建议不冒充原文定理。 核对：2026-10-14</ns0:t>
       </ns0:r>
     </ns0:p>
     <ns0:p>
@@ -627,39 +627,39 @@
         <ns0:pStyle ns0:val="Normal"/>
       </ns0:pPr>
       <ns0:r>
-        <ns0:t xml:space="preserve">论文已有证据：LLM 构造动作前后状态及错误结果等反事实文本，经帧／片段／视频层次训练程序表征。</ns0:t>
-      </ns0:r>
-    </ns0:p>
-    <ns0:p>
-      <ns0:pPr>
-        <ns0:pStyle ns0:val="Normal"/>
-      </ns0:pPr>
-      <ns0:r>
-        <ns0:t xml:space="preserve">对该方向的支撑：状态监督可迁移为结果验证器或生成器关系对齐；需对状态监督与蒸馏分别做消融。</ns0:t>
-      </ns0:r>
-    </ns0:p>
-    <ns0:p>
-      <ns0:pPr>
-        <ns0:pStyle ns0:val="Normal"/>
-      </ns0:pPr>
-      <ns0:r>
-        <ns0:t xml:space="preserve">尚未建立的证据：原工作验证理解表征；反事实文本并非成对生成视频，生成迁移与因果可识别性仍需验证。</ns0:t>
-      </ns0:r>
-    </ns0:p>
-    <ns0:p>
-      <ns0:pPr>
-        <ns0:pStyle ns0:val="Normal"/>
-      </ns0:pPr>
-      <ns0:r>
-        <ns0:t xml:space="preserve">证据定位：PDF p.1 任务与机制 / state-change descriptions；PDF p.8 生成边界 / synthetic long-form videos</ns0:t>
-      </ns0:r>
-    </ns0:p>
-    <ns0:p>
-      <ns0:pPr>
-        <ns0:pStyle ns0:val="Normal"/>
-      </ns0:pPr>
-      <ns0:r>
-        <ns0:t xml:space="preserve">核对状态：沿用原速览已有逐页证据；本轮重组支撑关系，未重新全文核验全部结论</ns0:t>
+        <ns0:t xml:space="preserve">论文已有证据：状态监督改善程序相关理解／表征任务。附录进行人工与模型质量核查，支持其数据设计具有实用性。</ns0:t>
+      </ns0:r>
+    </ns0:p>
+    <ns0:p>
+      <ns0:pPr>
+        <ns0:pStyle ns0:val="Normal"/>
+      </ns0:pPr>
+      <ns0:r>
+        <ns0:t xml:space="preserve">对该方向的支撑：对照真实状态标签、原始合成状态与普通动词负例，检查负例质量与生成器迁移；留出生成器／背景捷径，并测条件执行和后果泛化。</ns0:t>
+      </ns0:r>
+    </ns0:p>
+    <ns0:p>
+      <ns0:pPr>
+        <ns0:pStyle ns0:val="Normal"/>
+      </ns0:pPr>
+      <ns0:r>
+        <ns0:t xml:space="preserve">尚未建立的证据：【原文 Appendix A.4】反事实文本偶有低概率情形，需要权衡创造性与现实性。【任务范围】理解提升不直接建立生成收益或因果可识别性。</ns0:t>
+      </ns0:r>
+    </ns0:p>
+    <ns0:p>
+      <ns0:pPr>
+        <ns0:pStyle ns0:val="Normal"/>
+      </ns0:pPr>
+      <ns0:r>
+        <ns0:t xml:space="preserve">证据定位：v6 层次状态对比学习；程序理解实验；Appendix A.4 文本质量</ns0:t>
+      </ns0:r>
+    </ns0:p>
+    <ns0:p>
+      <ns0:pPr>
+        <ns0:pStyle ns0:val="Normal"/>
+      </ns0:pPr>
+      <ns0:r>
+        <ns0:t xml:space="preserve">核对状态：公开原文方法、实验与边界复核；未独立复现。分析前提与未来建议不冒充原文定理。 核对：2026-10-14</ns0:t>
       </ns0:r>
     </ns0:p>
     <ns0:p>
@@ -697,39 +697,39 @@
         <ns0:pStyle ns0:val="Normal"/>
       </ns0:pPr>
       <ns0:r>
-        <ns0:t xml:space="preserve">论文已有证据：What-If World 用单条件变化的提示对评价后果差异。</ns0:t>
-      </ns0:r>
-    </ns0:p>
-    <ns0:p>
-      <ns0:pPr>
-        <ns0:pStyle ns0:val="Normal"/>
-      </ns0:pPr>
-      <ns0:r>
-        <ns0:t xml:space="preserve">对该方向的支撑：构造必要变化与无关保持的双边评测。</ns0:t>
-      </ns0:r>
-    </ns0:p>
-    <ns0:p>
-      <ns0:pPr>
-        <ns0:pStyle ns0:val="Normal"/>
-      </ns0:pPr>
-      <ns0:r>
-        <ns0:t xml:space="preserve">尚未建立的证据：基准不提供新生成算法；提示对也不能替代每个机制的可验证状态真值。</ns0:t>
-      </ns0:r>
-    </ns0:p>
-    <ns0:p>
-      <ns0:pPr>
-        <ns0:pStyle ns0:val="Normal"/>
-      </ns0:pPr>
-      <ns0:r>
-        <ns0:t xml:space="preserve">证据定位：PDF p.1 成对任务 / 319；PDF p.8 成对测量 / Some failures are invisible to single-video metrics</ns0:t>
-      </ns0:r>
-    </ns0:p>
-    <ns0:p>
-      <ns0:pPr>
-        <ns0:pStyle ns0:val="Normal"/>
-      </ns0:pPr>
-      <ns0:r>
-        <ns0:t xml:space="preserve">核对状态：沿用原速览已有逐页证据；本轮重组支撑关系，未重新全文核验全部结论</ns0:t>
+        <ns0:t xml:space="preserve">论文已有证据：提供成对干预诊断，揭示逐视频画质／合理性评价会遗漏的问题；其贡献是评测，未提出训练算法不是缺陷。</ns0:t>
+      </ns0:r>
+    </ns0:p>
+    <ns0:p>
+      <ns0:pPr>
+        <ns0:pStyle ns0:val="Normal"/>
+      </ns0:pPr>
+      <ns0:r>
+        <ns0:t xml:space="preserve">对该方向的支撑：分开报告单片质量与配对 Outcome、Keep；多 seed 重复并人工抽查关键事件，比较基准裁判与独立状态／轨迹真值的一致性。</ns0:t>
+      </ns0:r>
+    </ns0:p>
+    <ns0:p>
+      <ns0:pPr>
+        <ns0:pStyle ns0:val="Normal"/>
+      </ns0:pPr>
+      <ns0:r>
+        <ns0:t xml:space="preserve">尚未建立的证据：【原文讨论】基准分数与部署表现的关系仍需研究，失败分析是现象性诊断，不能定位模型架构／训练原因。【证据范围】不为每例提供唯一真实动力学轨迹。</ns0:t>
+      </ns0:r>
+    </ns0:p>
+    <ns0:p>
+      <ns0:pPr>
+        <ns0:pStyle ns0:val="Normal"/>
+      </ns0:pPr>
+      <ns0:r>
+        <ns0:t xml:space="preserve">证据定位：基准构造与 APEO；九模型评测；Discussion／Limitations</ns0:t>
+      </ns0:r>
+    </ns0:p>
+    <ns0:p>
+      <ns0:pPr>
+        <ns0:pStyle ns0:val="Normal"/>
+      </ns0:pPr>
+      <ns0:r>
+        <ns0:t xml:space="preserve">核对状态：公开原文方法、实验与边界复核；未独立复现。分析前提与未来建议不冒充原文定理。 核对：2026-10-14</ns0:t>
       </ns0:r>
     </ns0:p>
     <ns0:p>
@@ -799,7 +799,7 @@
         <ns0:pStyle ns0:val="Normal"/>
       </ns0:pPr>
       <ns0:r>
-        <ns0:t xml:space="preserve">不支持假设的结果：若只有 oracle 条件有效，则尚未支持自主后果推断；若优势只来自更强生成器或更多采样，则不支持该机制。</ns0:t>
+        <ns0:t xml:space="preserve">不支持假设的结果：若仅真值条件有效，可支持条件执行贡献，但尚未支持自主后果推断；真值也无效则接口或执行假设缺乏支持。若优势只来自更强生成器或更多采样，则不支持候选机制。</ns0:t>
       </ns0:r>
     </ns0:p>
     <ns0:p>
@@ -847,7 +847,7 @@
         <ns0:pStyle ns0:val="Normal"/>
       </ns0:pPr>
       <ns0:r>
-        <ns0:t xml:space="preserve">必要基线：全局奖励；相同数据的监督微调；随机时间分配反馈；只改 mask；结构化反馈但全片重生成。</ns0:t>
+        <ns0:t xml:space="preserve">必要基线：全局奖励；相同数据的监督微调；随机时间分配反馈；只改 mask；结构化反馈但全片重生成。；VQQA 的原始意图 Global Selection 与动态停止；VANS 式分阶段优化。</ns0:t>
       </ns0:r>
     </ns0:p>
     <ns0:p>
@@ -3542,6 +3542,1146 @@
       </ns0:pPr>
       <ns0:r>
         <ns0:t xml:space="preserve">建议先用 50–100 个可控短片实例做诊断：固定骨干、输入权限、采样数和总预算，比较直接提示、结构化 context、全量重生成／记忆重置与候选方法。按对象、机制组合和证据类型留出，保留无变化与无关变化负对照。先报告 GPU 小时／API 成本、生成帧数、采样次数、修订延迟和失败率，再决定是否需要 LoRA、蒸馏或视频 RL；benchmark 是否独立成篇取决于任务与评测的新信息。</ns0:t>
+      </ns0:r>
+    </ns0:p>
+    <ns0:p>
+      <ns0:r>
+        <ns0:t>AIGC · 逐篇前提与长期应用图谱 · 2026-10-14</ns0:t>
+      </ns0:r>
+    </ns0:p>
+    <ns0:p>
+      <ns0:r>
+        <ns0:t>8 篇核心支撑＋H2 引用的 VQQA，分别标注任务、原文条件、分析前提、已有证据、局限／未证范围及后续增量。后续创新门槛不是原论文缺陷；未做新实验。</ns0:t>
+      </ns0:r>
+    </ns0:p>
+    <ns0:p>
+      <ns0:r>
+        <ns0:t>VOID · AIGC-A 核心支撑</ns0:t>
+      </ns0:r>
+    </ns0:p>
+    <ns0:p>
+      <ns0:r>
+        <ns0:t>任务与输入：给定完整源视频与指定删除对象，重生成对象消失后的交互；这是离线后果编辑，不等同于只看历史前缀预测未来。</ns0:t>
+      </ns0:r>
+    </ns0:p>
+    <ns0:p>
+      <ns0:r>
+        <ns0:t>原文条件／算法设置：配对模拟在保持其余场景设定的情况下移除对象；quadmask 表达删除、受影响与保持等区域语义。用户确定目标，VLM 辅助判断影响范围，视频生成器执行连续运动与视觉补全。</ns0:t>
+      </ns0:r>
+    </ns0:p>
+    <ns0:p>
+      <ns0:r>
+        <ns0:t>成立前提 · 原文与本文分析分开标注：【本文分析】成功依赖影响范围判断及生成先验能覆盖该交互；配对模拟是受控真值，真实视频中的隐藏参数通常不足以唯一确定反事实。受影响区域可以很大，不假设变化必然局部，也不把静止相机列为其明确前提。</ns0:t>
+      </ns0:r>
+    </ns0:p>
+    <ns0:p>
+      <ns0:r>
+        <ns0:t>原工作已经建立什么：对象删除及下游交互重生成已有实验证据；成对数据、quadmask 与生成器共同承担任务，不能把效果全部归因于 VLM 解出了精确动力学。</ns0:t>
+      </ns0:r>
+    </ns0:p>
+    <ns0:p>
+      <ns0:r>
+        <ns0:t>原文局限／证据范围：【原文局限】短时长、特殊视角和模拟到真实的域差仍有失败。【证据范围】主要验证删除，尚未覆盖任意动作替换、未知机制和长链组合；这不否定删除任务贡献。</ns0:t>
+      </ns0:r>
+    </ns0:p>
+    <ns0:p>
+      <ns0:r>
+        <ns0:t>后续创新空间 · 不等于原论文缺陷：【后续研究建议】已有自动影响范围流程，因此“自动推断 mask”本身不是与 VOID 的充分区别。可检验更准确的范围推断、新干预类型、延迟后果与同预算保持能力，而非要求原工作先解决所有因果问题。</ns0:t>
+      </ns0:r>
+    </ns0:p>
+    <ns0:p>
+      <ns0:r>
+        <ns0:t>建议诊断实验 · 尚未实测：同骨干比较真值／预测范围与真值状态条件，分别测范围漏检、直接／延迟后果、Keep 误改和机制组合留出；完整源片与仅前缀输入分开报告。</ns0:t>
+      </ns0:r>
+    </ns0:p>
+    <ns0:p>
+      <ns0:r>
+        <ns0:t>证据定位：§3 方法与配对数据；§4 实验；局限与真实视频失败案例</ns0:t>
+      </ns0:r>
+    </ns0:p>
+    <ns0:p>
+      <ns0:r>
+        <ns0:t>原文：https://arxiv.org/abs/2604.02296v1</ns0:t>
+      </ns0:r>
+    </ns0:p>
+    <ns0:p>
+      <ns0:r>
+        <ns0:t>VideoPhysEdit · AIGC-A 核心支撑</ns0:t>
+      </ns0:r>
+    </ns0:p>
+    <ns0:p>
+      <ns0:r>
+        <ns0:t>任务与输入：输入源视频、物理编辑及执行帧；反演可复现原运动的刚体场景，编辑后模拟，再以投影轨迹和编辑参考图引导视频生成。</ns0:t>
+      </ns0:r>
+    </ns0:p>
+    <ns0:p>
+      <ns0:r>
+        <ns0:t>原文条件／算法设置：【原文明示，Appendix D】静止相机、静态平面支撑，物体几何简化为球或盒；支持添加／删除及速度、质量、摩擦、恢复系数等编辑。依赖跟踪、几何估计、模拟器和轨迹条件生成接口。</ns0:t>
+      </ns0:r>
+    </ns0:p>
+    <ns0:p>
+      <ns0:r>
+        <ns0:t>成立前提 · 原文与本文分析分开标注：【原文 §3.3】单目物理反演欠定，不同几何与参数可能解释同一运动。【本文分析】拟合原视频不保证隐藏物理参数真实唯一，反事实取决于所选解释。</ns0:t>
+      </ns0:r>
+    </ns0:p>
+    <ns0:p>
+      <ns0:r>
+        <ns0:t>原工作已经建立什么：20 个合成刚体场景的 129 个编辑任务有配对仿真真值；另有真实视频定性展示。训练自由的反演—模拟—生成流程建立了可执行物理编辑证据。</ns0:t>
+      </ns0:r>
+    </ns0:p>
+    <ns0:p>
+      <ns0:r>
+        <ns0:t>原文局限／证据范围：【原文局限】移动相机、复杂几何、关节体与受控的人／机器人不在当前建模范围；固定阈值可能随尺度／观测变化。【证据范围】真实视频展示不等于配对物理真值验证。</ns0:t>
+      </ns0:r>
+    </ns0:p>
+    <ns0:p>
+      <ns0:r>
+        <ns0:t>后续创新空间 · 不等于原论文缺陷：【后续研究建议】可研究反演歧义及不确定性、复杂几何或移动相机，而不把有模拟器的控制执行视作没有价值。对比必须明确谁获得真值几何／参数。</ns0:t>
+      </ns0:r>
+    </ns0:p>
+    <ns0:p>
+      <ns0:r>
+        <ns0:t>建议诊断实验 · 尚未实测：交叉比较真值与估计状态、同一生成器的真值与估计轨迹；构造原运动近似相同而干预后果不同的参数组，检查不确定性而非只看源片拟合。</ns0:t>
+      </ns0:r>
+    </ns0:p>
+    <ns0:p>
+      <ns0:r>
+        <ns0:t>证据定位：§3.1–3.4；§4–5；Appendix C.2、D</ns0:t>
+      </ns0:r>
+    </ns0:p>
+    <ns0:p>
+      <ns0:r>
+        <ns0:t>原文：https://arxiv.org/html/2609.35134v1</ns0:t>
+      </ns0:r>
+    </ns0:p>
+    <ns0:p>
+      <ns0:r>
+        <ns0:t>CWMDT · AIGC-A 核心支撑</ns0:t>
+      </ns0:r>
+    </ns0:p>
+    <ns0:p>
+      <ns0:r>
+        <ns0:t>任务与输入：把视觉观察组织成对象状态描述，LLM 根据干预预测多种后续状态，视频扩散模型以修改首帧与状态序列生成反事实。</ns0:t>
+      </ns0:r>
+    </ns0:p>
+    <ns0:p>
+      <ns0:r>
+        <ns0:t>原文条件／算法设置：对象身份、类别、属性、质心／深度／大小与 mask 等来自感知模块；数字孪生是结构化表示。由 LLM 预测未来，生成器接受其条件；每次干预可采样多个合理未来。</ns0:t>
+      </ns0:r>
+    </ns0:p>
+    <ns0:p>
+      <ns0:r>
+        <ns0:t>成立前提 · 原文与本文分析分开标注：【本文分析】表示必须保留决定后果的状态，LLM 必须能给出适用演化，生成器必须忠实执行。三者是可分离的误差来源；多种合理未来不应未经定义压成一个唯一物理真值。</ns0:t>
+      </ns0:r>
+    </ns0:p>
+    <ns0:p>
+      <ns0:r>
+        <ns0:t>原工作已经建立什么：在视频编辑／反事实基准上报告视觉和语义收益，展示显式表示—LLM 干预推理—扩散生成的可编辑接口。</ns0:t>
+      </ns0:r>
+    </ns0:p>
+    <ns0:p>
+      <ns0:r>
+        <ns0:t>原文局限／证据范围：【证据范围】结构化“数字孪生”不是经物理识别验证的模拟器；CLIP、检测器和 VLM 评价及小型 CausalVQA debug 结果，不能独立证明真实因果效应识别。</ns0:t>
+      </ns0:r>
+    </ns0:p>
+    <ns0:p>
+      <ns0:r>
+        <ns0:t>后续创新空间 · 不等于原论文缺陷：【后续研究建议】对象结构＋LLM 演化＋条件生成已有先例。新工作可在状态充分性、预测校准、条件执行或未见机制组合上建立增量，不以模块名称差异代替实验。</ns0:t>
+      </ns0:r>
+    </ns0:p>
+    <ns0:p>
+      <ns0:r>
+        <ns0:t>建议诊断实验 · 尚未实测：真值对象状态／预测状态、真值后果／LLM 后果分层替换；同时评价状态误差、生成遵循、可接受未来覆盖及 Keep，避免只测文本相似度。</ns0:t>
+      </ns0:r>
+    </ns0:p>
+    <ns0:p>
+      <ns0:r>
+        <ns0:t>证据定位：§3 三阶段框架；§4 编辑实验；Appendix A CausalVQA debug</ns0:t>
+      </ns0:r>
+    </ns0:p>
+    <ns0:p>
+      <ns0:r>
+        <ns0:t>原文：https://arxiv.org/abs/2511.17481v1</ns0:t>
+      </ns0:r>
+    </ns0:p>
+    <ns0:p>
+      <ns0:r>
+        <ns0:t>Twin Rollouts · AIGC-A 核心支撑</ns0:t>
+      </ns0:r>
+    </ns0:p>
+    <ns0:p>
+      <ns0:r>
+        <ns0:t>任务与输入：从模型自生成并记录噪声的事实轨迹分叉，在同一前缀、同一按世界时间对齐的外生噪声下改变动作；定义局部性和结果奖励。</ns0:t>
+      </ns0:r>
+    </ns0:p>
+    <ns0:p>
+      <ns0:r>
+        <ns0:t>原文条件／算法设置：须能记录并重用采样随机性；模拟器能从状态分叉、提供后果真值与受影响集合 D。相机改变可能令 D 覆盖全画面，此时空 Keep 上的局部性指标应标为不适用。</ns0:t>
+      </ns0:r>
+    </ns0:p>
+    <ns0:p>
+      <ns0:r>
+        <ns0:t>成立前提 · 原文与本文分析分开标注：【原文定义范围】exact abduction 指模型内部已记录的随机性。【本文分析】这不解决真实视频的隐变量反演；同噪声降低随机差异，却不保证模型动力学正确，模拟器与生成前缀仍需对齐。</ns0:t>
+      </ns0:r>
+    </ns0:p>
+    <ns0:p>
+      <ns0:r>
+        <ns0:t>原工作已经建立什么：当前 v1 提出形式化协议和确定性小网格环境示意，明确规模实验尚待完成；应视为概念／评价设计先例，而非已验证性能领先的方法。</ns0:t>
+      </ns0:r>
+    </ns0:p>
+    <ns0:p>
+      <ns0:r>
+        <ns0:t>原文局限／证据范围：【证据状态】缺少规模训练和真实视频实验；依赖可分叉模拟器及 D 的可操作定义。像素差也可能混有渲染变化，不自动等价于语义因果影响。</ns0:t>
+      </ns0:r>
+    </ns0:p>
+    <ns0:p>
+      <ns0:r>
+        <ns0:t>后续创新空间 · 不等于原论文缺陷：【后续研究建议】实现其训练协议并验证局部反馈、随机性耦合和独立真值的作用，仍可能是有效实证贡献；不要把框架提案当作所有问题已解决。</ns0:t>
+      </ns0:r>
+    </ns0:p>
+    <ns0:p>
+      <ns0:r>
+        <ns0:t>建议诊断实验 · 尚未实测：同训练量比较共享／独立噪声、全局／局部奖励、真值／估计 D；单列相机变化和空 Keep，检查结果正确性与局部性是否独立改善。</ns0:t>
+      </ns0:r>
+    </ns0:p>
+    <ns0:p>
+      <ns0:r>
+        <ns0:t>证据定位：§2 形式化；奖励与示意环境；局限／实验计划</ns0:t>
+      </ns0:r>
+    </ns0:p>
+    <ns0:p>
+      <ns0:r>
+        <ns0:t>原文：https://arxiv.org/html/2608.08982v1</ns0:t>
+      </ns0:r>
+    </ns0:p>
+    <ns0:p>
+      <ns0:r>
+        <ns0:t>GIVE · AIGC-A 核心支撑</ns0:t>
+      </ns0:r>
+    </ns0:p>
+    <ns0:p>
+      <ns0:r>
+        <ns0:t>任务与输入：给源视频和时序对齐的编辑前／后几何控制，生成对象变换及相应视觉变化。</ns0:t>
+      </ns0:r>
+    </ns0:p>
+    <ns0:p>
+      <ns0:r>
+        <ns0:t>原文条件／算法设置：深度、包围盒、朝向等几何流与 RGB 联合条件化；训练用引擎配对数据。推理以用户输入、视频分割和单目几何估计得到控制，不要求测试时完整 3D 代理、引擎特权缓冲或逐视频优化。</ns0:t>
+      </ns0:r>
+    </ns0:p>
+    <ns0:p>
+      <ns0:r>
+        <ns0:t>成立前提 · 原文与本文分析分开标注：【本文分析】前后控制需在身份、时间和坐标上相容，并充分描述目标编辑；盒级几何不能唯一决定隐藏材质／非刚性细节。学习到的生成先验承担未明确指定的次生视觉效果。</ns0:t>
+      </ns0:r>
+    </ns0:p>
+    <ns0:p>
+      <ns0:r>
+        <ns0:t>原工作已经建立什么：配对训练实现几何可控编辑，并生成未逐像素给定的阴影、反射等次生效果；外部控制与内部学习能力在此同时存在。</ns0:t>
+      </ns0:r>
+    </ns0:p>
+    <ns0:p>
+      <ns0:r>
+        <ns0:t>原文局限／证据范围：【原文局限】新暴露的运动手部等细节可能失败，多条件流增加计算。【证据范围】给定目标几何的执行不等于从一个动作自主推断所有未知动力学后果。</ns0:t>
+      </ns0:r>
+    </ns0:p>
+    <ns0:p>
+      <ns0:r>
+        <ns0:t>后续创新空间 · 不等于原论文缺陷：【后续研究建议】几何条件及次生效果学习已有贡献；增量可落在稀疏条件、带误差控制的稳健执行、动态状态传播及低成本保持，而不是仅宣称“模型内部也学习了关系”。</ns0:t>
+      </ns0:r>
+    </ns0:p>
+    <ns0:p>
+      <ns0:r>
+        <ns0:t>建议诊断实验 · 尚未实测：同骨干比较真值／估计几何、完整／稀疏条件；分别测目标变换、阴影等次生效果、未编辑对象及新暴露区域。</ns0:t>
+      </ns0:r>
+    </ns0:p>
+    <ns0:p>
+      <ns0:r>
+        <ns0:t>证据定位：方法：四路几何条件与配对数据；实验／消融；局限</ns0:t>
+      </ns0:r>
+    </ns0:p>
+    <ns0:p>
+      <ns0:r>
+        <ns0:t>原文：https://arxiv.org/abs/2606.24225v1</ns0:t>
+      </ns0:r>
+    </ns0:p>
+    <ns0:p>
+      <ns0:r>
+        <ns0:t>VANS · AIGC-A 核心支撑</ns0:t>
+      </ns0:r>
+    </ns0:p>
+    <ns0:p>
+      <ns0:r>
+        <ns0:t>任务与输入：输入视频上下文和问题，先预测下一事件的文字答案，再生成视频答案；任务包含预测性、程序性和假设性问题。</ns0:t>
+      </ns0:r>
+    </ns0:p>
+    <ns0:p>
+      <ns0:r>
+        <ns0:t>原文条件／算法设置：训练有参考文字／视频答案。Joint-GRPO 分阶段：先固定 VDM 更新 VLM，再固定 VLM 优化 VDM；第二阶段筛选与参考语义相符的锚点。使用格式、文本及视频语义一致性等奖励。</ns0:t>
+      </ns0:r>
+    </ns0:p>
+    <ns0:p>
+      <ns0:r>
+        <ns0:t>成立前提 · 原文与本文分析分开标注：【本文分析】代理奖励和锚点筛选需与目标事件一致；一个参考答案不必穷尽所有合理未来。文字预测正确、视觉执行正确和真实干预后果正确是不同检验。</ns0:t>
+      </ns0:r>
+    </ns0:p>
+    <ns0:p>
+      <ns0:r>
+        <ns0:t>原工作已经建立什么：阶段式推理—生成对齐及消融支持在其视频问答生成任务上的提升；生成反馈能够用于训练内部能力，不能描述为只有外部 prompt 控制。</ns0:t>
+      </ns0:r>
+    </ns0:p>
+    <ns0:p>
+      <ns0:r>
+        <ns0:t>原文局限／证据范围：【原文消融】奖励组合会影响动态与语义表现。【证据范围】不是对任意同历史干预、长链后果和 Keep 的保证；Joint 不应被误读成两模型始终同时更新。</ns0:t>
+      </ns0:r>
+    </ns0:p>
+    <ns0:p>
+      <ns0:r>
+        <ns0:t>后续创新空间 · 不等于原论文缺陷：【后续研究建议】可将阶段式对齐迁移到状态／事件监督，验证独立后果奖励与保持目标的增量；“VLM 推理＋视频生成＋RL”已不是空白。</ns0:t>
+      </ns0:r>
+    </ns0:p>
+    <ns0:p>
+      <ns0:r>
+        <ns0:t>建议诊断实验 · 尚未实测：固定数据和预算，比较参考锚点与预测锚点，加入相同历史的不同合法分支及无关干预；用独立状态检查器测奖励投机、事件完成与 Keep。</ns0:t>
+      </ns0:r>
+    </ns0:p>
+    <ns0:p>
+      <ns0:r>
+        <ns0:t>证据定位：v2 方法 Joint-GRPO 两阶段与算法；实验／奖励消融</ns0:t>
+      </ns0:r>
+    </ns0:p>
+    <ns0:p>
+      <ns0:r>
+        <ns0:t>原文：https://arxiv.org/html/2511.16669v2</ns0:t>
+      </ns0:r>
+    </ns0:p>
+    <ns0:p>
+      <ns0:r>
+        <ns0:t>State-Change Counterfactuals · AIGC-A 核心支撑</ns0:t>
+      </ns0:r>
+    </ns0:p>
+    <ns0:p>
+      <ns0:r>
+        <ns0:t>任务与输入：用动作前后状态及反事实假设训练程序视频表征，输出用于理解任务的表示，而非直接生成反事实 RGB 视频。</ns0:t>
+      </ns0:r>
+    </ns0:p>
+    <ns0:p>
+      <ns0:r>
+        <ns0:t>原文条件／算法设置：从带叙述的 Ego4D 视频构造状态与反事实文本，使用帧／片段／视频层次对比学习；文本编码器冻结，另有缺步／换序等视频负例。</ns0:t>
+      </ns0:r>
+    </ns0:p>
+    <ns0:p>
+      <ns0:r>
+        <ns0:t>成立前提 · 原文与本文分析分开标注：【本文分析】叙述需支持前后状态，负例需对该样本构成有效区别；“另一种可能发生的结果”与“不符合当前事实的结果”须分开，不能把合理替代未来当作普遍不可能。</ns0:t>
+      </ns0:r>
+    </ns0:p>
+    <ns0:p>
+      <ns0:r>
+        <ns0:t>原工作已经建立什么：状态监督改善程序相关理解／表征任务。附录进行人工与模型质量核查，支持其数据设计具有实用性。</ns0:t>
+      </ns0:r>
+    </ns0:p>
+    <ns0:p>
+      <ns0:r>
+        <ns0:t>原文局限／证据范围：【原文 Appendix A.4】反事实文本偶有低概率情形，需要权衡创造性与现实性。【任务范围】理解提升不直接建立生成收益或因果可识别性。</ns0:t>
+      </ns0:r>
+    </ns0:p>
+    <ns0:p>
+      <ns0:r>
+        <ns0:t>后续创新空间 · 不等于原论文缺陷：【后续研究建议】迁移为生成器状态监督或关系对齐是可测试贡献；需要与普通动作／动词监督、VideoREPA 类对齐比较，不能把文本负例本身作为全新做法。</ns0:t>
+      </ns0:r>
+    </ns0:p>
+    <ns0:p>
+      <ns0:r>
+        <ns0:t>建议诊断实验 · 尚未实测：对照真实状态标签、原始合成状态与普通动词负例，检查负例质量与生成器迁移；留出生成器／背景捷径，并测条件执行和后果泛化。</ns0:t>
+      </ns0:r>
+    </ns0:p>
+    <ns0:p>
+      <ns0:r>
+        <ns0:t>证据定位：v6 层次状态对比学习；程序理解实验；Appendix A.4 文本质量</ns0:t>
+      </ns0:r>
+    </ns0:p>
+    <ns0:p>
+      <ns0:r>
+        <ns0:t>原文：https://arxiv.org/html/2503.21055v6</ns0:t>
+      </ns0:r>
+    </ns0:p>
+    <ns0:p>
+      <ns0:r>
+        <ns0:t>What-If World · AIGC-A 核心支撑</ns0:t>
+      </ns0:r>
+    </ns0:p>
+    <ns0:p>
+      <ns0:r>
+        <ns0:t>任务与输入：以真实初始帧和最小物理条件变化的成对提示，评测生成视频是否共同满足干预、物理、环境和结果要求。</ns0:t>
+      </ns0:r>
+    </ns0:p>
+    <ns0:p>
+      <ns0:r>
+        <ns0:t>原文条件／算法设置：319 个配对任务来自 nuScenes／DROID，覆盖六类物理变量；APEO 评价含条件遵循、物理、环境与配对结果，模型评判经人工核查。</ns0:t>
+      </ns0:r>
+    </ns0:p>
+    <ns0:p>
+      <ns0:r>
+        <ns0:t>成立前提 · 原文与本文分析分开标注：【本文分析】提示差异须确实对应要检验的条件，评价器须看得见关键后果；同初始图和最小文字差异不自动消除隐藏状态歧义或生成随机差异。</ns0:t>
+      </ns0:r>
+    </ns0:p>
+    <ns0:p>
+      <ns0:r>
+        <ns0:t>原工作已经建立什么：提供成对干预诊断，揭示逐视频画质／合理性评价会遗漏的问题；其贡献是评测，未提出训练算法不是缺陷。</ns0:t>
+      </ns0:r>
+    </ns0:p>
+    <ns0:p>
+      <ns0:r>
+        <ns0:t>原文局限／证据范围：【原文讨论】基准分数与部署表现的关系仍需研究，失败分析是现象性诊断，不能定位模型架构／训练原因。【证据范围】不为每例提供唯一真实动力学轨迹。</ns0:t>
+      </ns0:r>
+    </ns0:p>
+    <ns0:p>
+      <ns0:r>
+        <ns0:t>后续创新空间 · 不等于原论文缺陷：【后续研究建议】结合状态可分叉的环境加入独立真值、无变化和无关干预对照；作为新生成算法的评测基线，而不是把它当同类生成器竞争。</ns0:t>
+      </ns0:r>
+    </ns0:p>
+    <ns0:p>
+      <ns0:r>
+        <ns0:t>建议诊断实验 · 尚未实测：分开报告单片质量与配对 Outcome、Keep；多 seed 重复并人工抽查关键事件，比较基准裁判与独立状态／轨迹真值的一致性。</ns0:t>
+      </ns0:r>
+    </ns0:p>
+    <ns0:p>
+      <ns0:r>
+        <ns0:t>证据定位：基准构造与 APEO；九模型评测；Discussion／Limitations</ns0:t>
+      </ns0:r>
+    </ns0:p>
+    <ns0:p>
+      <ns0:r>
+        <ns0:t>原文：https://arxiv.org/html/2605.27589v1</ns0:t>
+      </ns0:r>
+    </ns0:p>
+    <ns0:p>
+      <ns0:r>
+        <ns0:t>VQQA · 辅助反馈方法（H2 引用）</ns0:t>
+      </ns0:r>
+    </ns0:p>
+    <ns0:p>
+      <ns0:r>
+        <ns0:t>任务与输入：围绕意图和生成视频动态提问，由 QA 批评形成语义反馈，修订提示并重新生成；用于黑盒测试时质量优化。</ns0:t>
+      </ns0:r>
+    </ns0:p>
+    <ns0:p>
+      <ns0:r>
+        <ns0:t>原文条件／算法设置：需可重复调用生成器与 VLM 评判器；已有针对原始提示的 Global Selection 和动态停止，以控制语义漂移，不应描述为完全没有全局保持。</ns0:t>
+      </ns0:r>
+    </ns0:p>
+    <ns0:p>
+      <ns0:r>
+        <ns0:t>成立前提 · 原文与本文分析分开标注：【本文分析】反馈需可行动且在生成器能力范围内；文本批评不是可执行物理真值，也不保证每轮单调改善。</ns0:t>
+      </ns0:r>
+    </ns0:p>
+    <ns0:p>
+      <ns0:r>
+        <ns0:t>原工作已经建立什么：在多种生成器与视频评测任务上建立动态 QA—提示修订闭环；无需读取生成器梯度，也能发现单片中的时序和全局问题。</ns0:t>
+      </ns0:r>
+    </ns0:p>
+    <ns0:p>
+      <ns0:r>
+        <ns0:t>原文局限／证据范围：【原文 Appendix A】受评判幻觉、基础生成器能力和串行延迟限制。【任务范围】默认重新生成不等于局部视频修复，尚未专门验证同历史反事实与因果保持。</ns0:t>
+      </ns0:r>
+    </ns0:p>
+    <ns0:p>
+      <ns0:r>
+        <ns0:t>后续创新空间 · 不等于原论文缺陷：【后续研究建议】在已有原始意图选择和停止机制之上，新增可定位对象—事件—时间的约束反馈，验证局部修复能否少改坏；单称“动态评判反馈”不足以区别。</ns0:t>
+      </ns0:r>
+    </ns0:p>
+    <ns0:p>
+      <ns0:r>
+        <ns0:t>建议诊断实验 · 尚未实测：同总模型调用与时间预算比较 Best-of-N、原 VQQA 和局部修复；用独立状态检查器测已通过约束破坏、真实增益和停止决策。</ns0:t>
+      </ns0:r>
+    </ns0:p>
+    <ns0:p>
+      <ns0:r>
+        <ns0:t>证据定位：方法 QA／Semantic Gradients／Global Selection；实验；Appendix A</ns0:t>
+      </ns0:r>
+    </ns0:p>
+    <ns0:p>
+      <ns0:r>
+        <ns0:t>原文：https://arxiv.org/abs/2603.12310v1</ns0:t>
+      </ns0:r>
+    </ns0:p>
+    <ns0:p>
+      <ns0:r>
+        <ns0:t>AIGC 长期应用场景</ns0:t>
+      </ns0:r>
+    </ns0:p>
+    <ns0:p>
+      <ns0:r>
+        <ns0:t>每个场景列 1 篇已核实顶会主会论文与 1 篇本轮检索的最新相关 arXiv 候选，并补充方法上更贴近的论文。“最新”指此检索范围内的相关候选，不宣称穷尽；较新的通用方法与较早的领域专用方法分别标注。顶会记录取 CVF；arXiv 可同时存在已接收版本，不以 arXiv 入口推断审稿状态。</ns0:t>
+      </ns0:r>
+    </ns0:p>
+    <ns0:p>
+      <ns0:r>
+        <ns0:t>四个长期应用场景交叉映射 A–D，不增加新的 AIGC 方向。参考文献作为外部应用图谱，不增加本地 451 条计数。</ns0:t>
+      </ns0:r>
+    </ns0:p>
+    <ns0:p>
+      <ns0:r>
+        <ns0:t>【研究判断】A–D 可作为贯穿应用的研究轴，应用场景提供可测问题和真实工作流。A 连接事件／物理可控生成，B 连接持久记忆与纠错，C 连接叙事和观众信息控制，D 连接稀疏条件理解与主动获取；已有方法不空白，长期价值需由未解决的状态／知识／控制问题及可重复实验建立。</ns0:t>
+      </ns0:r>
+    </ns0:p>
+    <ns0:p>
+      <ns0:r>
+        <ns0:t>剧本杀／互动悬疑／分支叙事</ns0:t>
+      </ns0:r>
+    </ns0:p>
+    <ns0:p>
+      <ns0:r>
+        <ns0:t>A–D 对应：AIGC-A：玩家行动改变后果；AIGC-B：新线索纠正系统先前判断；AIGC-C：控制观众／角色的线索可见性；AIGC-D：只询问影响续篇的缺失设定</ns0:t>
+      </ns0:r>
+    </ns0:p>
+    <ns0:p>
+      <ns0:r>
+        <ns0:t>具体任务：玩家提前拿走钥匙，改变谁能开门；或只推迟展示钥匙特写，保持偷钥匙事件本身不变。前者属于 A，后者属于 C；若某角色因此没看见钥匙并改了行动，要联用 A。</ns0:t>
+      </ns0:r>
+    </ns0:p>
+    <ns0:p>
+      <ns0:r>
+        <ns0:t>长期价值：作者规则、隐藏事实和多角色知识可显式记录，能形成分支一致性、证据修订与视觉泄露的持续研究；价值在可验证叙事控制，而非一次性生成故事。</ns0:t>
+      </ns0:r>
+    </ns0:p>
+    <ns0:p>
+      <ns0:r>
+        <ns0:t>当前进展：事件完成评测已经成熟到可逐项诊断；近期工作已把源材料、视频历史与新意图编译为生成约束。完整多人隐藏信息和推理公平性仍不能据此视为已解决。</ns0:t>
+      </ns0:r>
+    </ns0:p>
+    <ns0:p>
+      <ns0:r>
+        <ns0:t>状态约定：分别维护世界事实 W、系统信念 B、每个角色知识 K_i、观众已见信息 O 及允许分支集合；叙事并非只有一个正确未来。</ns0:t>
+      </ns0:r>
+    </ns0:p>
+    <ns0:p>
+      <ns0:r>
+        <ns0:t>研究缺口／创新边界：【研究判断】在保持作者事实的情况下，哪些信息可以不展示？如何保证角色不会使用未获知线索，系统接受反证却不覆盖已发生事实？VIS-Ground 已覆盖上下文约束，不能只以“结构化故事状态＋验证器”声称创新。</ns0:t>
+      </ns0:r>
+    </ns0:p>
+    <ns0:p>
+      <ns0:r>
+        <ns0:t>第一组实验：作者先标注事实、角色可见性与合法续篇；交叉改变玩家动作／镜头揭示顺序／外来反证。比较直接提示、VIS-Ground 与分离知识状态控制，测非法知情、泄露时间、合法分支完成率和 Keep；再做玩家理解／公平性感受实验。</ns0:t>
+      </ns0:r>
+    </ns0:p>
+    <ns0:p>
+      <ns0:r>
+        <ns0:t>选题建议：【选题建议】最适合体现 B／C 区别，但须同时有程序化标签与玩家研究，避免只依赖 VLM 偏好分数。</ns0:t>
+      </ns0:r>
+    </ns0:p>
+    <ns0:p>
+      <ns0:r>
+        <ns0:t>短期：有限房间、角色与道具的可验证分支，先验证 A／C 的区别。</ns0:t>
+      </ns0:r>
+    </ns0:p>
+    <ns0:p>
+      <ns0:r>
+        <ns0:t>中期：外来反证与未渲染承诺的记忆修订，测试跨镜头／跨回合。</ns0:t>
+      </ns0:r>
+    </ns0:p>
+    <ns0:p>
+      <ns0:r>
+        <ns0:t>长期：多人私有视角、自适应线索和可解释冲突处理；以新剧情／规则留出检验泛化。</ns0:t>
+      </ns0:r>
+    </ns0:p>
+    <ns0:p>
+      <ns0:r>
+        <ns0:t>StoryEval · CVPR 2025 主会 · 2025-06</ns0:t>
+      </ns0:r>
+    </ns0:p>
+    <ns0:p>
+      <ns0:r>
+        <ns0:t>Is Your World Simulator a Good Story Presenter? A Consecutive Events-Based Benchmark for Future Long Video Generation</ns0:t>
+      </ns0:r>
+    </ns0:p>
+    <ns0:p>
+      <ns0:r>
+        <ns0:t>https://openaccess.thecvf.com/content/CVPR2025/papers/Wang_Is_Your_World_Simulator_a_Good_Story_Presenter_A_Consecutive_CVPR_2025_paper.pdf</ns0:t>
+      </ns0:r>
+    </ns0:p>
+    <ns0:p>
+      <ns0:r>
+        <ns0:t>已有进展：423 个提示、每个含 2–4 个连续事件，借 VLM 检查各事件完成情况；把叙事评价从单纯画质推进到事件是否真的发生。</ns0:t>
+      </ns0:r>
+    </ns0:p>
+    <ns0:p>
+      <ns0:r>
+        <ns0:t>边界：这是事件呈现基准，不是剧本杀系统；原结果针对当时测试模型，不能当作 2026 模型排名，也未直接测角色知识与线索公平性。</ns0:t>
+      </ns0:r>
+    </ns0:p>
+    <ns0:p>
+      <ns0:r>
+        <ns0:t>可借鉴：借事件逐项验证，增加先后约束、角色可知信息和观众泄露检查。</ns0:t>
+      </ns0:r>
+    </ns0:p>
+    <ns0:p>
+      <ns0:r>
+        <ns0:t>证据定位：CVF 正式论文；§3 基准构造、§4 实验</ns0:t>
+      </ns0:r>
+    </ns0:p>
+    <ns0:p>
+      <ns0:r>
+        <ns0:t>VIS-Ground · arXiv 预印本；未据此标记顶会接收 · 2026-10-07</ns0:t>
+      </ns0:r>
+    </ns0:p>
+    <ns0:p>
+      <ns0:r>
+        <ns0:t>VIS-Ground: Video Interactive Storytelling with Contextual Grounding</ns0:t>
+      </ns0:r>
+    </ns0:p>
+    <ns0:p>
+      <ns0:r>
+        <ns0:t>https://arxiv.org/html/2610.09326v1</ns0:t>
+      </ns0:r>
+    </ns0:p>
+    <ns0:p>
+      <ns0:r>
+        <ns0:t>已有进展：将故事／知识源、已生成前缀和新请求编译成状态、依赖和候选约束，再计划—验证—修订—渲染；三种视频骨干上的综合评价改善。</ns0:t>
+      </ns0:r>
+    </ns0:p>
+    <ns0:p>
+      <ns0:r>
+        <ns0:t>边界：原文把视频前缀视作先前指令的充分记录；依赖抽取及视觉执行仍会失败，源忠实与请求遵循可能冲突。并非每项指标最优，尚非多人隐藏信息剧本杀验证。</ns0:t>
+      </ns0:r>
+    </ns0:p>
+    <ns0:p>
+      <ns0:r>
+        <ns0:t>可借鉴：是 A–D 共享的直接近邻：结构化上下文与约束流程已有先例。可研究未渲染的承诺、私有知识、允许分支及冲突规则，而非只重做该流程。</ns0:t>
+      </ns0:r>
+    </ns0:p>
+    <ns0:p>
+      <ns0:r>
+        <ns0:t>证据定位：§2.2、§3、§4、§5.3；附录约束与修复</ns0:t>
+      </ns0:r>
+    </ns0:p>
+    <ns0:p>
+      <ns0:r>
+        <ns0:t>电影／真人短剧／多镜头制作</ns0:t>
+      </ns0:r>
+    </ns0:p>
+    <ns0:p>
+      <ns0:r>
+        <ns0:t>A–D 对应：AIGC-A：改事件后传播到相关镜头；AIGC-B：新素材或导演纠正触发记忆修订；AIGC-C：同一事实的悬念与揭示节奏；AIGC-D：最少分镜／参考镜头／关键帧</ns0:t>
+      </ns0:r>
+    </ns0:p>
+    <ns0:p>
+      <ns0:r>
+        <ns0:t>具体任务：把“杯子被打碎”改成“杯子被接住”，后续桌面碎片、人物反应和道具连续性要更新，未涉及的镜头保持；只改闪回位置则不应改事实时间。</ns0:t>
+      </ns0:r>
+    </ns0:p>
+    <ns0:p>
+      <ns0:r>
+        <ns0:t>长期价值：多次返工、跨镜头连续性和长剧集资产维护持续存在；可从状态接口、生成训练和制作效率三个层次累积成果。</ns0:t>
+      </ns0:r>
+    </ns0:p>
+    <ns0:p>
+      <ns0:r>
+        <ns0:t>当前进展：下一镜头记忆、历史条件压缩及网格联合生成已有模型级方法；长视频长度与一致性有进展，但展示完整镜头不等于修改事件后所有镜头正确响应。 2026-09-07 上线 arXiv 的 CineCrew（已接收 ECCV 2026）另将 FilmDSL 与 QA 修复纳入制作流程；故也列为较新的流程近邻。</ns0:t>
+      </ns0:r>
+    </ns0:p>
+    <ns0:p>
+      <ns0:r>
+        <ns0:t>状态约定：事件时间线与镜头展示时间线分离；角色／道具／场景资产有版本，修改请求标明目标与冻结项。</ns0:t>
+      </ns0:r>
+    </ns0:p>
+    <ns0:p>
+      <ns0:r>
+        <ns0:t>研究缺口／创新边界：【研究判断】可检验跨镜头修改的最小传播范围、版本失效与回滚，以及导演给少量条件时的执行。用外部工具链不能自动视为弱贡献，关键是可靠性与成本是否优于已有控制。</ns0:t>
+      </ns0:r>
+    </ns0:p>
+    <ns0:p>
+      <ns0:r>
+        <ns0:t>第一组实验：构建带道具状态记录的短剧及单事件编辑；对比逐镜头全重做、OneStory 记忆、MovieGrid 条件续写和选择性传播。测事件正确率、后续镜头漏改、冻结镜头误改、人工修订时间与调用成本。</ns0:t>
+      </ns0:r>
+    </ns0:p>
+    <ns0:p>
+      <ns0:r>
+        <ns0:t>选题建议：【选题建议】A／B 的强应用；算力有限可先做可复现编辑任务和控制接口，再决定是否训练长视频模型。</ns0:t>
+      </ns0:r>
+    </ns0:p>
+    <ns0:p>
+      <ns0:r>
+        <ns0:t>短期：单场景跨镜头道具状态与对话连续性。</ns0:t>
+      </ns0:r>
+    </ns0:p>
+    <ns0:p>
+      <ns0:r>
+        <ns0:t>中期：跨场景／跨集记忆纠错和事件编辑，联测 A／B。</ns0:t>
+      </ns0:r>
+    </ns0:p>
+    <ns0:p>
+      <ns0:r>
+        <ns0:t>长期：叙事事实与导演展示意图的联合可控生成，加入受众理解与制作工作流验证。</ns0:t>
+      </ns0:r>
+    </ns0:p>
+    <ns0:p>
+      <ns0:r>
+        <ns0:t>OneStory · CVPR 2026 主会 · 2026-06</ns0:t>
+      </ns0:r>
+    </ns0:p>
+    <ns0:p>
+      <ns0:r>
+        <ns0:t>OneStory: Coherent Multi-Shot Video Generation with Adaptive Memory</ns0:t>
+      </ns0:r>
+    </ns0:p>
+    <ns0:p>
+      <ns0:r>
+        <ns0:t>https://openaccess.thecvf.com/content/CVPR2026/html/An_OneStory_Coherent_Multi-Shot_Video_Generation_with_Adaptive_Memory_CVPR_2026_paper.html</ns0:t>
+      </ns0:r>
+    </ns0:p>
+    <ns0:p>
+      <ns0:r>
+        <ns0:t>已有进展：把多镜头生成建模为下一镜头预测，以历史帧选择和自适应压缩条件建立跨镜头记忆；在 60K 多镜头数据上训练并验证叙事一致性。</ns0:t>
+      </ns0:r>
+    </ns0:p>
+    <ns0:p>
+      <ns0:r>
+        <ns0:t>边界：历史记忆与视觉一致性已有方法证据；这不等于已处理外来反证、过时记忆撤销、角色知识变化或任意剧情因果改写。</ns0:t>
+      </ns0:r>
+    </ns0:p>
+    <ns0:p>
+      <ns0:r>
+        <ns0:t>可借鉴：B 的记忆检索／压缩基线，A 的跨镜头保持基线；引入新证据时应比较保留旧记忆、全部清空与选择性修订。</ns0:t>
+      </ns0:r>
+    </ns0:p>
+    <ns0:p>
+      <ns0:r>
+        <ns0:t>证据定位：CVF 正式接收记录与论文摘要／方法概述</ns0:t>
+      </ns0:r>
+    </ns0:p>
+    <ns0:p>
+      <ns0:r>
+        <ns0:t>MovieGrid · arXiv 预印本；未核实顶会接收 · 2026-09-06</ns0:t>
+      </ns0:r>
+    </ns0:p>
+    <ns0:p>
+      <ns0:r>
+        <ns0:t>Multi-Grid Post-Training for Long-Form Multi-Shot Video Generation</ns0:t>
+      </ns0:r>
+    </ns0:p>
+    <ns0:p>
+      <ns0:r>
+        <ns0:t>https://arxiv.org/html/2609.06373v1</ns0:t>
+      </ns0:r>
+    </ns0:p>
+    <ns0:p>
+      <ns0:r>
+        <ns0:t>已有进展：将时间有序片段排成空间网格联合生成，用干净片段条件、角色标记、网格编码和边界损失训练。测试含 89 个故事，其中 18 个为 anime；报告 1,616 帧多镜头生成，并分析镜头顺序召回。</ns0:t>
+      </ns0:r>
+    </ns0:p>
+    <ns0:p>
+      <ns0:r>
+        <ns0:t>边界：扩展到 64 格、6,464 帧时存在分辨率／质量折中；固定画布下单格降至 320×192。跨镜头相似度、镜头召回不等于事件因果或线索泄露正确；动漫只是测试子集。</ns0:t>
+      </ns0:r>
+    </ns0:p>
+    <ns0:p>
+      <ns0:r>
+        <ns0:t>可借鉴：电影与动漫短剧共用的近期长片段生成基线；测试状态改变能否传播到相关格／镜头而不改坏无关片段。</ns0:t>
+      </ns0:r>
+    </ns0:p>
+    <ns0:p>
+      <ns0:r>
+        <ns0:t>证据定位：§3–4；§5.1–5.4；Appendix A</ns0:t>
+      </ns0:r>
+    </ns0:p>
+    <ns0:p>
+      <ns0:r>
+        <ns0:t>CineCrew · ECCV 2026（arXiv 接收注记／作者官方仓库）；此处为补充近邻 · 2026-09-07</ns0:t>
+      </ns0:r>
+    </ns0:p>
+    <ns0:p>
+      <ns0:r>
+        <ns0:t>Better Call CineCrew: Consistent Ultra-Long Narrative-to-Film Generation</ns0:t>
+      </ns0:r>
+    </ns0:p>
+    <ns0:p>
+      <ns0:r>
+        <ns0:t>https://arxiv.org/abs/2609.07720</ns0:t>
+      </ns0:r>
+    </ns0:p>
+    <ns0:p>
+      <ns0:r>
+        <ns0:t>已有进展：FilmDSL 把镜头、资产、连续性与角色线索转成共享制作规范，协调规划、关键帧生成、视频生成、QA 与修复；TV 风格片段实验报告控制与一致性改善。</ns0:t>
+      </ns0:r>
+    </ns0:p>
+    <ns0:p>
+      <ns0:r>
+        <ns0:t>边界：不重训基础视频生成器，能力仍受其限制；制作级结构化控制不自动等于未知因果机制推断或观众知识保证。</ns0:t>
+      </ns0:r>
+    </ns0:p>
+    <ns0:p>
+      <ns0:r>
+        <ns0:t>可借鉴：电影方向必须比较的结构化制作流程；“剧本→约束→生成→检查”已有直接先例，增量需落实到选择性事件传播或纠错。</ns0:t>
+      </ns0:r>
+    </ns0:p>
+    <ns0:p>
+      <ns0:r>
+        <ns0:t>证据定位：arXiv 摘要与接收注记；作者官方仓库 https://github.com/Ironieser/CineCrew</ns0:t>
+      </ns0:r>
+    </ns0:p>
+    <ns0:p>
+      <ns0:r>
+        <ns0:t>动漫／动画短剧／连载内容</ns0:t>
+      </ns0:r>
+    </ns0:p>
+    <ns0:p>
+      <ns0:r>
+        <ns0:t>A–D 对应：AIGC-A：动作改写与风格约束下的选择性变化；AIGC-B：角色设定／道具记忆的版本修订；AIGC-C：伏笔、反应镜头与揭示时刻；AIGC-D：从草图／白模／少量关键帧获得控制</ns0:t>
+      </ns0:r>
+    </ns0:p>
+    <ns0:p>
+      <ns0:r>
+        <ns0:t>具体任务：保留角色设定与场景，让导演改变“闪避”后的动作衔接；夸张拉伸属于允许艺术变化，而饰品丢失、角色错位和该保留的道具消失属于错误。</ns0:t>
+      </ns0:r>
+    </ns0:p>
+    <ns0:p>
+      <ns0:r>
+        <ns0:t>长期价值：高频短剧、连载角色和稀疏制作资产形成反复可测的控制任务；长期重点是制作意图、视觉状态与艺术规则，而不只追求写实物理。</ns0:t>
+      </ns0:r>
+    </ns0:p>
+    <ns0:p>
+      <ns0:r>
+        <ns0:t>当前进展：已从插画运动控制推进到专业稀疏条件理解、生成器对齐与艺术偏好；2026-09 MovieGrid 的测试含动漫故事，但不是动漫专门系统。专业制作接口重点读 2026-05 CogOmniControl，艺术变形读 AniMatrix。</ns0:t>
+      </ns0:r>
+    </ns0:p>
+    <ns0:p>
+      <ns0:r>
+        <ns0:t>状态约定：角色设定表、道具状态、动作节拍与允许夸张分别编码；物理约束按场景／风格适用，导演控制具有优先级。</ns0:t>
+      </ns0:r>
+    </ns0:p>
+    <ns0:p>
+      <ns0:r>
+        <ns0:t>研究缺口／创新边界：【研究判断】需要区分有意变形和身份／状态错误，测最少控制何时不足以及主动补问的价值。草图控制、专业 VLM 和风格奖励已有先例，整合它们不是充分创新。</ns0:t>
+      </ns0:r>
+    </ns0:p>
+    <ns0:p>
+      <ns0:r>
+        <ns0:t>第一组实验：请动画师标注“必须保持／可夸张／需追问”，用同一脚本和角色表比较完整条件、稀疏条件、主动补问与随机补问；测艺术意图遵循、角色与道具保持、后果衔接、控制输入量和返工。</ns0:t>
+      </ns0:r>
+    </ns0:p>
+    <ns0:p>
+      <ns0:r>
+        <ns0:t>选题建议：【选题建议】D 与 A 的结合较具体；“更符合物理”未必是正确优化目标。</ns0:t>
+      </ns0:r>
+    </ns0:p>
+    <ns0:p>
+      <ns0:r>
+        <ns0:t>短期：固定角色的短片段，建立有意夸张与失真对照。</ns0:t>
+      </ns0:r>
+    </ns0:p>
+    <ns0:p>
+      <ns0:r>
+        <ns0:t>中期：跨镜头动作／道具变化与设定纠正，控制来自专业中间资产。</ns0:t>
+      </ns0:r>
+    </ns0:p>
+    <ns0:p>
+      <ns0:r>
+        <ns0:t>长期：跨集版本维护、个性化艺术规则及人机协作验证；留出风格和创作者测泛化。</ns0:t>
+      </ns0:r>
+    </ns0:p>
+    <ns0:p>
+      <ns0:r>
+        <ns0:t>PhysAnimator · CVPR 2025 主会 · 2025-06</ns0:t>
+      </ns0:r>
+    </ns0:p>
+    <ns0:p>
+      <ns0:r>
+        <ns0:t>PhysAnimator: Physics-Guided Generative Cartoon Animation</ns0:t>
+      </ns0:r>
+    </ns0:p>
+    <ns0:p>
+      <ns0:r>
+        <ns0:t>https://openaccess.thecvf.com/content/CVPR2025/html/Xie_PhysAnimator_Physics-Guided_Generative_Cartoon_Animation_CVPR_2025_paper.html</ns0:t>
+      </ns0:r>
+    </ns0:p>
+    <ns0:p>
+      <ns0:r>
+        <ns0:t>已有进展：从插画提取网格，利用图像空间可变形体模拟、能量笔触和绑定点生成运动，再以草图引导扩散生成动画，连接物理指导与艺术控制。</ns0:t>
+      </ns0:r>
+    </ns0:p>
+    <ns0:p>
+      <ns0:r>
+        <ns0:t>边界：建立插画动画化／运动控制的证据；并非整季剧情编排、角色设定维护或跨集因果修改的验证。</ns0:t>
+      </ns0:r>
+    </ns0:p>
+    <ns0:p>
+      <ns0:r>
+        <ns0:t>可借鉴：把控制保留在结构／运动层，再让外观生成器实现；将导演要求的夸张运动纳入允许变化，不能一律用真实物理惩罚。</ns0:t>
+      </ns0:r>
+    </ns0:p>
+    <ns0:p>
+      <ns0:r>
+        <ns0:t>证据定位：CVF 正式接收记录与论文摘要／方法概述</ns0:t>
+      </ns0:r>
+    </ns0:p>
+    <ns0:p>
+      <ns0:r>
+        <ns0:t>MovieGrid · arXiv 预印本；未核实顶会接收 · 2026-09-06</ns0:t>
+      </ns0:r>
+    </ns0:p>
+    <ns0:p>
+      <ns0:r>
+        <ns0:t>Multi-Grid Post-Training for Long-Form Multi-Shot Video Generation</ns0:t>
+      </ns0:r>
+    </ns0:p>
+    <ns0:p>
+      <ns0:r>
+        <ns0:t>https://arxiv.org/html/2609.06373v1</ns0:t>
+      </ns0:r>
+    </ns0:p>
+    <ns0:p>
+      <ns0:r>
+        <ns0:t>已有进展：将时间有序片段排成空间网格联合生成，用干净片段条件、角色标记、网格编码和边界损失训练。测试含 89 个故事，其中 18 个为 anime；报告 1,616 帧多镜头生成，并分析镜头顺序召回。</ns0:t>
+      </ns0:r>
+    </ns0:p>
+    <ns0:p>
+      <ns0:r>
+        <ns0:t>边界：扩展到 64 格、6,464 帧时存在分辨率／质量折中；固定画布下单格降至 320×192。跨镜头相似度、镜头召回不等于事件因果或线索泄露正确；动漫只是测试子集。</ns0:t>
+      </ns0:r>
+    </ns0:p>
+    <ns0:p>
+      <ns0:r>
+        <ns0:t>可借鉴：电影与动漫短剧共用的近期长片段生成基线；测试状态改变能否传播到相关格／镜头而不改坏无关片段。</ns0:t>
+      </ns0:r>
+    </ns0:p>
+    <ns0:p>
+      <ns0:r>
+        <ns0:t>证据定位：§3–4；§5.1–5.4；Appendix A</ns0:t>
+      </ns0:r>
+    </ns0:p>
+    <ns0:p>
+      <ns0:r>
+        <ns0:t>CogOmniControl · arXiv 预印本；未核实顶会接收 · 2026-05-19</ns0:t>
+      </ns0:r>
+    </ns0:p>
+    <ns0:p>
+      <ns0:r>
+        <ns0:t>CogOmniControl: Reasoning-Driven Controllable Video Generation via Creative Intent Cognition</ns0:t>
+      </ns0:r>
+    </ns0:p>
+    <ns0:p>
+      <ns0:r>
+        <ns0:t>https://arxiv.org/html/2605.19995v1</ns0:t>
+      </ns0:r>
+    </ns0:p>
+    <ns0:p>
+      <ns0:r>
+        <ns0:t>已有进展：用专业动漫制作数据训练 CogVLM，理解草图／白模等稀疏控制的创作意图；CogOmniDiT 联合视觉条件与语义特征，再用强化微调对齐。自建两类基准与消融验证，并可用 Best-of-N。</ns0:t>
+      </ns0:r>
+    </ns0:p>
+    <ns0:p>
+      <ns0:r>
+        <ns0:t>边界：依赖专业数据与意图／生成评价，稀疏输入的含义不是天然唯一；本轮核对的消融不证明主动追问或跨集状态修订已经解决。Best-of-N 要计入额外调用。</ns0:t>
+      </ns0:r>
+    </ns0:p>
+    <ns0:p>
+      <ns0:r>
+        <ns0:t>可借鉴：D 的直接技术近邻：稀疏控制理解＋内部对齐已有实现。增量可测何时需要补问、何种最少控制有效，以及冲突意图与艺术规则如何校准。</ns0:t>
+      </ns0:r>
+    </ns0:p>
+    <ns0:p>
+      <ns0:r>
+        <ns0:t>证据定位：§3–4 方法；§5.1–5.4 训练、评价与消融</ns0:t>
+      </ns0:r>
+    </ns0:p>
+    <ns0:p>
+      <ns0:r>
+        <ns0:t>AniMatrix · arXiv 技术报告；未核实顶会接收 · 2026-05-05</ns0:t>
+      </ns0:r>
+    </ns0:p>
+    <ns0:p>
+      <ns0:r>
+        <ns0:t>AniMatrix: An Anime Video Generation Model that Thinks in Art, Not Physics</ns0:t>
+      </ns0:r>
+    </ns0:p>
+    <ns0:p>
+      <ns0:r>
+        <ns0:t>https://arxiv.org/html/2605.03652v1</ns0:t>
+      </ns0:r>
+    </ns0:p>
+    <ns0:p>
+      <ns0:r>
+        <ns0:t>已有进展：以风格、运动、镜头、特效分类和双路条件控制动漫生成，结合课程训练及变形偏好优化；专业动画师评价支持艺术运动和提示理解收益。</ns0:t>
+      </ns0:r>
+    </ns0:p>
+    <ns0:p>
+      <ns0:r>
+        <ns0:t>边界：艺术正确性依赖制作约定与评价覆盖；有意变形不能等同于失败。报告中的专业评价不直接证明长期剧情约束或多人角色知识控制。</ns0:t>
+      </ns0:r>
+    </ns0:p>
+    <ns0:p>
+      <ns0:r>
+        <ns0:t>可借鉴：构造“有意夸张／不允许的形变”标签及分离奖励，是把 A 的状态保持迁移到动漫时的重要原则参考。</ns0:t>
+      </ns0:r>
+    </ns0:p>
+    <ns0:p>
+      <ns0:r>
+        <ns0:t>证据定位：制作知识系统、条件注入、课程训练及专业评价</ns0:t>
+      </ns0:r>
+    </ns0:p>
+    <ns0:p>
+      <ns0:r>
+        <ns0:t>游戏／可交互世界／规则编辑</ns0:t>
+      </ns0:r>
+    </ns0:p>
+    <ns0:p>
+      <ns0:r>
+        <ns0:t>A–D 对应：AIGC-A：动作、动力学与系统规则干预；AIGC-B：回访或新观察后的状态纠错；AIGC-C：玩家视角、迷雾与隐藏信息；AIGC-D：主动观察和低延迟控制</ns0:t>
+      </ns0:r>
+    </ns0:p>
+    <ns0:p>
+      <ns0:r>
+        <ns0:t>具体任务：改变开门规则或移除桥墩后，角色通行和下游事件应更新；未受影响的背包、任务进度和地图保持。回到旧场景时，纠正错误记忆而非凭空重置世界。</ns0:t>
+      </ns0:r>
+    </ns0:p>
+    <ns0:p>
+      <ns0:r>
+        <ns0:t>长期价值：引擎可分叉、规则可执行、状态可检查，适合连续研究干预深度、长期保持和在线交互；同时能把画面真实与规则正确分开。</ns0:t>
+      </ns0:r>
+    </ns0:p>
+    <ns0:p>
+      <ns0:r>
+        <ns0:t>当前进展：交互视频世界已支持导航和文本事件；最新规则编辑研究在可执行商业游戏上量化行为与保持。二者仍是不同技术栈：改对代码不保证生成视频对，视频流畅也不保证规则对。</ns0:t>
+      </ns0:r>
+    </ns0:p>
+    <ns0:p>
+      <ns0:r>
+        <ns0:t>状态约定：引擎状态／规则提供真值，生成视频是观察层；玩家可见状态与隐藏世界状态分离。生成式探索视频与可执行游戏应分别标注。</ns0:t>
+      </ns0:r>
+    </ns0:p>
+    <ns0:p>
+      <ns0:r>
+        <ns0:t>研究缺口／创新边界：【研究判断】将可执行干预真值接入视频模型，测新规则组合、长程后果与回访纠错；需同时报告环境编辑和视频执行，不能把工具可执行性当成整套系统成功。</ns0:t>
+      </ns0:r>
+    </ns0:p>
+    <ns0:p>
+      <ns0:r>
+        <ns0:t>第一组实验：从引擎同一存档分叉，按属性／实体／动力学／系统分层干预；比较真值状态驱动与视频自主推断。测状态／行为测试通过率、Keep 回归、视觉一致性和端到端延迟，附回访与长时程测试。</ns0:t>
+      </ns0:r>
+    </ns0:p>
+    <ns0:p>
+      <ns0:r>
+        <ns0:t>选题建议：【选题建议】A 的因果评测最容易落地；实时开放世界成本高，可先做离线规则分支与短视频。</ns0:t>
+      </ns0:r>
+    </ns0:p>
+    <ns0:p>
+      <ns0:r>
+        <ns0:t>短期：可分叉小型关卡，用引擎真值验证 A 的执行。</ns0:t>
+      </ns0:r>
+    </ns0:p>
+    <ns0:p>
+      <ns0:r>
+        <ns0:t>中期：多步规则组合、状态记忆修订与实时控制。</ns0:t>
+      </ns0:r>
+    </ns0:p>
+    <ns0:p>
+      <ns0:r>
+        <ns0:t>长期：跨游戏／跨引擎迁移，统一规则编辑、视频反馈与玩家策略，保持独立验证器。</ns0:t>
+      </ns0:r>
+    </ns0:p>
+    <ns0:p>
+      <ns0:r>
+        <ns0:t>Yume1.5 · CVPR 2026 主会 · 2026-06</ns0:t>
+      </ns0:r>
+    </ns0:p>
+    <ns0:p>
+      <ns0:r>
+        <ns0:t>Yume1.5: A Text-Controlled Interactive World Generation Model</ns0:t>
+      </ns0:r>
+    </ns0:p>
+    <ns0:p>
+      <ns0:r>
+        <ns0:t>https://openaccess.thecvf.com/content/CVPR2026/html/Mao_Yume1.5_A_Text-Controlled_Interactive_World_Generation_Model_CVPR_2026_paper.html</ns0:t>
+      </ns0:r>
+    </ns0:p>
+    <ns0:p>
+      <ns0:r>
+        <ns0:t>已有进展：从图像或文本生成可键盘探索的持续视频世界，并支持文本控制事件；采用上下文压缩、线性注意力和蒸馏，报告单 A100、540p 平均 12 fps。</ns0:t>
+      </ns0:r>
+    </ns0:p>
+    <ns0:p>
+      <ns0:r>
+        <ns0:t>边界：这是视觉交互世界，流畅响应不等于可执行游戏规则、完整碰撞／物品逻辑或长程因果正确；速度绑定原文硬件和设置。</ns0:t>
+      </ns0:r>
+    </ns0:p>
+    <ns0:p>
+      <ns0:r>
+        <ns0:t>可借鉴：A 的在线事件干预、B 的持续状态和 D 的控制成本基线；测试回访、背包／门锁状态、延迟后果和响应时延。</ns0:t>
+      </ns0:r>
+    </ns0:p>
+    <ns0:p>
+      <ns0:r>
+        <ns0:t>证据定位：CVF 正式接收记录；摘要／三组件方法</ns0:t>
+      </ns0:r>
+    </ns0:p>
+    <ns0:p>
+      <ns0:r>
+        <ns0:t>World Editing · arXiv 预印本；未核实顶会接收 · 2026-10-01</ns0:t>
+      </ns0:r>
+    </ns0:p>
+    <ns0:p>
+      <ns0:r>
+        <ns0:t>World Editing: Intervening on Executable Worlds at Increasing Depth</ns0:t>
+      </ns0:r>
+    </ns0:p>
+    <ns0:p>
+      <ns0:r>
+        <ns0:t>https://arxiv.org/html/2610.02331v1</ns0:t>
+      </ns0:r>
+    </ns0:p>
+    <ns0:p>
+      <ns0:r>
+        <ns0:t>已有进展：IGMWorld／IGMBench 在 Minecraft、Terraria 的 110 个 mod 任务上检查属性、实体、动力学与系统干预及保持；最佳配置严格任务通过率 78.2%，视觉联合通过率各配置均低于 50%。</ns0:t>
+      </ns0:r>
+    </ns0:p>
+    <ns0:p>
+      <ns0:r>
+        <ns0:t>边界：修改的是可执行代码与资产，不是视频扩散模型；构建成功仍可能行为错误。结果受两款游戏、工具链与任务验证器覆盖限制，不能直接迁移为视频生成成功率。</ns0:t>
+      </ns0:r>
+    </ns0:p>
+    <ns0:p>
+      <ns0:r>
+        <ns0:t>可借鉴：是 A 的 Δ／Keep 可执行真值来源与干预深度基线；把环境分支状态导出为视频条件，再分开测规则修改和视觉执行。</ns0:t>
+      </ns0:r>
+    </ns0:p>
+    <ns0:p>
+      <ns0:r>
+        <ns0:t>证据定位：§2–4；§3.1 评估；Appendix E 确定性状态／行为检查</ns0:t>
+      </ns0:r>
+    </ns0:p>
+    <ns0:p>
+      <ns0:r>
+        <ns0:t>Alaya-EVOKE · arXiv 预印本；作者项目另有更新 · 2026-08-13</ns0:t>
+      </ns0:r>
+    </ns0:p>
+    <ns0:p>
+      <ns0:r>
+        <ns0:t>Alaya-EVOKE: From Linear-Scaling Supervision to Endless World</ns0:t>
+      </ns0:r>
+    </ns0:p>
+    <ns0:p>
+      <ns0:r>
+        <ns0:t>https://arxiv.org/abs/2608.13546</ns0:t>
+      </ns0:r>
+    </ns0:p>
+    <ns0:p>
+      <ns0:r>
+        <ns0:t>已有进展：相机索引的外部世界状态库按视角检索，长程教师与三步蒸馏支持持续生成和分段事件条件；论文报告单 H200、384×640 每 1.5 秒视频块需 2.11 秒。</ns0:t>
+      </ns0:r>
+    </ns0:p>
+    <ns0:p>
+      <ns0:r>
+        <ns0:t>边界：持续演示和 WBench 表现不构成任意时长的正确性保证；单卡论文设置不能直接称实时。外部记忆保存也不自动解决错误记忆撤销。</ns0:t>
+      </ns0:r>
+    </ns0:p>
+    <ns0:p>
+      <ns0:r>
+        <ns0:t>可借鉴：B 比较“持久保存”与“证据驱动修订”；A 测在线事件后的状态传播。项目版本与硬件速度须分开记录。</ns0:t>
+      </ns0:r>
+    </ns0:p>
+    <ns0:p>
+      <ns0:r>
+        <ns0:t>证据定位：arXiv 摘要；作者项目 https://evoke-world.github.io/Evoke/</ns0:t>
       </ns0:r>
     </ns0:p>
     <ns0:sectPr>

</xml_diff>

<commit_message>
Deploying to gh-pages from @ SoniaSuns/soniasuns.github.io@c7813bc1616727a2bf0bb252616218bb4f80f4e0 🚀
</commit_message>
<xml_diff>
--- a/topics/downloads/aigc-directions.docx
+++ b/topics/downloads/aigc-directions.docx
@@ -23,7 +23,7 @@
         <ns0:pStyle ns0:val="Normal"/>
       </ns0:pPr>
       <ns0:r>
-        <ns0:t xml:space="preserve">文献核对：2026-10-13</ns0:t>
+        <ns0:t xml:space="preserve">文献核对：AIGC-A 与应用图谱更新至 2026-10-14；其它方向保留逐条原核对日期。</ns0:t>
       </ns0:r>
     </ns0:p>
     <ns0:p>
@@ -207,39 +207,39 @@
         <ns0:pStyle ns0:val="Normal"/>
       </ns0:pPr>
       <ns0:r>
-        <ns0:t xml:space="preserve">论文已有证据：VOID 用成对仿真数据和 quadmask 实现对象及交互删除，另有 VLM 影响范围推理流程。</ns0:t>
-      </ns0:r>
-    </ns0:p>
-    <ns0:p>
-      <ns0:pPr>
-        <ns0:pStyle ns0:val="Normal"/>
-      </ns0:pPr>
-      <ns0:r>
-        <ns0:t xml:space="preserve">对该方向的支撑：比较影响范围自动推断与已知范围下的执行；四类区域提供具体控制接口。</ns0:t>
-      </ns0:r>
-    </ns0:p>
-    <ns0:p>
-      <ns0:pPr>
-        <ns0:pStyle ns0:val="Normal"/>
-      </ns0:pPr>
-      <ns0:r>
-        <ns0:t xml:space="preserve">尚未建立的证据：原操作以删除为主；“我们自动推断 mask”不能单独区分已有流程。</ns0:t>
-      </ns0:r>
-    </ns0:p>
-    <ns0:p>
-      <ns0:pPr>
-        <ns0:pStyle ns0:val="Normal"/>
-      </ns0:pPr>
-      <ns0:r>
-        <ns0:t xml:space="preserve">证据定位：PDF p.1 已有因果编辑 / downstream physical interactions；PDF p.10 原文局限 / unusual angle</ns0:t>
-      </ns0:r>
-    </ns0:p>
-    <ns0:p>
-      <ns0:pPr>
-        <ns0:pStyle ns0:val="Normal"/>
-      </ns0:pPr>
-      <ns0:r>
-        <ns0:t xml:space="preserve">核对状态：沿用原速览已有逐页证据；本轮重组支撑关系，未重新全文核验全部结论</ns0:t>
+        <ns0:t xml:space="preserve">论文已有证据：对象删除及下游交互重生成已有实验证据；成对数据、quadmask 与生成器共同承担任务，不能把效果全部归因于 VLM 解出了精确动力学。</ns0:t>
+      </ns0:r>
+    </ns0:p>
+    <ns0:p>
+      <ns0:pPr>
+        <ns0:pStyle ns0:val="Normal"/>
+      </ns0:pPr>
+      <ns0:r>
+        <ns0:t xml:space="preserve">对该方向的支撑：同骨干比较真值／预测范围与真值状态条件，分别测范围漏检、直接／延迟后果、Keep 误改和机制组合留出；完整源片与仅前缀输入分开报告。</ns0:t>
+      </ns0:r>
+    </ns0:p>
+    <ns0:p>
+      <ns0:pPr>
+        <ns0:pStyle ns0:val="Normal"/>
+      </ns0:pPr>
+      <ns0:r>
+        <ns0:t xml:space="preserve">尚未建立的证据：【原文局限】短时长、特殊视角和模拟到真实的域差仍有失败。【证据范围】主要验证删除，尚未覆盖任意动作替换、未知机制和长链组合；这不否定删除任务贡献。</ns0:t>
+      </ns0:r>
+    </ns0:p>
+    <ns0:p>
+      <ns0:pPr>
+        <ns0:pStyle ns0:val="Normal"/>
+      </ns0:pPr>
+      <ns0:r>
+        <ns0:t xml:space="preserve">证据定位：§3 方法与配对数据；§4 实验；局限与真实视频失败案例</ns0:t>
+      </ns0:r>
+    </ns0:p>
+    <ns0:p>
+      <ns0:pPr>
+        <ns0:pStyle ns0:val="Normal"/>
+      </ns0:pPr>
+      <ns0:r>
+        <ns0:t xml:space="preserve">核对状态：公开原文方法、实验与边界复核；未独立复现。分析前提与未来建议不冒充原文定理。 核对：2026-10-14</ns0:t>
       </ns0:r>
     </ns0:p>
     <ns0:p>
@@ -277,39 +277,39 @@
         <ns0:pStyle ns0:val="Normal"/>
       </ns0:pPr>
       <ns0:r>
-        <ns0:t xml:space="preserve">论文已有证据：VideoPhysEdit 重建刚体场景，施加物理编辑，再用模拟轨迹引导生成，并提出成对物理 benchmark。</ns0:t>
-      </ns0:r>
-    </ns0:p>
-    <ns0:p>
-      <ns0:pPr>
-        <ns0:pStyle ns0:val="Normal"/>
-      </ns0:pPr>
-      <ns0:r>
-        <ns0:t xml:space="preserve">对该方向的支撑：用源片、编辑与执行帧的协议和物理轨迹指标作为强基线。</ns0:t>
-      </ns0:r>
-    </ns0:p>
-    <ns0:p>
-      <ns0:pPr>
-        <ns0:pStyle ns0:val="Normal"/>
-      </ns0:pPr>
-      <ns0:r>
-        <ns0:t xml:space="preserve">尚未建立的证据：刚体范围和场景重建条件有限；不能据此视为任意社会／剧情干预已解决。</ns0:t>
-      </ns0:r>
-    </ns0:p>
-    <ns0:p>
-      <ns0:pPr>
-        <ns0:pStyle ns0:val="Normal"/>
-      </ns0:pPr>
-      <ns0:r>
-        <ns0:t xml:space="preserve">证据定位：Abstract；官方 PCVE-RigidBench</ns0:t>
-      </ns0:r>
-    </ns0:p>
-    <ns0:p>
-      <ns0:pPr>
-        <ns0:pStyle ns0:val="Normal"/>
-      </ns0:pPr>
-      <ns0:r>
-        <ns0:t xml:space="preserve">核对状态：2026-09-28 预印本；本次核对摘要与官方 benchmark，未独立复现实验；核对 2026-10-13</ns0:t>
+        <ns0:t xml:space="preserve">论文已有证据：20 个合成刚体场景的 129 个编辑任务有配对仿真真值；另有真实视频定性展示。训练自由的反演—模拟—生成流程建立了可执行物理编辑证据。</ns0:t>
+      </ns0:r>
+    </ns0:p>
+    <ns0:p>
+      <ns0:pPr>
+        <ns0:pStyle ns0:val="Normal"/>
+      </ns0:pPr>
+      <ns0:r>
+        <ns0:t xml:space="preserve">对该方向的支撑：交叉比较真值与估计状态、同一生成器的真值与估计轨迹；构造原运动近似相同而干预后果不同的参数组，检查不确定性而非只看源片拟合。</ns0:t>
+      </ns0:r>
+    </ns0:p>
+    <ns0:p>
+      <ns0:pPr>
+        <ns0:pStyle ns0:val="Normal"/>
+      </ns0:pPr>
+      <ns0:r>
+        <ns0:t xml:space="preserve">尚未建立的证据：【原文局限】移动相机、复杂几何、关节体与受控的人／机器人不在当前建模范围；固定阈值可能随尺度／观测变化。【证据范围】真实视频展示不等于配对物理真值验证。</ns0:t>
+      </ns0:r>
+    </ns0:p>
+    <ns0:p>
+      <ns0:pPr>
+        <ns0:pStyle ns0:val="Normal"/>
+      </ns0:pPr>
+      <ns0:r>
+        <ns0:t xml:space="preserve">证据定位：§3.1–3.4；§4–5；Appendix C.2、D</ns0:t>
+      </ns0:r>
+    </ns0:p>
+    <ns0:p>
+      <ns0:pPr>
+        <ns0:pStyle ns0:val="Normal"/>
+      </ns0:pPr>
+      <ns0:r>
+        <ns0:t xml:space="preserve">核对状态：公开原文方法、实验与边界复核；未独立复现。分析前提与未来建议不冒充原文定理。 核对：2026-10-14</ns0:t>
       </ns0:r>
     </ns0:p>
     <ns0:p>
@@ -347,39 +347,39 @@
         <ns0:pStyle ns0:val="Normal"/>
       </ns0:pPr>
       <ns0:r>
-        <ns0:t xml:space="preserve">论文已有证据：CWMDT 用对象关系描述和 LLM 推理干预后的演化，再条件化视频扩散。</ns0:t>
-      </ns0:r>
-    </ns0:p>
-    <ns0:p>
-      <ns0:pPr>
-        <ns0:pStyle ns0:val="Normal"/>
-      </ns0:pPr>
-      <ns0:r>
-        <ns0:t xml:space="preserve">对该方向的支撑：比较结构化状态条件与直接提示，定位推理与执行各自的误差。</ns0:t>
-      </ns0:r>
-    </ns0:p>
-    <ns0:p>
-      <ns0:pPr>
-        <ns0:pStyle ns0:val="Normal"/>
-      </ns0:pPr>
-      <ns0:r>
-        <ns0:t xml:space="preserve">尚未建立的证据：数字孪生描述不等于已验证的物理仿真；图加 LLM 不是足够的新贡献。</ns0:t>
-      </ns0:r>
-    </ns0:p>
-    <ns0:p>
-      <ns0:pPr>
-        <ns0:pStyle ns0:val="Normal"/>
-      </ns0:pPr>
-      <ns0:r>
-        <ns0:t xml:space="preserve">证据定位：PDF §3–4 pp.3–8；附录A表4 p.10。</ns0:t>
-      </ns0:r>
-    </ns0:p>
-    <ns0:p>
-      <ns0:pPr>
-        <ns0:pStyle ns0:val="Normal"/>
-      </ns0:pPr>
-      <ns0:r>
-        <ns0:t xml:space="preserve">核对状态：本轮重新分类；摘要、方法及边界沿用既有笔记，附本地原文供复核</ns0:t>
+        <ns0:t xml:space="preserve">论文已有证据：在视频编辑／反事实基准上报告视觉和语义收益，展示显式表示—LLM 干预推理—扩散生成的可编辑接口。</ns0:t>
+      </ns0:r>
+    </ns0:p>
+    <ns0:p>
+      <ns0:pPr>
+        <ns0:pStyle ns0:val="Normal"/>
+      </ns0:pPr>
+      <ns0:r>
+        <ns0:t xml:space="preserve">对该方向的支撑：真值对象状态／预测状态、真值后果／LLM 后果分层替换；同时评价状态误差、生成遵循、可接受未来覆盖及 Keep，避免只测文本相似度。</ns0:t>
+      </ns0:r>
+    </ns0:p>
+    <ns0:p>
+      <ns0:pPr>
+        <ns0:pStyle ns0:val="Normal"/>
+      </ns0:pPr>
+      <ns0:r>
+        <ns0:t xml:space="preserve">尚未建立的证据：【证据范围】结构化“数字孪生”不是经物理识别验证的模拟器；CLIP、检测器和 VLM 评价及小型 CausalVQA debug 结果，不能独立证明真实因果效应识别。</ns0:t>
+      </ns0:r>
+    </ns0:p>
+    <ns0:p>
+      <ns0:pPr>
+        <ns0:pStyle ns0:val="Normal"/>
+      </ns0:pPr>
+      <ns0:r>
+        <ns0:t xml:space="preserve">证据定位：§3 三阶段框架；§4 编辑实验；Appendix A CausalVQA debug</ns0:t>
+      </ns0:r>
+    </ns0:p>
+    <ns0:p>
+      <ns0:pPr>
+        <ns0:pStyle ns0:val="Normal"/>
+      </ns0:pPr>
+      <ns0:r>
+        <ns0:t xml:space="preserve">核对状态：公开原文方法、实验与边界复核；未独立复现。分析前提与未来建议不冒充原文定理。 核对：2026-10-14</ns0:t>
       </ns0:r>
     </ns0:p>
     <ns0:p>
@@ -409,47 +409,47 @@
         <ns0:pStyle ns0:val="Normal"/>
       </ns0:pPr>
       <ns0:r>
-        <ns0:t xml:space="preserve">公开补充文献 · 直接概念近邻／尚无实验</ns0:t>
-      </ns0:r>
-    </ns0:p>
-    <ns0:p>
-      <ns0:pPr>
-        <ns0:pStyle ns0:val="Normal"/>
-      </ns0:pPr>
-      <ns0:r>
-        <ns0:t xml:space="preserve">论文已有证据：Twin Rollouts 提出同前缀、共享未来噪声的反事实分支，以及依赖模拟器真值的局部性和结果奖励。</ns0:t>
-      </ns0:r>
-    </ns0:p>
-    <ns0:p>
-      <ns0:pPr>
-        <ns0:pStyle ns0:val="Normal"/>
-      </ns0:pPr>
-      <ns0:r>
-        <ns0:t xml:space="preserve">对该方向的支撑：借用控制随机差异的成对协议；把奖励假设与实际算法验证分开。</ns0:t>
-      </ns0:r>
-    </ns0:p>
-    <ns0:p>
-      <ns0:pPr>
-        <ns0:pStyle ns0:val="Normal"/>
-      </ns0:pPr>
-      <ns0:r>
-        <ns0:t xml:space="preserve">尚未建立的证据：v1 明示实验尚待完成；模型内噪声已知不保证世界后果正确，也未实证解决时空 credit assignment。</ns0:t>
-      </ns0:r>
-    </ns0:p>
-    <ns0:p>
-      <ns0:pPr>
-        <ns0:pStyle ns0:val="Normal"/>
-      </ns0:pPr>
-      <ns0:r>
-        <ns0:t xml:space="preserve">证据定位：Abstract; §2 formal framework; §5 limitations</ns0:t>
-      </ns0:r>
-    </ns0:p>
-    <ns0:p>
-      <ns0:pPr>
-        <ns0:pStyle ns0:val="Normal"/>
-      </ns0:pPr>
-      <ns0:r>
-        <ns0:t xml:space="preserve">核对状态：2026-08-10 v1；框架提案，原文明示实验尚待完成；核对 2026-10-13</ns0:t>
+        <ns0:t xml:space="preserve">公开补充文献 · 形式化框架／小环境示意，规模实验待完成</ns0:t>
+      </ns0:r>
+    </ns0:p>
+    <ns0:p>
+      <ns0:pPr>
+        <ns0:pStyle ns0:val="Normal"/>
+      </ns0:pPr>
+      <ns0:r>
+        <ns0:t xml:space="preserve">论文已有证据：当前 v1 提出形式化协议和确定性小网格环境示意，明确规模实验尚待完成；应视为概念／评价设计先例，而非已验证性能领先的方法。</ns0:t>
+      </ns0:r>
+    </ns0:p>
+    <ns0:p>
+      <ns0:pPr>
+        <ns0:pStyle ns0:val="Normal"/>
+      </ns0:pPr>
+      <ns0:r>
+        <ns0:t xml:space="preserve">对该方向的支撑：同训练量比较共享／独立噪声、全局／局部奖励、真值／估计 D；单列相机变化和空 Keep，检查结果正确性与局部性是否独立改善。</ns0:t>
+      </ns0:r>
+    </ns0:p>
+    <ns0:p>
+      <ns0:pPr>
+        <ns0:pStyle ns0:val="Normal"/>
+      </ns0:pPr>
+      <ns0:r>
+        <ns0:t xml:space="preserve">尚未建立的证据：【证据状态】缺少规模训练和真实视频实验；依赖可分叉模拟器及 D 的可操作定义。像素差也可能混有渲染变化，不自动等价于语义因果影响。</ns0:t>
+      </ns0:r>
+    </ns0:p>
+    <ns0:p>
+      <ns0:pPr>
+        <ns0:pStyle ns0:val="Normal"/>
+      </ns0:pPr>
+      <ns0:r>
+        <ns0:t xml:space="preserve">证据定位：§2 形式化；奖励与示意环境；局限／实验计划</ns0:t>
+      </ns0:r>
+    </ns0:p>
+    <ns0:p>
+      <ns0:pPr>
+        <ns0:pStyle ns0:val="Normal"/>
+      </ns0:pPr>
+      <ns0:r>
+        <ns0:t xml:space="preserve">核对状态：公开原文方法、实验与边界复核；未独立复现。分析前提与未来建议不冒充原文定理。 核对：2026-10-14</ns0:t>
       </ns0:r>
     </ns0:p>
     <ns0:p>
@@ -487,39 +487,39 @@
         <ns0:pStyle ns0:val="Normal"/>
       </ns0:pPr>
       <ns0:r>
-        <ns0:t xml:space="preserve">论文已有证据：GIVE 用前／后几何条件与配对训练，实现对象变换及未逐像素指定的阴影、反射等效果。</ns0:t>
-      </ns0:r>
-    </ns0:p>
-    <ns0:p>
-      <ns0:pPr>
-        <ns0:pStyle ns0:val="Normal"/>
-      </ns0:pPr>
-      <ns0:r>
-        <ns0:t xml:space="preserve">对该方向的支撑：借用状态变化到视频执行的接口；外部条件和内部学到的次生效果应同时评价。</ns0:t>
-      </ns0:r>
-    </ns0:p>
-    <ns0:p>
-      <ns0:pPr>
-        <ns0:pStyle ns0:val="Normal"/>
-      </ns0:pPr>
-      <ns0:r>
-        <ns0:t xml:space="preserve">尚未建立的证据：给定几何的执行已有贡献；未知机制推断和长链动力学属于尚待验证的扩展。</ns0:t>
-      </ns0:r>
-    </ns0:p>
-    <ns0:p>
-      <ns0:pPr>
-        <ns0:pStyle ns0:val="Normal"/>
-      </ns0:pPr>
-      <ns0:r>
-        <ns0:t xml:space="preserve">证据定位：PDF p.1 方法 / pre/post geometric specification；PDF p.19 原文局限 / newly exposed moving hand</ns0:t>
-      </ns0:r>
-    </ns0:p>
-    <ns0:p>
-      <ns0:pPr>
-        <ns0:pStyle ns0:val="Normal"/>
-      </ns0:pPr>
-      <ns0:r>
-        <ns0:t xml:space="preserve">核对状态：沿用原速览已有逐页证据；本轮重组支撑关系，未重新全文核验全部结论</ns0:t>
+        <ns0:t xml:space="preserve">论文已有证据：配对训练实现几何可控编辑，并生成未逐像素给定的阴影、反射等次生效果；外部控制与内部学习能力在此同时存在。</ns0:t>
+      </ns0:r>
+    </ns0:p>
+    <ns0:p>
+      <ns0:pPr>
+        <ns0:pStyle ns0:val="Normal"/>
+      </ns0:pPr>
+      <ns0:r>
+        <ns0:t xml:space="preserve">对该方向的支撑：同骨干比较真值／估计几何、完整／稀疏条件；分别测目标变换、阴影等次生效果、未编辑对象及新暴露区域。</ns0:t>
+      </ns0:r>
+    </ns0:p>
+    <ns0:p>
+      <ns0:pPr>
+        <ns0:pStyle ns0:val="Normal"/>
+      </ns0:pPr>
+      <ns0:r>
+        <ns0:t xml:space="preserve">尚未建立的证据：【原文局限】新暴露的运动手部等细节可能失败，多条件流增加计算。【证据范围】给定目标几何的执行不等于从一个动作自主推断所有未知动力学后果。</ns0:t>
+      </ns0:r>
+    </ns0:p>
+    <ns0:p>
+      <ns0:pPr>
+        <ns0:pStyle ns0:val="Normal"/>
+      </ns0:pPr>
+      <ns0:r>
+        <ns0:t xml:space="preserve">证据定位：方法：四路几何条件与配对数据；实验／消融；局限</ns0:t>
+      </ns0:r>
+    </ns0:p>
+    <ns0:p>
+      <ns0:pPr>
+        <ns0:pStyle ns0:val="Normal"/>
+      </ns0:pPr>
+      <ns0:r>
+        <ns0:t xml:space="preserve">核对状态：公开原文方法、实验与边界复核；未独立复现。分析前提与未来建议不冒充原文定理。 核对：2026-10-14</ns0:t>
       </ns0:r>
     </ns0:p>
     <ns0:p>
@@ -557,39 +557,39 @@
         <ns0:pStyle ns0:val="Normal"/>
       </ns0:pPr>
       <ns0:r>
-        <ns0:t xml:space="preserve">论文已有证据：VANS 先固定 VDM 用生成反馈优化 VLM，再固定 VLM 优化 VDM；消融支持分阶段对齐。</ns0:t>
-      </ns0:r>
-    </ns0:p>
-    <ns0:p>
-      <ns0:pPr>
-        <ns0:pStyle ns0:val="Normal"/>
-      </ns0:pPr>
-      <ns0:r>
-        <ns0:t xml:space="preserve">对该方向的支撑：借鉴可训练的推理—生成接口；先稳定状态控制，再用独立状态反馈优化执行。</ns0:t>
-      </ns0:r>
-    </ns0:p>
-    <ns0:p>
-      <ns0:pPr>
-        <ns0:pStyle ns0:val="Normal"/>
-      </ns0:pPr>
-      <ns0:r>
-        <ns0:t xml:space="preserve">尚未建立的证据：任务含假设性问句，但现有指标未独立建立同历史干预下的多步后果与 Keep。</ns0:t>
-      </ns0:r>
-    </ns0:p>
-    <ns0:p>
-      <ns0:pPr>
-        <ns0:pStyle ns0:val="Normal"/>
-      </ns0:pPr>
-      <ns0:r>
-        <ns0:t xml:space="preserve">证据定位：PDF p.1 任务 / Video-NextEvent Prediction；PDF p.5 两阶段机制 / Stage 2: Context-Faithful；PDF p.5 奖励 / CLIPScore</ns0:t>
-      </ns0:r>
-    </ns0:p>
-    <ns0:p>
-      <ns0:pPr>
-        <ns0:pStyle ns0:val="Normal"/>
-      </ns0:pPr>
-      <ns0:r>
-        <ns0:t xml:space="preserve">核对状态：沿用原速览已有逐页证据；本轮重组支撑关系，未重新全文核验全部结论</ns0:t>
+        <ns0:t xml:space="preserve">论文已有证据：阶段式推理—生成对齐及消融支持在其视频问答生成任务上的提升；生成反馈能够用于训练内部能力，不能描述为只有外部 prompt 控制。</ns0:t>
+      </ns0:r>
+    </ns0:p>
+    <ns0:p>
+      <ns0:pPr>
+        <ns0:pStyle ns0:val="Normal"/>
+      </ns0:pPr>
+      <ns0:r>
+        <ns0:t xml:space="preserve">对该方向的支撑：固定数据和预算，比较参考锚点与预测锚点，加入相同历史的不同合法分支及无关干预；用独立状态检查器测奖励投机、事件完成与 Keep。</ns0:t>
+      </ns0:r>
+    </ns0:p>
+    <ns0:p>
+      <ns0:pPr>
+        <ns0:pStyle ns0:val="Normal"/>
+      </ns0:pPr>
+      <ns0:r>
+        <ns0:t xml:space="preserve">尚未建立的证据：【原文消融】奖励组合会影响动态与语义表现。【证据范围】不是对任意同历史干预、长链后果和 Keep 的保证；Joint 不应被误读成两模型始终同时更新。</ns0:t>
+      </ns0:r>
+    </ns0:p>
+    <ns0:p>
+      <ns0:pPr>
+        <ns0:pStyle ns0:val="Normal"/>
+      </ns0:pPr>
+      <ns0:r>
+        <ns0:t xml:space="preserve">证据定位：v2 方法 Joint-GRPO 两阶段与算法；实验／奖励消融</ns0:t>
+      </ns0:r>
+    </ns0:p>
+    <ns0:p>
+      <ns0:pPr>
+        <ns0:pStyle ns0:val="Normal"/>
+      </ns0:pPr>
+      <ns0:r>
+        <ns0:t xml:space="preserve">核对状态：公开原文方法、实验与边界复核；未独立复现。分析前提与未来建议不冒充原文定理。 核对：2026-10-14</ns0:t>
       </ns0:r>
     </ns0:p>
     <ns0:p>
@@ -627,39 +627,39 @@
         <ns0:pStyle ns0:val="Normal"/>
       </ns0:pPr>
       <ns0:r>
-        <ns0:t xml:space="preserve">论文已有证据：LLM 构造动作前后状态及错误结果等反事实文本，经帧／片段／视频层次训练程序表征。</ns0:t>
-      </ns0:r>
-    </ns0:p>
-    <ns0:p>
-      <ns0:pPr>
-        <ns0:pStyle ns0:val="Normal"/>
-      </ns0:pPr>
-      <ns0:r>
-        <ns0:t xml:space="preserve">对该方向的支撑：状态监督可迁移为结果验证器或生成器关系对齐；需对状态监督与蒸馏分别做消融。</ns0:t>
-      </ns0:r>
-    </ns0:p>
-    <ns0:p>
-      <ns0:pPr>
-        <ns0:pStyle ns0:val="Normal"/>
-      </ns0:pPr>
-      <ns0:r>
-        <ns0:t xml:space="preserve">尚未建立的证据：原工作验证理解表征；反事实文本并非成对生成视频，生成迁移与因果可识别性仍需验证。</ns0:t>
-      </ns0:r>
-    </ns0:p>
-    <ns0:p>
-      <ns0:pPr>
-        <ns0:pStyle ns0:val="Normal"/>
-      </ns0:pPr>
-      <ns0:r>
-        <ns0:t xml:space="preserve">证据定位：PDF p.1 任务与机制 / state-change descriptions；PDF p.8 生成边界 / synthetic long-form videos</ns0:t>
-      </ns0:r>
-    </ns0:p>
-    <ns0:p>
-      <ns0:pPr>
-        <ns0:pStyle ns0:val="Normal"/>
-      </ns0:pPr>
-      <ns0:r>
-        <ns0:t xml:space="preserve">核对状态：沿用原速览已有逐页证据；本轮重组支撑关系，未重新全文核验全部结论</ns0:t>
+        <ns0:t xml:space="preserve">论文已有证据：状态监督改善程序相关理解／表征任务。附录进行人工与模型质量核查，支持其数据设计具有实用性。</ns0:t>
+      </ns0:r>
+    </ns0:p>
+    <ns0:p>
+      <ns0:pPr>
+        <ns0:pStyle ns0:val="Normal"/>
+      </ns0:pPr>
+      <ns0:r>
+        <ns0:t xml:space="preserve">对该方向的支撑：对照真实状态标签、原始合成状态与普通动词负例，检查负例质量与生成器迁移；留出生成器／背景捷径，并测条件执行和后果泛化。</ns0:t>
+      </ns0:r>
+    </ns0:p>
+    <ns0:p>
+      <ns0:pPr>
+        <ns0:pStyle ns0:val="Normal"/>
+      </ns0:pPr>
+      <ns0:r>
+        <ns0:t xml:space="preserve">尚未建立的证据：【原文 Appendix A.4】反事实文本偶有低概率情形，需要权衡创造性与现实性。【任务范围】理解提升不直接建立生成收益或因果可识别性。</ns0:t>
+      </ns0:r>
+    </ns0:p>
+    <ns0:p>
+      <ns0:pPr>
+        <ns0:pStyle ns0:val="Normal"/>
+      </ns0:pPr>
+      <ns0:r>
+        <ns0:t xml:space="preserve">证据定位：v6 层次状态对比学习；程序理解实验；Appendix A.4 文本质量</ns0:t>
+      </ns0:r>
+    </ns0:p>
+    <ns0:p>
+      <ns0:pPr>
+        <ns0:pStyle ns0:val="Normal"/>
+      </ns0:pPr>
+      <ns0:r>
+        <ns0:t xml:space="preserve">核对状态：公开原文方法、实验与边界复核；未独立复现。分析前提与未来建议不冒充原文定理。 核对：2026-10-14</ns0:t>
       </ns0:r>
     </ns0:p>
     <ns0:p>
@@ -697,39 +697,39 @@
         <ns0:pStyle ns0:val="Normal"/>
       </ns0:pPr>
       <ns0:r>
-        <ns0:t xml:space="preserve">论文已有证据：What-If World 用单条件变化的提示对评价后果差异。</ns0:t>
-      </ns0:r>
-    </ns0:p>
-    <ns0:p>
-      <ns0:pPr>
-        <ns0:pStyle ns0:val="Normal"/>
-      </ns0:pPr>
-      <ns0:r>
-        <ns0:t xml:space="preserve">对该方向的支撑：构造必要变化与无关保持的双边评测。</ns0:t>
-      </ns0:r>
-    </ns0:p>
-    <ns0:p>
-      <ns0:pPr>
-        <ns0:pStyle ns0:val="Normal"/>
-      </ns0:pPr>
-      <ns0:r>
-        <ns0:t xml:space="preserve">尚未建立的证据：基准不提供新生成算法；提示对也不能替代每个机制的可验证状态真值。</ns0:t>
-      </ns0:r>
-    </ns0:p>
-    <ns0:p>
-      <ns0:pPr>
-        <ns0:pStyle ns0:val="Normal"/>
-      </ns0:pPr>
-      <ns0:r>
-        <ns0:t xml:space="preserve">证据定位：PDF p.1 成对任务 / 319；PDF p.8 成对测量 / Some failures are invisible to single-video metrics</ns0:t>
-      </ns0:r>
-    </ns0:p>
-    <ns0:p>
-      <ns0:pPr>
-        <ns0:pStyle ns0:val="Normal"/>
-      </ns0:pPr>
-      <ns0:r>
-        <ns0:t xml:space="preserve">核对状态：沿用原速览已有逐页证据；本轮重组支撑关系，未重新全文核验全部结论</ns0:t>
+        <ns0:t xml:space="preserve">论文已有证据：提供成对干预诊断，揭示逐视频画质／合理性评价会遗漏的问题；其贡献是评测，未提出训练算法不是缺陷。</ns0:t>
+      </ns0:r>
+    </ns0:p>
+    <ns0:p>
+      <ns0:pPr>
+        <ns0:pStyle ns0:val="Normal"/>
+      </ns0:pPr>
+      <ns0:r>
+        <ns0:t xml:space="preserve">对该方向的支撑：分开报告单片质量与配对 Outcome、Keep；多 seed 重复并人工抽查关键事件，比较基准裁判与独立状态／轨迹真值的一致性。</ns0:t>
+      </ns0:r>
+    </ns0:p>
+    <ns0:p>
+      <ns0:pPr>
+        <ns0:pStyle ns0:val="Normal"/>
+      </ns0:pPr>
+      <ns0:r>
+        <ns0:t xml:space="preserve">尚未建立的证据：【原文讨论】基准分数与部署表现的关系仍需研究，失败分析是现象性诊断，不能定位模型架构／训练原因。【证据范围】不为每例提供唯一真实动力学轨迹。</ns0:t>
+      </ns0:r>
+    </ns0:p>
+    <ns0:p>
+      <ns0:pPr>
+        <ns0:pStyle ns0:val="Normal"/>
+      </ns0:pPr>
+      <ns0:r>
+        <ns0:t xml:space="preserve">证据定位：基准构造与 APEO；九模型评测；Discussion／Limitations</ns0:t>
+      </ns0:r>
+    </ns0:p>
+    <ns0:p>
+      <ns0:pPr>
+        <ns0:pStyle ns0:val="Normal"/>
+      </ns0:pPr>
+      <ns0:r>
+        <ns0:t xml:space="preserve">核对状态：公开原文方法、实验与边界复核；未独立复现。分析前提与未来建议不冒充原文定理。 核对：2026-10-14</ns0:t>
       </ns0:r>
     </ns0:p>
     <ns0:p>
@@ -799,7 +799,7 @@
         <ns0:pStyle ns0:val="Normal"/>
       </ns0:pPr>
       <ns0:r>
-        <ns0:t xml:space="preserve">不支持假设的结果：若只有 oracle 条件有效，则尚未支持自主后果推断；若优势只来自更强生成器或更多采样，则不支持该机制。</ns0:t>
+        <ns0:t xml:space="preserve">不支持假设的结果：若仅真值条件有效，可支持条件执行贡献，但尚未支持自主后果推断；真值也无效则接口或执行假设缺乏支持。若优势只来自更强生成器或更多采样，则不支持候选机制。</ns0:t>
       </ns0:r>
     </ns0:p>
     <ns0:p>
@@ -847,7 +847,7 @@
         <ns0:pStyle ns0:val="Normal"/>
       </ns0:pPr>
       <ns0:r>
-        <ns0:t xml:space="preserve">必要基线：全局奖励；相同数据的监督微调；随机时间分配反馈；只改 mask；结构化反馈但全片重生成。</ns0:t>
+        <ns0:t xml:space="preserve">必要基线：全局奖励；相同数据的监督微调；随机时间分配反馈；只改 mask；结构化反馈但全片重生成。；VQQA 的原始意图 Global Selection 与动态停止；VANS 式分阶段优化。</ns0:t>
       </ns0:r>
     </ns0:p>
     <ns0:p>
@@ -3542,6 +3542,1146 @@
       </ns0:pPr>
       <ns0:r>
         <ns0:t xml:space="preserve">建议先用 50–100 个可控短片实例做诊断：固定骨干、输入权限、采样数和总预算，比较直接提示、结构化 context、全量重生成／记忆重置与候选方法。按对象、机制组合和证据类型留出，保留无变化与无关变化负对照。先报告 GPU 小时／API 成本、生成帧数、采样次数、修订延迟和失败率，再决定是否需要 LoRA、蒸馏或视频 RL；benchmark 是否独立成篇取决于任务与评测的新信息。</ns0:t>
+      </ns0:r>
+    </ns0:p>
+    <ns0:p>
+      <ns0:r>
+        <ns0:t>AIGC · 逐篇前提与长期应用图谱 · 2026-10-14</ns0:t>
+      </ns0:r>
+    </ns0:p>
+    <ns0:p>
+      <ns0:r>
+        <ns0:t>8 篇核心支撑＋H2 引用的 VQQA，分别标注任务、原文条件、分析前提、已有证据、局限／未证范围及后续增量。后续创新门槛不是原论文缺陷；未做新实验。</ns0:t>
+      </ns0:r>
+    </ns0:p>
+    <ns0:p>
+      <ns0:r>
+        <ns0:t>VOID · AIGC-A 核心支撑</ns0:t>
+      </ns0:r>
+    </ns0:p>
+    <ns0:p>
+      <ns0:r>
+        <ns0:t>任务与输入：给定完整源视频与指定删除对象，重生成对象消失后的交互；这是离线后果编辑，不等同于只看历史前缀预测未来。</ns0:t>
+      </ns0:r>
+    </ns0:p>
+    <ns0:p>
+      <ns0:r>
+        <ns0:t>原文条件／算法设置：配对模拟在保持其余场景设定的情况下移除对象；quadmask 表达删除、受影响与保持等区域语义。用户确定目标，VLM 辅助判断影响范围，视频生成器执行连续运动与视觉补全。</ns0:t>
+      </ns0:r>
+    </ns0:p>
+    <ns0:p>
+      <ns0:r>
+        <ns0:t>成立前提 · 原文与本文分析分开标注：【本文分析】成功依赖影响范围判断及生成先验能覆盖该交互；配对模拟是受控真值，真实视频中的隐藏参数通常不足以唯一确定反事实。受影响区域可以很大，不假设变化必然局部，也不把静止相机列为其明确前提。</ns0:t>
+      </ns0:r>
+    </ns0:p>
+    <ns0:p>
+      <ns0:r>
+        <ns0:t>原工作已经建立什么：对象删除及下游交互重生成已有实验证据；成对数据、quadmask 与生成器共同承担任务，不能把效果全部归因于 VLM 解出了精确动力学。</ns0:t>
+      </ns0:r>
+    </ns0:p>
+    <ns0:p>
+      <ns0:r>
+        <ns0:t>原文局限／证据范围：【原文局限】短时长、特殊视角和模拟到真实的域差仍有失败。【证据范围】主要验证删除，尚未覆盖任意动作替换、未知机制和长链组合；这不否定删除任务贡献。</ns0:t>
+      </ns0:r>
+    </ns0:p>
+    <ns0:p>
+      <ns0:r>
+        <ns0:t>后续创新空间 · 不等于原论文缺陷：【后续研究建议】已有自动影响范围流程，因此“自动推断 mask”本身不是与 VOID 的充分区别。可检验更准确的范围推断、新干预类型、延迟后果与同预算保持能力，而非要求原工作先解决所有因果问题。</ns0:t>
+      </ns0:r>
+    </ns0:p>
+    <ns0:p>
+      <ns0:r>
+        <ns0:t>建议诊断实验 · 尚未实测：同骨干比较真值／预测范围与真值状态条件，分别测范围漏检、直接／延迟后果、Keep 误改和机制组合留出；完整源片与仅前缀输入分开报告。</ns0:t>
+      </ns0:r>
+    </ns0:p>
+    <ns0:p>
+      <ns0:r>
+        <ns0:t>证据定位：§3 方法与配对数据；§4 实验；局限与真实视频失败案例</ns0:t>
+      </ns0:r>
+    </ns0:p>
+    <ns0:p>
+      <ns0:r>
+        <ns0:t>原文：https://arxiv.org/abs/2604.02296v1</ns0:t>
+      </ns0:r>
+    </ns0:p>
+    <ns0:p>
+      <ns0:r>
+        <ns0:t>VideoPhysEdit · AIGC-A 核心支撑</ns0:t>
+      </ns0:r>
+    </ns0:p>
+    <ns0:p>
+      <ns0:r>
+        <ns0:t>任务与输入：输入源视频、物理编辑及执行帧；反演可复现原运动的刚体场景，编辑后模拟，再以投影轨迹和编辑参考图引导视频生成。</ns0:t>
+      </ns0:r>
+    </ns0:p>
+    <ns0:p>
+      <ns0:r>
+        <ns0:t>原文条件／算法设置：【原文明示，Appendix D】静止相机、静态平面支撑，物体几何简化为球或盒；支持添加／删除及速度、质量、摩擦、恢复系数等编辑。依赖跟踪、几何估计、模拟器和轨迹条件生成接口。</ns0:t>
+      </ns0:r>
+    </ns0:p>
+    <ns0:p>
+      <ns0:r>
+        <ns0:t>成立前提 · 原文与本文分析分开标注：【原文 §3.3】单目物理反演欠定，不同几何与参数可能解释同一运动。【本文分析】拟合原视频不保证隐藏物理参数真实唯一，反事实取决于所选解释。</ns0:t>
+      </ns0:r>
+    </ns0:p>
+    <ns0:p>
+      <ns0:r>
+        <ns0:t>原工作已经建立什么：20 个合成刚体场景的 129 个编辑任务有配对仿真真值；另有真实视频定性展示。训练自由的反演—模拟—生成流程建立了可执行物理编辑证据。</ns0:t>
+      </ns0:r>
+    </ns0:p>
+    <ns0:p>
+      <ns0:r>
+        <ns0:t>原文局限／证据范围：【原文局限】移动相机、复杂几何、关节体与受控的人／机器人不在当前建模范围；固定阈值可能随尺度／观测变化。【证据范围】真实视频展示不等于配对物理真值验证。</ns0:t>
+      </ns0:r>
+    </ns0:p>
+    <ns0:p>
+      <ns0:r>
+        <ns0:t>后续创新空间 · 不等于原论文缺陷：【后续研究建议】可研究反演歧义及不确定性、复杂几何或移动相机，而不把有模拟器的控制执行视作没有价值。对比必须明确谁获得真值几何／参数。</ns0:t>
+      </ns0:r>
+    </ns0:p>
+    <ns0:p>
+      <ns0:r>
+        <ns0:t>建议诊断实验 · 尚未实测：交叉比较真值与估计状态、同一生成器的真值与估计轨迹；构造原运动近似相同而干预后果不同的参数组，检查不确定性而非只看源片拟合。</ns0:t>
+      </ns0:r>
+    </ns0:p>
+    <ns0:p>
+      <ns0:r>
+        <ns0:t>证据定位：§3.1–3.4；§4–5；Appendix C.2、D</ns0:t>
+      </ns0:r>
+    </ns0:p>
+    <ns0:p>
+      <ns0:r>
+        <ns0:t>原文：https://arxiv.org/html/2609.35134v1</ns0:t>
+      </ns0:r>
+    </ns0:p>
+    <ns0:p>
+      <ns0:r>
+        <ns0:t>CWMDT · AIGC-A 核心支撑</ns0:t>
+      </ns0:r>
+    </ns0:p>
+    <ns0:p>
+      <ns0:r>
+        <ns0:t>任务与输入：把视觉观察组织成对象状态描述，LLM 根据干预预测多种后续状态，视频扩散模型以修改首帧与状态序列生成反事实。</ns0:t>
+      </ns0:r>
+    </ns0:p>
+    <ns0:p>
+      <ns0:r>
+        <ns0:t>原文条件／算法设置：对象身份、类别、属性、质心／深度／大小与 mask 等来自感知模块；数字孪生是结构化表示。由 LLM 预测未来，生成器接受其条件；每次干预可采样多个合理未来。</ns0:t>
+      </ns0:r>
+    </ns0:p>
+    <ns0:p>
+      <ns0:r>
+        <ns0:t>成立前提 · 原文与本文分析分开标注：【本文分析】表示必须保留决定后果的状态，LLM 必须能给出适用演化，生成器必须忠实执行。三者是可分离的误差来源；多种合理未来不应未经定义压成一个唯一物理真值。</ns0:t>
+      </ns0:r>
+    </ns0:p>
+    <ns0:p>
+      <ns0:r>
+        <ns0:t>原工作已经建立什么：在视频编辑／反事实基准上报告视觉和语义收益，展示显式表示—LLM 干预推理—扩散生成的可编辑接口。</ns0:t>
+      </ns0:r>
+    </ns0:p>
+    <ns0:p>
+      <ns0:r>
+        <ns0:t>原文局限／证据范围：【证据范围】结构化“数字孪生”不是经物理识别验证的模拟器；CLIP、检测器和 VLM 评价及小型 CausalVQA debug 结果，不能独立证明真实因果效应识别。</ns0:t>
+      </ns0:r>
+    </ns0:p>
+    <ns0:p>
+      <ns0:r>
+        <ns0:t>后续创新空间 · 不等于原论文缺陷：【后续研究建议】对象结构＋LLM 演化＋条件生成已有先例。新工作可在状态充分性、预测校准、条件执行或未见机制组合上建立增量，不以模块名称差异代替实验。</ns0:t>
+      </ns0:r>
+    </ns0:p>
+    <ns0:p>
+      <ns0:r>
+        <ns0:t>建议诊断实验 · 尚未实测：真值对象状态／预测状态、真值后果／LLM 后果分层替换；同时评价状态误差、生成遵循、可接受未来覆盖及 Keep，避免只测文本相似度。</ns0:t>
+      </ns0:r>
+    </ns0:p>
+    <ns0:p>
+      <ns0:r>
+        <ns0:t>证据定位：§3 三阶段框架；§4 编辑实验；Appendix A CausalVQA debug</ns0:t>
+      </ns0:r>
+    </ns0:p>
+    <ns0:p>
+      <ns0:r>
+        <ns0:t>原文：https://arxiv.org/abs/2511.17481v1</ns0:t>
+      </ns0:r>
+    </ns0:p>
+    <ns0:p>
+      <ns0:r>
+        <ns0:t>Twin Rollouts · AIGC-A 核心支撑</ns0:t>
+      </ns0:r>
+    </ns0:p>
+    <ns0:p>
+      <ns0:r>
+        <ns0:t>任务与输入：从模型自生成并记录噪声的事实轨迹分叉，在同一前缀、同一按世界时间对齐的外生噪声下改变动作；定义局部性和结果奖励。</ns0:t>
+      </ns0:r>
+    </ns0:p>
+    <ns0:p>
+      <ns0:r>
+        <ns0:t>原文条件／算法设置：须能记录并重用采样随机性；模拟器能从状态分叉、提供后果真值与受影响集合 D。相机改变可能令 D 覆盖全画面，此时空 Keep 上的局部性指标应标为不适用。</ns0:t>
+      </ns0:r>
+    </ns0:p>
+    <ns0:p>
+      <ns0:r>
+        <ns0:t>成立前提 · 原文与本文分析分开标注：【原文定义范围】exact abduction 指模型内部已记录的随机性。【本文分析】这不解决真实视频的隐变量反演；同噪声降低随机差异，却不保证模型动力学正确，模拟器与生成前缀仍需对齐。</ns0:t>
+      </ns0:r>
+    </ns0:p>
+    <ns0:p>
+      <ns0:r>
+        <ns0:t>原工作已经建立什么：当前 v1 提出形式化协议和确定性小网格环境示意，明确规模实验尚待完成；应视为概念／评价设计先例，而非已验证性能领先的方法。</ns0:t>
+      </ns0:r>
+    </ns0:p>
+    <ns0:p>
+      <ns0:r>
+        <ns0:t>原文局限／证据范围：【证据状态】缺少规模训练和真实视频实验；依赖可分叉模拟器及 D 的可操作定义。像素差也可能混有渲染变化，不自动等价于语义因果影响。</ns0:t>
+      </ns0:r>
+    </ns0:p>
+    <ns0:p>
+      <ns0:r>
+        <ns0:t>后续创新空间 · 不等于原论文缺陷：【后续研究建议】实现其训练协议并验证局部反馈、随机性耦合和独立真值的作用，仍可能是有效实证贡献；不要把框架提案当作所有问题已解决。</ns0:t>
+      </ns0:r>
+    </ns0:p>
+    <ns0:p>
+      <ns0:r>
+        <ns0:t>建议诊断实验 · 尚未实测：同训练量比较共享／独立噪声、全局／局部奖励、真值／估计 D；单列相机变化和空 Keep，检查结果正确性与局部性是否独立改善。</ns0:t>
+      </ns0:r>
+    </ns0:p>
+    <ns0:p>
+      <ns0:r>
+        <ns0:t>证据定位：§2 形式化；奖励与示意环境；局限／实验计划</ns0:t>
+      </ns0:r>
+    </ns0:p>
+    <ns0:p>
+      <ns0:r>
+        <ns0:t>原文：https://arxiv.org/html/2608.08982v1</ns0:t>
+      </ns0:r>
+    </ns0:p>
+    <ns0:p>
+      <ns0:r>
+        <ns0:t>GIVE · AIGC-A 核心支撑</ns0:t>
+      </ns0:r>
+    </ns0:p>
+    <ns0:p>
+      <ns0:r>
+        <ns0:t>任务与输入：给源视频和时序对齐的编辑前／后几何控制，生成对象变换及相应视觉变化。</ns0:t>
+      </ns0:r>
+    </ns0:p>
+    <ns0:p>
+      <ns0:r>
+        <ns0:t>原文条件／算法设置：深度、包围盒、朝向等几何流与 RGB 联合条件化；训练用引擎配对数据。推理以用户输入、视频分割和单目几何估计得到控制，不要求测试时完整 3D 代理、引擎特权缓冲或逐视频优化。</ns0:t>
+      </ns0:r>
+    </ns0:p>
+    <ns0:p>
+      <ns0:r>
+        <ns0:t>成立前提 · 原文与本文分析分开标注：【本文分析】前后控制需在身份、时间和坐标上相容，并充分描述目标编辑；盒级几何不能唯一决定隐藏材质／非刚性细节。学习到的生成先验承担未明确指定的次生视觉效果。</ns0:t>
+      </ns0:r>
+    </ns0:p>
+    <ns0:p>
+      <ns0:r>
+        <ns0:t>原工作已经建立什么：配对训练实现几何可控编辑，并生成未逐像素给定的阴影、反射等次生效果；外部控制与内部学习能力在此同时存在。</ns0:t>
+      </ns0:r>
+    </ns0:p>
+    <ns0:p>
+      <ns0:r>
+        <ns0:t>原文局限／证据范围：【原文局限】新暴露的运动手部等细节可能失败，多条件流增加计算。【证据范围】给定目标几何的执行不等于从一个动作自主推断所有未知动力学后果。</ns0:t>
+      </ns0:r>
+    </ns0:p>
+    <ns0:p>
+      <ns0:r>
+        <ns0:t>后续创新空间 · 不等于原论文缺陷：【后续研究建议】几何条件及次生效果学习已有贡献；增量可落在稀疏条件、带误差控制的稳健执行、动态状态传播及低成本保持，而不是仅宣称“模型内部也学习了关系”。</ns0:t>
+      </ns0:r>
+    </ns0:p>
+    <ns0:p>
+      <ns0:r>
+        <ns0:t>建议诊断实验 · 尚未实测：同骨干比较真值／估计几何、完整／稀疏条件；分别测目标变换、阴影等次生效果、未编辑对象及新暴露区域。</ns0:t>
+      </ns0:r>
+    </ns0:p>
+    <ns0:p>
+      <ns0:r>
+        <ns0:t>证据定位：方法：四路几何条件与配对数据；实验／消融；局限</ns0:t>
+      </ns0:r>
+    </ns0:p>
+    <ns0:p>
+      <ns0:r>
+        <ns0:t>原文：https://arxiv.org/abs/2606.24225v1</ns0:t>
+      </ns0:r>
+    </ns0:p>
+    <ns0:p>
+      <ns0:r>
+        <ns0:t>VANS · AIGC-A 核心支撑</ns0:t>
+      </ns0:r>
+    </ns0:p>
+    <ns0:p>
+      <ns0:r>
+        <ns0:t>任务与输入：输入视频上下文和问题，先预测下一事件的文字答案，再生成视频答案；任务包含预测性、程序性和假设性问题。</ns0:t>
+      </ns0:r>
+    </ns0:p>
+    <ns0:p>
+      <ns0:r>
+        <ns0:t>原文条件／算法设置：训练有参考文字／视频答案。Joint-GRPO 分阶段：先固定 VDM 更新 VLM，再固定 VLM 优化 VDM；第二阶段筛选与参考语义相符的锚点。使用格式、文本及视频语义一致性等奖励。</ns0:t>
+      </ns0:r>
+    </ns0:p>
+    <ns0:p>
+      <ns0:r>
+        <ns0:t>成立前提 · 原文与本文分析分开标注：【本文分析】代理奖励和锚点筛选需与目标事件一致；一个参考答案不必穷尽所有合理未来。文字预测正确、视觉执行正确和真实干预后果正确是不同检验。</ns0:t>
+      </ns0:r>
+    </ns0:p>
+    <ns0:p>
+      <ns0:r>
+        <ns0:t>原工作已经建立什么：阶段式推理—生成对齐及消融支持在其视频问答生成任务上的提升；生成反馈能够用于训练内部能力，不能描述为只有外部 prompt 控制。</ns0:t>
+      </ns0:r>
+    </ns0:p>
+    <ns0:p>
+      <ns0:r>
+        <ns0:t>原文局限／证据范围：【原文消融】奖励组合会影响动态与语义表现。【证据范围】不是对任意同历史干预、长链后果和 Keep 的保证；Joint 不应被误读成两模型始终同时更新。</ns0:t>
+      </ns0:r>
+    </ns0:p>
+    <ns0:p>
+      <ns0:r>
+        <ns0:t>后续创新空间 · 不等于原论文缺陷：【后续研究建议】可将阶段式对齐迁移到状态／事件监督，验证独立后果奖励与保持目标的增量；“VLM 推理＋视频生成＋RL”已不是空白。</ns0:t>
+      </ns0:r>
+    </ns0:p>
+    <ns0:p>
+      <ns0:r>
+        <ns0:t>建议诊断实验 · 尚未实测：固定数据和预算，比较参考锚点与预测锚点，加入相同历史的不同合法分支及无关干预；用独立状态检查器测奖励投机、事件完成与 Keep。</ns0:t>
+      </ns0:r>
+    </ns0:p>
+    <ns0:p>
+      <ns0:r>
+        <ns0:t>证据定位：v2 方法 Joint-GRPO 两阶段与算法；实验／奖励消融</ns0:t>
+      </ns0:r>
+    </ns0:p>
+    <ns0:p>
+      <ns0:r>
+        <ns0:t>原文：https://arxiv.org/html/2511.16669v2</ns0:t>
+      </ns0:r>
+    </ns0:p>
+    <ns0:p>
+      <ns0:r>
+        <ns0:t>State-Change Counterfactuals · AIGC-A 核心支撑</ns0:t>
+      </ns0:r>
+    </ns0:p>
+    <ns0:p>
+      <ns0:r>
+        <ns0:t>任务与输入：用动作前后状态及反事实假设训练程序视频表征，输出用于理解任务的表示，而非直接生成反事实 RGB 视频。</ns0:t>
+      </ns0:r>
+    </ns0:p>
+    <ns0:p>
+      <ns0:r>
+        <ns0:t>原文条件／算法设置：从带叙述的 Ego4D 视频构造状态与反事实文本，使用帧／片段／视频层次对比学习；文本编码器冻结，另有缺步／换序等视频负例。</ns0:t>
+      </ns0:r>
+    </ns0:p>
+    <ns0:p>
+      <ns0:r>
+        <ns0:t>成立前提 · 原文与本文分析分开标注：【本文分析】叙述需支持前后状态，负例需对该样本构成有效区别；“另一种可能发生的结果”与“不符合当前事实的结果”须分开，不能把合理替代未来当作普遍不可能。</ns0:t>
+      </ns0:r>
+    </ns0:p>
+    <ns0:p>
+      <ns0:r>
+        <ns0:t>原工作已经建立什么：状态监督改善程序相关理解／表征任务。附录进行人工与模型质量核查，支持其数据设计具有实用性。</ns0:t>
+      </ns0:r>
+    </ns0:p>
+    <ns0:p>
+      <ns0:r>
+        <ns0:t>原文局限／证据范围：【原文 Appendix A.4】反事实文本偶有低概率情形，需要权衡创造性与现实性。【任务范围】理解提升不直接建立生成收益或因果可识别性。</ns0:t>
+      </ns0:r>
+    </ns0:p>
+    <ns0:p>
+      <ns0:r>
+        <ns0:t>后续创新空间 · 不等于原论文缺陷：【后续研究建议】迁移为生成器状态监督或关系对齐是可测试贡献；需要与普通动作／动词监督、VideoREPA 类对齐比较，不能把文本负例本身作为全新做法。</ns0:t>
+      </ns0:r>
+    </ns0:p>
+    <ns0:p>
+      <ns0:r>
+        <ns0:t>建议诊断实验 · 尚未实测：对照真实状态标签、原始合成状态与普通动词负例，检查负例质量与生成器迁移；留出生成器／背景捷径，并测条件执行和后果泛化。</ns0:t>
+      </ns0:r>
+    </ns0:p>
+    <ns0:p>
+      <ns0:r>
+        <ns0:t>证据定位：v6 层次状态对比学习；程序理解实验；Appendix A.4 文本质量</ns0:t>
+      </ns0:r>
+    </ns0:p>
+    <ns0:p>
+      <ns0:r>
+        <ns0:t>原文：https://arxiv.org/html/2503.21055v6</ns0:t>
+      </ns0:r>
+    </ns0:p>
+    <ns0:p>
+      <ns0:r>
+        <ns0:t>What-If World · AIGC-A 核心支撑</ns0:t>
+      </ns0:r>
+    </ns0:p>
+    <ns0:p>
+      <ns0:r>
+        <ns0:t>任务与输入：以真实初始帧和最小物理条件变化的成对提示，评测生成视频是否共同满足干预、物理、环境和结果要求。</ns0:t>
+      </ns0:r>
+    </ns0:p>
+    <ns0:p>
+      <ns0:r>
+        <ns0:t>原文条件／算法设置：319 个配对任务来自 nuScenes／DROID，覆盖六类物理变量；APEO 评价含条件遵循、物理、环境与配对结果，模型评判经人工核查。</ns0:t>
+      </ns0:r>
+    </ns0:p>
+    <ns0:p>
+      <ns0:r>
+        <ns0:t>成立前提 · 原文与本文分析分开标注：【本文分析】提示差异须确实对应要检验的条件，评价器须看得见关键后果；同初始图和最小文字差异不自动消除隐藏状态歧义或生成随机差异。</ns0:t>
+      </ns0:r>
+    </ns0:p>
+    <ns0:p>
+      <ns0:r>
+        <ns0:t>原工作已经建立什么：提供成对干预诊断，揭示逐视频画质／合理性评价会遗漏的问题；其贡献是评测，未提出训练算法不是缺陷。</ns0:t>
+      </ns0:r>
+    </ns0:p>
+    <ns0:p>
+      <ns0:r>
+        <ns0:t>原文局限／证据范围：【原文讨论】基准分数与部署表现的关系仍需研究，失败分析是现象性诊断，不能定位模型架构／训练原因。【证据范围】不为每例提供唯一真实动力学轨迹。</ns0:t>
+      </ns0:r>
+    </ns0:p>
+    <ns0:p>
+      <ns0:r>
+        <ns0:t>后续创新空间 · 不等于原论文缺陷：【后续研究建议】结合状态可分叉的环境加入独立真值、无变化和无关干预对照；作为新生成算法的评测基线，而不是把它当同类生成器竞争。</ns0:t>
+      </ns0:r>
+    </ns0:p>
+    <ns0:p>
+      <ns0:r>
+        <ns0:t>建议诊断实验 · 尚未实测：分开报告单片质量与配对 Outcome、Keep；多 seed 重复并人工抽查关键事件，比较基准裁判与独立状态／轨迹真值的一致性。</ns0:t>
+      </ns0:r>
+    </ns0:p>
+    <ns0:p>
+      <ns0:r>
+        <ns0:t>证据定位：基准构造与 APEO；九模型评测；Discussion／Limitations</ns0:t>
+      </ns0:r>
+    </ns0:p>
+    <ns0:p>
+      <ns0:r>
+        <ns0:t>原文：https://arxiv.org/html/2605.27589v1</ns0:t>
+      </ns0:r>
+    </ns0:p>
+    <ns0:p>
+      <ns0:r>
+        <ns0:t>VQQA · 辅助反馈方法（H2 引用）</ns0:t>
+      </ns0:r>
+    </ns0:p>
+    <ns0:p>
+      <ns0:r>
+        <ns0:t>任务与输入：围绕意图和生成视频动态提问，由 QA 批评形成语义反馈，修订提示并重新生成；用于黑盒测试时质量优化。</ns0:t>
+      </ns0:r>
+    </ns0:p>
+    <ns0:p>
+      <ns0:r>
+        <ns0:t>原文条件／算法设置：需可重复调用生成器与 VLM 评判器；已有针对原始提示的 Global Selection 和动态停止，以控制语义漂移，不应描述为完全没有全局保持。</ns0:t>
+      </ns0:r>
+    </ns0:p>
+    <ns0:p>
+      <ns0:r>
+        <ns0:t>成立前提 · 原文与本文分析分开标注：【本文分析】反馈需可行动且在生成器能力范围内；文本批评不是可执行物理真值，也不保证每轮单调改善。</ns0:t>
+      </ns0:r>
+    </ns0:p>
+    <ns0:p>
+      <ns0:r>
+        <ns0:t>原工作已经建立什么：在多种生成器与视频评测任务上建立动态 QA—提示修订闭环；无需读取生成器梯度，也能发现单片中的时序和全局问题。</ns0:t>
+      </ns0:r>
+    </ns0:p>
+    <ns0:p>
+      <ns0:r>
+        <ns0:t>原文局限／证据范围：【原文 Appendix A】受评判幻觉、基础生成器能力和串行延迟限制。【任务范围】默认重新生成不等于局部视频修复，尚未专门验证同历史反事实与因果保持。</ns0:t>
+      </ns0:r>
+    </ns0:p>
+    <ns0:p>
+      <ns0:r>
+        <ns0:t>后续创新空间 · 不等于原论文缺陷：【后续研究建议】在已有原始意图选择和停止机制之上，新增可定位对象—事件—时间的约束反馈，验证局部修复能否少改坏；单称“动态评判反馈”不足以区别。</ns0:t>
+      </ns0:r>
+    </ns0:p>
+    <ns0:p>
+      <ns0:r>
+        <ns0:t>建议诊断实验 · 尚未实测：同总模型调用与时间预算比较 Best-of-N、原 VQQA 和局部修复；用独立状态检查器测已通过约束破坏、真实增益和停止决策。</ns0:t>
+      </ns0:r>
+    </ns0:p>
+    <ns0:p>
+      <ns0:r>
+        <ns0:t>证据定位：方法 QA／Semantic Gradients／Global Selection；实验；Appendix A</ns0:t>
+      </ns0:r>
+    </ns0:p>
+    <ns0:p>
+      <ns0:r>
+        <ns0:t>原文：https://arxiv.org/abs/2603.12310v1</ns0:t>
+      </ns0:r>
+    </ns0:p>
+    <ns0:p>
+      <ns0:r>
+        <ns0:t>AIGC 长期应用场景</ns0:t>
+      </ns0:r>
+    </ns0:p>
+    <ns0:p>
+      <ns0:r>
+        <ns0:t>每个场景列 1 篇已核实顶会主会论文与 1 篇本轮检索的最新相关 arXiv 候选，并补充方法上更贴近的论文。“最新”指此检索范围内的相关候选，不宣称穷尽；较新的通用方法与较早的领域专用方法分别标注。顶会记录取 CVF；arXiv 可同时存在已接收版本，不以 arXiv 入口推断审稿状态。</ns0:t>
+      </ns0:r>
+    </ns0:p>
+    <ns0:p>
+      <ns0:r>
+        <ns0:t>四个长期应用场景交叉映射 A–D，不增加新的 AIGC 方向。参考文献作为外部应用图谱，不增加本地 451 条计数。</ns0:t>
+      </ns0:r>
+    </ns0:p>
+    <ns0:p>
+      <ns0:r>
+        <ns0:t>【研究判断】A–D 可作为贯穿应用的研究轴，应用场景提供可测问题和真实工作流。A 连接事件／物理可控生成，B 连接持久记忆与纠错，C 连接叙事和观众信息控制，D 连接稀疏条件理解与主动获取；已有方法不空白，长期价值需由未解决的状态／知识／控制问题及可重复实验建立。</ns0:t>
+      </ns0:r>
+    </ns0:p>
+    <ns0:p>
+      <ns0:r>
+        <ns0:t>剧本杀／互动悬疑／分支叙事</ns0:t>
+      </ns0:r>
+    </ns0:p>
+    <ns0:p>
+      <ns0:r>
+        <ns0:t>A–D 对应：AIGC-A：玩家行动改变后果；AIGC-B：新线索纠正系统先前判断；AIGC-C：控制观众／角色的线索可见性；AIGC-D：只询问影响续篇的缺失设定</ns0:t>
+      </ns0:r>
+    </ns0:p>
+    <ns0:p>
+      <ns0:r>
+        <ns0:t>具体任务：玩家提前拿走钥匙，改变谁能开门；或只推迟展示钥匙特写，保持偷钥匙事件本身不变。前者属于 A，后者属于 C；若某角色因此没看见钥匙并改了行动，要联用 A。</ns0:t>
+      </ns0:r>
+    </ns0:p>
+    <ns0:p>
+      <ns0:r>
+        <ns0:t>长期价值：作者规则、隐藏事实和多角色知识可显式记录，能形成分支一致性、证据修订与视觉泄露的持续研究；价值在可验证叙事控制，而非一次性生成故事。</ns0:t>
+      </ns0:r>
+    </ns0:p>
+    <ns0:p>
+      <ns0:r>
+        <ns0:t>当前进展：事件完成评测已经成熟到可逐项诊断；近期工作已把源材料、视频历史与新意图编译为生成约束。完整多人隐藏信息和推理公平性仍不能据此视为已解决。</ns0:t>
+      </ns0:r>
+    </ns0:p>
+    <ns0:p>
+      <ns0:r>
+        <ns0:t>状态约定：分别维护世界事实 W、系统信念 B、每个角色知识 K_i、观众已见信息 O 及允许分支集合；叙事并非只有一个正确未来。</ns0:t>
+      </ns0:r>
+    </ns0:p>
+    <ns0:p>
+      <ns0:r>
+        <ns0:t>研究缺口／创新边界：【研究判断】在保持作者事实的情况下，哪些信息可以不展示？如何保证角色不会使用未获知线索，系统接受反证却不覆盖已发生事实？VIS-Ground 已覆盖上下文约束，不能只以“结构化故事状态＋验证器”声称创新。</ns0:t>
+      </ns0:r>
+    </ns0:p>
+    <ns0:p>
+      <ns0:r>
+        <ns0:t>第一组实验：作者先标注事实、角色可见性与合法续篇；交叉改变玩家动作／镜头揭示顺序／外来反证。比较直接提示、VIS-Ground 与分离知识状态控制，测非法知情、泄露时间、合法分支完成率和 Keep；再做玩家理解／公平性感受实验。</ns0:t>
+      </ns0:r>
+    </ns0:p>
+    <ns0:p>
+      <ns0:r>
+        <ns0:t>选题建议：【选题建议】最适合体现 B／C 区别，但须同时有程序化标签与玩家研究，避免只依赖 VLM 偏好分数。</ns0:t>
+      </ns0:r>
+    </ns0:p>
+    <ns0:p>
+      <ns0:r>
+        <ns0:t>短期：有限房间、角色与道具的可验证分支，先验证 A／C 的区别。</ns0:t>
+      </ns0:r>
+    </ns0:p>
+    <ns0:p>
+      <ns0:r>
+        <ns0:t>中期：外来反证与未渲染承诺的记忆修订，测试跨镜头／跨回合。</ns0:t>
+      </ns0:r>
+    </ns0:p>
+    <ns0:p>
+      <ns0:r>
+        <ns0:t>长期：多人私有视角、自适应线索和可解释冲突处理；以新剧情／规则留出检验泛化。</ns0:t>
+      </ns0:r>
+    </ns0:p>
+    <ns0:p>
+      <ns0:r>
+        <ns0:t>StoryEval · CVPR 2025 主会 · 2025-06</ns0:t>
+      </ns0:r>
+    </ns0:p>
+    <ns0:p>
+      <ns0:r>
+        <ns0:t>Is Your World Simulator a Good Story Presenter? A Consecutive Events-Based Benchmark for Future Long Video Generation</ns0:t>
+      </ns0:r>
+    </ns0:p>
+    <ns0:p>
+      <ns0:r>
+        <ns0:t>https://openaccess.thecvf.com/content/CVPR2025/papers/Wang_Is_Your_World_Simulator_a_Good_Story_Presenter_A_Consecutive_CVPR_2025_paper.pdf</ns0:t>
+      </ns0:r>
+    </ns0:p>
+    <ns0:p>
+      <ns0:r>
+        <ns0:t>已有进展：423 个提示、每个含 2–4 个连续事件，借 VLM 检查各事件完成情况；把叙事评价从单纯画质推进到事件是否真的发生。</ns0:t>
+      </ns0:r>
+    </ns0:p>
+    <ns0:p>
+      <ns0:r>
+        <ns0:t>边界：这是事件呈现基准，不是剧本杀系统；原结果针对当时测试模型，不能当作 2026 模型排名，也未直接测角色知识与线索公平性。</ns0:t>
+      </ns0:r>
+    </ns0:p>
+    <ns0:p>
+      <ns0:r>
+        <ns0:t>可借鉴：借事件逐项验证，增加先后约束、角色可知信息和观众泄露检查。</ns0:t>
+      </ns0:r>
+    </ns0:p>
+    <ns0:p>
+      <ns0:r>
+        <ns0:t>证据定位：CVF 正式论文；§3 基准构造、§4 实验</ns0:t>
+      </ns0:r>
+    </ns0:p>
+    <ns0:p>
+      <ns0:r>
+        <ns0:t>VIS-Ground · arXiv 预印本；未据此标记顶会接收 · 2026-10-07</ns0:t>
+      </ns0:r>
+    </ns0:p>
+    <ns0:p>
+      <ns0:r>
+        <ns0:t>VIS-Ground: Video Interactive Storytelling with Contextual Grounding</ns0:t>
+      </ns0:r>
+    </ns0:p>
+    <ns0:p>
+      <ns0:r>
+        <ns0:t>https://arxiv.org/html/2610.09326v1</ns0:t>
+      </ns0:r>
+    </ns0:p>
+    <ns0:p>
+      <ns0:r>
+        <ns0:t>已有进展：将故事／知识源、已生成前缀和新请求编译成状态、依赖和候选约束，再计划—验证—修订—渲染；三种视频骨干上的综合评价改善。</ns0:t>
+      </ns0:r>
+    </ns0:p>
+    <ns0:p>
+      <ns0:r>
+        <ns0:t>边界：原文把视频前缀视作先前指令的充分记录；依赖抽取及视觉执行仍会失败，源忠实与请求遵循可能冲突。并非每项指标最优，尚非多人隐藏信息剧本杀验证。</ns0:t>
+      </ns0:r>
+    </ns0:p>
+    <ns0:p>
+      <ns0:r>
+        <ns0:t>可借鉴：是 A–D 共享的直接近邻：结构化上下文与约束流程已有先例。可研究未渲染的承诺、私有知识、允许分支及冲突规则，而非只重做该流程。</ns0:t>
+      </ns0:r>
+    </ns0:p>
+    <ns0:p>
+      <ns0:r>
+        <ns0:t>证据定位：§2.2、§3、§4、§5.3；附录约束与修复</ns0:t>
+      </ns0:r>
+    </ns0:p>
+    <ns0:p>
+      <ns0:r>
+        <ns0:t>电影／真人短剧／多镜头制作</ns0:t>
+      </ns0:r>
+    </ns0:p>
+    <ns0:p>
+      <ns0:r>
+        <ns0:t>A–D 对应：AIGC-A：改事件后传播到相关镜头；AIGC-B：新素材或导演纠正触发记忆修订；AIGC-C：同一事实的悬念与揭示节奏；AIGC-D：最少分镜／参考镜头／关键帧</ns0:t>
+      </ns0:r>
+    </ns0:p>
+    <ns0:p>
+      <ns0:r>
+        <ns0:t>具体任务：把“杯子被打碎”改成“杯子被接住”，后续桌面碎片、人物反应和道具连续性要更新，未涉及的镜头保持；只改闪回位置则不应改事实时间。</ns0:t>
+      </ns0:r>
+    </ns0:p>
+    <ns0:p>
+      <ns0:r>
+        <ns0:t>长期价值：多次返工、跨镜头连续性和长剧集资产维护持续存在；可从状态接口、生成训练和制作效率三个层次累积成果。</ns0:t>
+      </ns0:r>
+    </ns0:p>
+    <ns0:p>
+      <ns0:r>
+        <ns0:t>当前进展：下一镜头记忆、历史条件压缩及网格联合生成已有模型级方法；长视频长度与一致性有进展，但展示完整镜头不等于修改事件后所有镜头正确响应。 2026-09-07 上线 arXiv 的 CineCrew（已接收 ECCV 2026）另将 FilmDSL 与 QA 修复纳入制作流程；故也列为较新的流程近邻。</ns0:t>
+      </ns0:r>
+    </ns0:p>
+    <ns0:p>
+      <ns0:r>
+        <ns0:t>状态约定：事件时间线与镜头展示时间线分离；角色／道具／场景资产有版本，修改请求标明目标与冻结项。</ns0:t>
+      </ns0:r>
+    </ns0:p>
+    <ns0:p>
+      <ns0:r>
+        <ns0:t>研究缺口／创新边界：【研究判断】可检验跨镜头修改的最小传播范围、版本失效与回滚，以及导演给少量条件时的执行。用外部工具链不能自动视为弱贡献，关键是可靠性与成本是否优于已有控制。</ns0:t>
+      </ns0:r>
+    </ns0:p>
+    <ns0:p>
+      <ns0:r>
+        <ns0:t>第一组实验：构建带道具状态记录的短剧及单事件编辑；对比逐镜头全重做、OneStory 记忆、MovieGrid 条件续写和选择性传播。测事件正确率、后续镜头漏改、冻结镜头误改、人工修订时间与调用成本。</ns0:t>
+      </ns0:r>
+    </ns0:p>
+    <ns0:p>
+      <ns0:r>
+        <ns0:t>选题建议：【选题建议】A／B 的强应用；算力有限可先做可复现编辑任务和控制接口，再决定是否训练长视频模型。</ns0:t>
+      </ns0:r>
+    </ns0:p>
+    <ns0:p>
+      <ns0:r>
+        <ns0:t>短期：单场景跨镜头道具状态与对话连续性。</ns0:t>
+      </ns0:r>
+    </ns0:p>
+    <ns0:p>
+      <ns0:r>
+        <ns0:t>中期：跨场景／跨集记忆纠错和事件编辑，联测 A／B。</ns0:t>
+      </ns0:r>
+    </ns0:p>
+    <ns0:p>
+      <ns0:r>
+        <ns0:t>长期：叙事事实与导演展示意图的联合可控生成，加入受众理解与制作工作流验证。</ns0:t>
+      </ns0:r>
+    </ns0:p>
+    <ns0:p>
+      <ns0:r>
+        <ns0:t>OneStory · CVPR 2026 主会 · 2026-06</ns0:t>
+      </ns0:r>
+    </ns0:p>
+    <ns0:p>
+      <ns0:r>
+        <ns0:t>OneStory: Coherent Multi-Shot Video Generation with Adaptive Memory</ns0:t>
+      </ns0:r>
+    </ns0:p>
+    <ns0:p>
+      <ns0:r>
+        <ns0:t>https://openaccess.thecvf.com/content/CVPR2026/html/An_OneStory_Coherent_Multi-Shot_Video_Generation_with_Adaptive_Memory_CVPR_2026_paper.html</ns0:t>
+      </ns0:r>
+    </ns0:p>
+    <ns0:p>
+      <ns0:r>
+        <ns0:t>已有进展：把多镜头生成建模为下一镜头预测，以历史帧选择和自适应压缩条件建立跨镜头记忆；在 60K 多镜头数据上训练并验证叙事一致性。</ns0:t>
+      </ns0:r>
+    </ns0:p>
+    <ns0:p>
+      <ns0:r>
+        <ns0:t>边界：历史记忆与视觉一致性已有方法证据；这不等于已处理外来反证、过时记忆撤销、角色知识变化或任意剧情因果改写。</ns0:t>
+      </ns0:r>
+    </ns0:p>
+    <ns0:p>
+      <ns0:r>
+        <ns0:t>可借鉴：B 的记忆检索／压缩基线，A 的跨镜头保持基线；引入新证据时应比较保留旧记忆、全部清空与选择性修订。</ns0:t>
+      </ns0:r>
+    </ns0:p>
+    <ns0:p>
+      <ns0:r>
+        <ns0:t>证据定位：CVF 正式接收记录与论文摘要／方法概述</ns0:t>
+      </ns0:r>
+    </ns0:p>
+    <ns0:p>
+      <ns0:r>
+        <ns0:t>MovieGrid · arXiv 预印本；未核实顶会接收 · 2026-09-06</ns0:t>
+      </ns0:r>
+    </ns0:p>
+    <ns0:p>
+      <ns0:r>
+        <ns0:t>Multi-Grid Post-Training for Long-Form Multi-Shot Video Generation</ns0:t>
+      </ns0:r>
+    </ns0:p>
+    <ns0:p>
+      <ns0:r>
+        <ns0:t>https://arxiv.org/html/2609.06373v1</ns0:t>
+      </ns0:r>
+    </ns0:p>
+    <ns0:p>
+      <ns0:r>
+        <ns0:t>已有进展：将时间有序片段排成空间网格联合生成，用干净片段条件、角色标记、网格编码和边界损失训练。测试含 89 个故事，其中 18 个为 anime；报告 1,616 帧多镜头生成，并分析镜头顺序召回。</ns0:t>
+      </ns0:r>
+    </ns0:p>
+    <ns0:p>
+      <ns0:r>
+        <ns0:t>边界：扩展到 64 格、6,464 帧时存在分辨率／质量折中；固定画布下单格降至 320×192。跨镜头相似度、镜头召回不等于事件因果或线索泄露正确；动漫只是测试子集。</ns0:t>
+      </ns0:r>
+    </ns0:p>
+    <ns0:p>
+      <ns0:r>
+        <ns0:t>可借鉴：电影与动漫短剧共用的近期长片段生成基线；测试状态改变能否传播到相关格／镜头而不改坏无关片段。</ns0:t>
+      </ns0:r>
+    </ns0:p>
+    <ns0:p>
+      <ns0:r>
+        <ns0:t>证据定位：§3–4；§5.1–5.4；Appendix A</ns0:t>
+      </ns0:r>
+    </ns0:p>
+    <ns0:p>
+      <ns0:r>
+        <ns0:t>CineCrew · ECCV 2026（arXiv 接收注记／作者官方仓库）；此处为补充近邻 · 2026-09-07</ns0:t>
+      </ns0:r>
+    </ns0:p>
+    <ns0:p>
+      <ns0:r>
+        <ns0:t>Better Call CineCrew: Consistent Ultra-Long Narrative-to-Film Generation</ns0:t>
+      </ns0:r>
+    </ns0:p>
+    <ns0:p>
+      <ns0:r>
+        <ns0:t>https://arxiv.org/abs/2609.07720</ns0:t>
+      </ns0:r>
+    </ns0:p>
+    <ns0:p>
+      <ns0:r>
+        <ns0:t>已有进展：FilmDSL 把镜头、资产、连续性与角色线索转成共享制作规范，协调规划、关键帧生成、视频生成、QA 与修复；TV 风格片段实验报告控制与一致性改善。</ns0:t>
+      </ns0:r>
+    </ns0:p>
+    <ns0:p>
+      <ns0:r>
+        <ns0:t>边界：不重训基础视频生成器，能力仍受其限制；制作级结构化控制不自动等于未知因果机制推断或观众知识保证。</ns0:t>
+      </ns0:r>
+    </ns0:p>
+    <ns0:p>
+      <ns0:r>
+        <ns0:t>可借鉴：电影方向必须比较的结构化制作流程；“剧本→约束→生成→检查”已有直接先例，增量需落实到选择性事件传播或纠错。</ns0:t>
+      </ns0:r>
+    </ns0:p>
+    <ns0:p>
+      <ns0:r>
+        <ns0:t>证据定位：arXiv 摘要与接收注记；作者官方仓库 https://github.com/Ironieser/CineCrew</ns0:t>
+      </ns0:r>
+    </ns0:p>
+    <ns0:p>
+      <ns0:r>
+        <ns0:t>动漫／动画短剧／连载内容</ns0:t>
+      </ns0:r>
+    </ns0:p>
+    <ns0:p>
+      <ns0:r>
+        <ns0:t>A–D 对应：AIGC-A：动作改写与风格约束下的选择性变化；AIGC-B：角色设定／道具记忆的版本修订；AIGC-C：伏笔、反应镜头与揭示时刻；AIGC-D：从草图／白模／少量关键帧获得控制</ns0:t>
+      </ns0:r>
+    </ns0:p>
+    <ns0:p>
+      <ns0:r>
+        <ns0:t>具体任务：保留角色设定与场景，让导演改变“闪避”后的动作衔接；夸张拉伸属于允许艺术变化，而饰品丢失、角色错位和该保留的道具消失属于错误。</ns0:t>
+      </ns0:r>
+    </ns0:p>
+    <ns0:p>
+      <ns0:r>
+        <ns0:t>长期价值：高频短剧、连载角色和稀疏制作资产形成反复可测的控制任务；长期重点是制作意图、视觉状态与艺术规则，而不只追求写实物理。</ns0:t>
+      </ns0:r>
+    </ns0:p>
+    <ns0:p>
+      <ns0:r>
+        <ns0:t>当前进展：已从插画运动控制推进到专业稀疏条件理解、生成器对齐与艺术偏好；2026-09 MovieGrid 的测试含动漫故事，但不是动漫专门系统。专业制作接口重点读 2026-05 CogOmniControl，艺术变形读 AniMatrix。</ns0:t>
+      </ns0:r>
+    </ns0:p>
+    <ns0:p>
+      <ns0:r>
+        <ns0:t>状态约定：角色设定表、道具状态、动作节拍与允许夸张分别编码；物理约束按场景／风格适用，导演控制具有优先级。</ns0:t>
+      </ns0:r>
+    </ns0:p>
+    <ns0:p>
+      <ns0:r>
+        <ns0:t>研究缺口／创新边界：【研究判断】需要区分有意变形和身份／状态错误，测最少控制何时不足以及主动补问的价值。草图控制、专业 VLM 和风格奖励已有先例，整合它们不是充分创新。</ns0:t>
+      </ns0:r>
+    </ns0:p>
+    <ns0:p>
+      <ns0:r>
+        <ns0:t>第一组实验：请动画师标注“必须保持／可夸张／需追问”，用同一脚本和角色表比较完整条件、稀疏条件、主动补问与随机补问；测艺术意图遵循、角色与道具保持、后果衔接、控制输入量和返工。</ns0:t>
+      </ns0:r>
+    </ns0:p>
+    <ns0:p>
+      <ns0:r>
+        <ns0:t>选题建议：【选题建议】D 与 A 的结合较具体；“更符合物理”未必是正确优化目标。</ns0:t>
+      </ns0:r>
+    </ns0:p>
+    <ns0:p>
+      <ns0:r>
+        <ns0:t>短期：固定角色的短片段，建立有意夸张与失真对照。</ns0:t>
+      </ns0:r>
+    </ns0:p>
+    <ns0:p>
+      <ns0:r>
+        <ns0:t>中期：跨镜头动作／道具变化与设定纠正，控制来自专业中间资产。</ns0:t>
+      </ns0:r>
+    </ns0:p>
+    <ns0:p>
+      <ns0:r>
+        <ns0:t>长期：跨集版本维护、个性化艺术规则及人机协作验证；留出风格和创作者测泛化。</ns0:t>
+      </ns0:r>
+    </ns0:p>
+    <ns0:p>
+      <ns0:r>
+        <ns0:t>PhysAnimator · CVPR 2025 主会 · 2025-06</ns0:t>
+      </ns0:r>
+    </ns0:p>
+    <ns0:p>
+      <ns0:r>
+        <ns0:t>PhysAnimator: Physics-Guided Generative Cartoon Animation</ns0:t>
+      </ns0:r>
+    </ns0:p>
+    <ns0:p>
+      <ns0:r>
+        <ns0:t>https://openaccess.thecvf.com/content/CVPR2025/html/Xie_PhysAnimator_Physics-Guided_Generative_Cartoon_Animation_CVPR_2025_paper.html</ns0:t>
+      </ns0:r>
+    </ns0:p>
+    <ns0:p>
+      <ns0:r>
+        <ns0:t>已有进展：从插画提取网格，利用图像空间可变形体模拟、能量笔触和绑定点生成运动，再以草图引导扩散生成动画，连接物理指导与艺术控制。</ns0:t>
+      </ns0:r>
+    </ns0:p>
+    <ns0:p>
+      <ns0:r>
+        <ns0:t>边界：建立插画动画化／运动控制的证据；并非整季剧情编排、角色设定维护或跨集因果修改的验证。</ns0:t>
+      </ns0:r>
+    </ns0:p>
+    <ns0:p>
+      <ns0:r>
+        <ns0:t>可借鉴：把控制保留在结构／运动层，再让外观生成器实现；将导演要求的夸张运动纳入允许变化，不能一律用真实物理惩罚。</ns0:t>
+      </ns0:r>
+    </ns0:p>
+    <ns0:p>
+      <ns0:r>
+        <ns0:t>证据定位：CVF 正式接收记录与论文摘要／方法概述</ns0:t>
+      </ns0:r>
+    </ns0:p>
+    <ns0:p>
+      <ns0:r>
+        <ns0:t>MovieGrid · arXiv 预印本；未核实顶会接收 · 2026-09-06</ns0:t>
+      </ns0:r>
+    </ns0:p>
+    <ns0:p>
+      <ns0:r>
+        <ns0:t>Multi-Grid Post-Training for Long-Form Multi-Shot Video Generation</ns0:t>
+      </ns0:r>
+    </ns0:p>
+    <ns0:p>
+      <ns0:r>
+        <ns0:t>https://arxiv.org/html/2609.06373v1</ns0:t>
+      </ns0:r>
+    </ns0:p>
+    <ns0:p>
+      <ns0:r>
+        <ns0:t>已有进展：将时间有序片段排成空间网格联合生成，用干净片段条件、角色标记、网格编码和边界损失训练。测试含 89 个故事，其中 18 个为 anime；报告 1,616 帧多镜头生成，并分析镜头顺序召回。</ns0:t>
+      </ns0:r>
+    </ns0:p>
+    <ns0:p>
+      <ns0:r>
+        <ns0:t>边界：扩展到 64 格、6,464 帧时存在分辨率／质量折中；固定画布下单格降至 320×192。跨镜头相似度、镜头召回不等于事件因果或线索泄露正确；动漫只是测试子集。</ns0:t>
+      </ns0:r>
+    </ns0:p>
+    <ns0:p>
+      <ns0:r>
+        <ns0:t>可借鉴：电影与动漫短剧共用的近期长片段生成基线；测试状态改变能否传播到相关格／镜头而不改坏无关片段。</ns0:t>
+      </ns0:r>
+    </ns0:p>
+    <ns0:p>
+      <ns0:r>
+        <ns0:t>证据定位：§3–4；§5.1–5.4；Appendix A</ns0:t>
+      </ns0:r>
+    </ns0:p>
+    <ns0:p>
+      <ns0:r>
+        <ns0:t>CogOmniControl · arXiv 预印本；未核实顶会接收 · 2026-05-19</ns0:t>
+      </ns0:r>
+    </ns0:p>
+    <ns0:p>
+      <ns0:r>
+        <ns0:t>CogOmniControl: Reasoning-Driven Controllable Video Generation via Creative Intent Cognition</ns0:t>
+      </ns0:r>
+    </ns0:p>
+    <ns0:p>
+      <ns0:r>
+        <ns0:t>https://arxiv.org/html/2605.19995v1</ns0:t>
+      </ns0:r>
+    </ns0:p>
+    <ns0:p>
+      <ns0:r>
+        <ns0:t>已有进展：用专业动漫制作数据训练 CogVLM，理解草图／白模等稀疏控制的创作意图；CogOmniDiT 联合视觉条件与语义特征，再用强化微调对齐。自建两类基准与消融验证，并可用 Best-of-N。</ns0:t>
+      </ns0:r>
+    </ns0:p>
+    <ns0:p>
+      <ns0:r>
+        <ns0:t>边界：依赖专业数据与意图／生成评价，稀疏输入的含义不是天然唯一；本轮核对的消融不证明主动追问或跨集状态修订已经解决。Best-of-N 要计入额外调用。</ns0:t>
+      </ns0:r>
+    </ns0:p>
+    <ns0:p>
+      <ns0:r>
+        <ns0:t>可借鉴：D 的直接技术近邻：稀疏控制理解＋内部对齐已有实现。增量可测何时需要补问、何种最少控制有效，以及冲突意图与艺术规则如何校准。</ns0:t>
+      </ns0:r>
+    </ns0:p>
+    <ns0:p>
+      <ns0:r>
+        <ns0:t>证据定位：§3–4 方法；§5.1–5.4 训练、评价与消融</ns0:t>
+      </ns0:r>
+    </ns0:p>
+    <ns0:p>
+      <ns0:r>
+        <ns0:t>AniMatrix · arXiv 技术报告；未核实顶会接收 · 2026-05-05</ns0:t>
+      </ns0:r>
+    </ns0:p>
+    <ns0:p>
+      <ns0:r>
+        <ns0:t>AniMatrix: An Anime Video Generation Model that Thinks in Art, Not Physics</ns0:t>
+      </ns0:r>
+    </ns0:p>
+    <ns0:p>
+      <ns0:r>
+        <ns0:t>https://arxiv.org/html/2605.03652v1</ns0:t>
+      </ns0:r>
+    </ns0:p>
+    <ns0:p>
+      <ns0:r>
+        <ns0:t>已有进展：以风格、运动、镜头、特效分类和双路条件控制动漫生成，结合课程训练及变形偏好优化；专业动画师评价支持艺术运动和提示理解收益。</ns0:t>
+      </ns0:r>
+    </ns0:p>
+    <ns0:p>
+      <ns0:r>
+        <ns0:t>边界：艺术正确性依赖制作约定与评价覆盖；有意变形不能等同于失败。报告中的专业评价不直接证明长期剧情约束或多人角色知识控制。</ns0:t>
+      </ns0:r>
+    </ns0:p>
+    <ns0:p>
+      <ns0:r>
+        <ns0:t>可借鉴：构造“有意夸张／不允许的形变”标签及分离奖励，是把 A 的状态保持迁移到动漫时的重要原则参考。</ns0:t>
+      </ns0:r>
+    </ns0:p>
+    <ns0:p>
+      <ns0:r>
+        <ns0:t>证据定位：制作知识系统、条件注入、课程训练及专业评价</ns0:t>
+      </ns0:r>
+    </ns0:p>
+    <ns0:p>
+      <ns0:r>
+        <ns0:t>游戏／可交互世界／规则编辑</ns0:t>
+      </ns0:r>
+    </ns0:p>
+    <ns0:p>
+      <ns0:r>
+        <ns0:t>A–D 对应：AIGC-A：动作、动力学与系统规则干预；AIGC-B：回访或新观察后的状态纠错；AIGC-C：玩家视角、迷雾与隐藏信息；AIGC-D：主动观察和低延迟控制</ns0:t>
+      </ns0:r>
+    </ns0:p>
+    <ns0:p>
+      <ns0:r>
+        <ns0:t>具体任务：改变开门规则或移除桥墩后，角色通行和下游事件应更新；未受影响的背包、任务进度和地图保持。回到旧场景时，纠正错误记忆而非凭空重置世界。</ns0:t>
+      </ns0:r>
+    </ns0:p>
+    <ns0:p>
+      <ns0:r>
+        <ns0:t>长期价值：引擎可分叉、规则可执行、状态可检查，适合连续研究干预深度、长期保持和在线交互；同时能把画面真实与规则正确分开。</ns0:t>
+      </ns0:r>
+    </ns0:p>
+    <ns0:p>
+      <ns0:r>
+        <ns0:t>当前进展：交互视频世界已支持导航和文本事件；最新规则编辑研究在可执行商业游戏上量化行为与保持。二者仍是不同技术栈：改对代码不保证生成视频对，视频流畅也不保证规则对。</ns0:t>
+      </ns0:r>
+    </ns0:p>
+    <ns0:p>
+      <ns0:r>
+        <ns0:t>状态约定：引擎状态／规则提供真值，生成视频是观察层；玩家可见状态与隐藏世界状态分离。生成式探索视频与可执行游戏应分别标注。</ns0:t>
+      </ns0:r>
+    </ns0:p>
+    <ns0:p>
+      <ns0:r>
+        <ns0:t>研究缺口／创新边界：【研究判断】将可执行干预真值接入视频模型，测新规则组合、长程后果与回访纠错；需同时报告环境编辑和视频执行，不能把工具可执行性当成整套系统成功。</ns0:t>
+      </ns0:r>
+    </ns0:p>
+    <ns0:p>
+      <ns0:r>
+        <ns0:t>第一组实验：从引擎同一存档分叉，按属性／实体／动力学／系统分层干预；比较真值状态驱动与视频自主推断。测状态／行为测试通过率、Keep 回归、视觉一致性和端到端延迟，附回访与长时程测试。</ns0:t>
+      </ns0:r>
+    </ns0:p>
+    <ns0:p>
+      <ns0:r>
+        <ns0:t>选题建议：【选题建议】A 的因果评测最容易落地；实时开放世界成本高，可先做离线规则分支与短视频。</ns0:t>
+      </ns0:r>
+    </ns0:p>
+    <ns0:p>
+      <ns0:r>
+        <ns0:t>短期：可分叉小型关卡，用引擎真值验证 A 的执行。</ns0:t>
+      </ns0:r>
+    </ns0:p>
+    <ns0:p>
+      <ns0:r>
+        <ns0:t>中期：多步规则组合、状态记忆修订与实时控制。</ns0:t>
+      </ns0:r>
+    </ns0:p>
+    <ns0:p>
+      <ns0:r>
+        <ns0:t>长期：跨游戏／跨引擎迁移，统一规则编辑、视频反馈与玩家策略，保持独立验证器。</ns0:t>
+      </ns0:r>
+    </ns0:p>
+    <ns0:p>
+      <ns0:r>
+        <ns0:t>Yume1.5 · CVPR 2026 主会 · 2026-06</ns0:t>
+      </ns0:r>
+    </ns0:p>
+    <ns0:p>
+      <ns0:r>
+        <ns0:t>Yume1.5: A Text-Controlled Interactive World Generation Model</ns0:t>
+      </ns0:r>
+    </ns0:p>
+    <ns0:p>
+      <ns0:r>
+        <ns0:t>https://openaccess.thecvf.com/content/CVPR2026/html/Mao_Yume1.5_A_Text-Controlled_Interactive_World_Generation_Model_CVPR_2026_paper.html</ns0:t>
+      </ns0:r>
+    </ns0:p>
+    <ns0:p>
+      <ns0:r>
+        <ns0:t>已有进展：从图像或文本生成可键盘探索的持续视频世界，并支持文本控制事件；采用上下文压缩、线性注意力和蒸馏，报告单 A100、540p 平均 12 fps。</ns0:t>
+      </ns0:r>
+    </ns0:p>
+    <ns0:p>
+      <ns0:r>
+        <ns0:t>边界：这是视觉交互世界，流畅响应不等于可执行游戏规则、完整碰撞／物品逻辑或长程因果正确；速度绑定原文硬件和设置。</ns0:t>
+      </ns0:r>
+    </ns0:p>
+    <ns0:p>
+      <ns0:r>
+        <ns0:t>可借鉴：A 的在线事件干预、B 的持续状态和 D 的控制成本基线；测试回访、背包／门锁状态、延迟后果和响应时延。</ns0:t>
+      </ns0:r>
+    </ns0:p>
+    <ns0:p>
+      <ns0:r>
+        <ns0:t>证据定位：CVF 正式接收记录；摘要／三组件方法</ns0:t>
+      </ns0:r>
+    </ns0:p>
+    <ns0:p>
+      <ns0:r>
+        <ns0:t>World Editing · arXiv 预印本；未核实顶会接收 · 2026-10-01</ns0:t>
+      </ns0:r>
+    </ns0:p>
+    <ns0:p>
+      <ns0:r>
+        <ns0:t>World Editing: Intervening on Executable Worlds at Increasing Depth</ns0:t>
+      </ns0:r>
+    </ns0:p>
+    <ns0:p>
+      <ns0:r>
+        <ns0:t>https://arxiv.org/html/2610.02331v1</ns0:t>
+      </ns0:r>
+    </ns0:p>
+    <ns0:p>
+      <ns0:r>
+        <ns0:t>已有进展：IGMWorld／IGMBench 在 Minecraft、Terraria 的 110 个 mod 任务上检查属性、实体、动力学与系统干预及保持；最佳配置严格任务通过率 78.2%，视觉联合通过率各配置均低于 50%。</ns0:t>
+      </ns0:r>
+    </ns0:p>
+    <ns0:p>
+      <ns0:r>
+        <ns0:t>边界：修改的是可执行代码与资产，不是视频扩散模型；构建成功仍可能行为错误。结果受两款游戏、工具链与任务验证器覆盖限制，不能直接迁移为视频生成成功率。</ns0:t>
+      </ns0:r>
+    </ns0:p>
+    <ns0:p>
+      <ns0:r>
+        <ns0:t>可借鉴：是 A 的 Δ／Keep 可执行真值来源与干预深度基线；把环境分支状态导出为视频条件，再分开测规则修改和视觉执行。</ns0:t>
+      </ns0:r>
+    </ns0:p>
+    <ns0:p>
+      <ns0:r>
+        <ns0:t>证据定位：§2–4；§3.1 评估；Appendix E 确定性状态／行为检查</ns0:t>
+      </ns0:r>
+    </ns0:p>
+    <ns0:p>
+      <ns0:r>
+        <ns0:t>Alaya-EVOKE · arXiv 预印本；作者项目另有更新 · 2026-08-13</ns0:t>
+      </ns0:r>
+    </ns0:p>
+    <ns0:p>
+      <ns0:r>
+        <ns0:t>Alaya-EVOKE: From Linear-Scaling Supervision to Endless World</ns0:t>
+      </ns0:r>
+    </ns0:p>
+    <ns0:p>
+      <ns0:r>
+        <ns0:t>https://arxiv.org/abs/2608.13546</ns0:t>
+      </ns0:r>
+    </ns0:p>
+    <ns0:p>
+      <ns0:r>
+        <ns0:t>已有进展：相机索引的外部世界状态库按视角检索，长程教师与三步蒸馏支持持续生成和分段事件条件；论文报告单 H200、384×640 每 1.5 秒视频块需 2.11 秒。</ns0:t>
+      </ns0:r>
+    </ns0:p>
+    <ns0:p>
+      <ns0:r>
+        <ns0:t>边界：持续演示和 WBench 表现不构成任意时长的正确性保证；单卡论文设置不能直接称实时。外部记忆保存也不自动解决错误记忆撤销。</ns0:t>
+      </ns0:r>
+    </ns0:p>
+    <ns0:p>
+      <ns0:r>
+        <ns0:t>可借鉴：B 比较“持久保存”与“证据驱动修订”；A 测在线事件后的状态传播。项目版本与硬件速度须分开记录。</ns0:t>
+      </ns0:r>
+    </ns0:p>
+    <ns0:p>
+      <ns0:r>
+        <ns0:t>证据定位：arXiv 摘要；作者项目 https://evoke-world.github.io/Evoke/</ns0:t>
       </ns0:r>
     </ns0:p>
     <ns0:sectPr>

</xml_diff>